<commit_message>
Player Escape / Arrest State 구현
</commit_message>
<xml_diff>
--- a/Museum_Heist_TDD.docx
+++ b/Museum_Heist_TDD.docx
@@ -13677,37 +13677,37 @@
               <w:rPr>
                 <w:sz w:val="16"/>
               </w:rPr>
-              <w:t>Center Screen Trace</w:t>
-            </w:r>
-            <w:r>
-              <w:rPr>
-                <w:sz w:val="16"/>
-              </w:rPr>
-              <w:t>와</w:t>
-            </w:r>
-            <w:r>
-              <w:rPr>
-                <w:sz w:val="16"/>
-              </w:rPr>
-              <w:t xml:space="preserve"> Camera Forward</w:t>
-            </w:r>
-            <w:r>
-              <w:rPr>
-                <w:sz w:val="16"/>
-              </w:rPr>
-              <w:t>로</w:t>
-            </w:r>
-            <w:r>
-              <w:rPr>
-                <w:sz w:val="16"/>
-              </w:rPr>
-              <w:t xml:space="preserve"> </w:t>
-            </w:r>
-            <w:r>
-              <w:rPr>
-                <w:sz w:val="16"/>
-              </w:rPr>
-              <w:t>교체</w:t>
+              <w:t>World Interaction은 BeginOverlap/EndOverlap 후보 관리로, 투척·Flashlight는 Camera Forward로 교체</w:t>
+            </w:r>
+            <w:r>
+              <w:rPr>
+                <w:sz w:val="16"/>
+              </w:rPr>
+              <w:t/>
+            </w:r>
+            <w:r>
+              <w:rPr>
+                <w:sz w:val="16"/>
+              </w:rPr>
+              <w:t xml:space="preserve"/>
+            </w:r>
+            <w:r>
+              <w:rPr>
+                <w:sz w:val="16"/>
+              </w:rPr>
+              <w:t/>
+            </w:r>
+            <w:r>
+              <w:rPr>
+                <w:sz w:val="16"/>
+              </w:rPr>
+              <w:t xml:space="preserve"/>
+            </w:r>
+            <w:r>
+              <w:rPr>
+                <w:sz w:val="16"/>
+              </w:rPr>
+              <w:t/>
             </w:r>
           </w:p>
         </w:tc>
@@ -25195,55 +25195,55 @@
         </w:numPr>
       </w:pPr>
       <w:r>
-        <w:t>Center Screen Trace</w:t>
-      </w:r>
-      <w:r>
-        <w:t>로</w:t>
-      </w:r>
-      <w:r>
-        <w:t xml:space="preserve"> Painting Case</w:t>
-      </w:r>
-      <w:r>
-        <w:t>를</w:t>
-      </w:r>
-      <w:r>
-        <w:t xml:space="preserve"> </w:t>
-      </w:r>
-      <w:r>
-        <w:t>조준하고</w:t>
-      </w:r>
-      <w:r>
-        <w:t xml:space="preserve"> </w:t>
-      </w:r>
-      <w:r>
-        <w:t>서버가</w:t>
-      </w:r>
-      <w:r>
-        <w:t xml:space="preserve"> </w:t>
-      </w:r>
-      <w:r>
-        <w:t>거리</w:t>
-      </w:r>
-      <w:r>
-        <w:t>·</w:t>
-      </w:r>
-      <w:r>
-        <w:t>상태</w:t>
-      </w:r>
-      <w:r>
-        <w:t>·Owner</w:t>
-      </w:r>
-      <w:r>
-        <w:t>를</w:t>
-      </w:r>
-      <w:r>
-        <w:t xml:space="preserve"> </w:t>
-      </w:r>
-      <w:r>
-        <w:t>검증한다</w:t>
-      </w:r>
-      <w:r>
-        <w:t>.</w:t>
+        <w:t>Player Capsule과 Painting Case Interaction Collision의 BeginOverlap/EndOverlap로 후보를 관리하고 서버가 현재 Overlap·상태·Owner를 검증한다.</w:t>
+      </w:r>
+      <w:r>
+        <w:t/>
+      </w:r>
+      <w:r>
+        <w:t xml:space="preserve"/>
+      </w:r>
+      <w:r>
+        <w:t/>
+      </w:r>
+      <w:r>
+        <w:t xml:space="preserve"/>
+      </w:r>
+      <w:r>
+        <w:t/>
+      </w:r>
+      <w:r>
+        <w:t xml:space="preserve"/>
+      </w:r>
+      <w:r>
+        <w:t/>
+      </w:r>
+      <w:r>
+        <w:t xml:space="preserve"/>
+      </w:r>
+      <w:r>
+        <w:t/>
+      </w:r>
+      <w:r>
+        <w:t/>
+      </w:r>
+      <w:r>
+        <w:t/>
+      </w:r>
+      <w:r>
+        <w:t/>
+      </w:r>
+      <w:r>
+        <w:t/>
+      </w:r>
+      <w:r>
+        <w:t xml:space="preserve"/>
+      </w:r>
+      <w:r>
+        <w:t/>
+      </w:r>
+      <w:r>
+        <w:t/>
       </w:r>
     </w:p>
     <w:p>

</xml_diff>

<commit_message>
Painting, Object 컨셉 재정립중
</commit_message>
<xml_diff>
--- a/Museum_Heist_TDD.docx
+++ b/Museum_Heist_TDD.docx
@@ -17460,12 +17460,9 @@
     </w:p>
     <w:p>
       <w:r>
-        <w:t xml:space="preserve">v1.0의 활성 Exhibit는 AHeistPaintingDisplayCaseActor와 AHeistObjectDisplayCaseActor다. Sculpture/Ceramic은 Object Assembly Vertical Slice의 Required Family이며, </w:t>
+        <w:t>v1.0의 활성 Exhibit는 AHeistPaintingDisplayCaseActor와 AHeistObjectDisplayCaseActor다. Sculpture/Ceramic은 Object Assembly Vertical Slice의 Required Family이며 BP_ObjectDisplayCase 공용 Shell을 사용한다. AHeistDisplayCaseActor, AHeistSculptureDisplayCaseActor와 BP_SculptureDisplayCase는 제거됐다.</w:t>
       </w:r>
-      <w:r>
-        <w:lastRenderedPageBreak/>
-        <w:t>AHeistSculptureDisplayCaseActor/BP_SculptureDisplayCase는 기존 Asset 호환 Alias로만 보존한다. Legacy AHeistDisplayCaseActor는 Painting serialized/C++ reference 호환 Alias다.</w:t>
-      </w:r>
+      <w:r/>
     </w:p>
     <w:tbl>
       <w:tblPr>
@@ -25384,13 +25381,7 @@
             <w:vAlign w:val="center"/>
           </w:tcPr>
           <w:p>
-            <w:pPr>
-              <w:pStyle w:val="TableText"/>
-            </w:pPr>
-            <w:r>
-              <w:rPr>
-                <w:sz w:val="16"/>
-              </w:rPr>
+            <w:r>
               <w:t>Owner-only Full-Screen Part/Socket Preview</w:t>
             </w:r>
           </w:p>
@@ -29276,7 +29267,7 @@
     </w:p>
     <w:p>
       <w:r>
-        <w:t>공통 필드: ItemId, ItemTag, ItemType, DisplayName, Icon, WorldActorClass, Width, Height, Weight, bCanDrop, bCanUseQuickSlot, bCanRotate, bReleaseRequired.</w:t>
+        <w:t>공통 필드: ItemId, ItemTag, ItemType, DisplayName, Icon, Width, Height, Weight, bCanDrop, bCanUseQuickSlot, bCanRotate, bReleaseRequired. World Visual은 Loot/Artifact/Template Data가 소유하며 Item Row마다 Actor Class를 선택하지 않는다.</w:t>
       </w:r>
     </w:p>
     <w:tbl>
@@ -30134,7 +30125,7 @@
     </w:p>
     <w:p>
       <w:r>
-        <w:t>필드: ItemId, Grade, Value, SpawnCategory, SpawnWeight. Piñata/경쟁 Reveal 필드는 Deprecated이며 신규 Row에서는 사용하지 않는다.</w:t>
+        <w:t>필드: ItemId, LootGrade, ScoreValue, SpawnCategory, SpawnWeight, WorldMesh, WorldMaterials, WorldVisualRelativeTransform. Spawn Actor Class는 Row가 소유하지 않고 공용 BP_Loot 하나를 시스템 설정이 소유한다. Piñata/경쟁 Reveal 필드는 Deprecated이며 신규 Row에서는 사용하지 않는다.</w:t>
       </w:r>
     </w:p>
     <w:p>
@@ -31296,7 +31287,7 @@
     </w:p>
     <w:p>
       <w:r>
-        <w:t>ArtifactId, DisplayName, ArtifactValue, Weight, GridWidth, GridHeight, ForgeryType, TemplateId, MinimumScore, BaseInspectionDelay, VisualActorClass. CarryMode 필드는 두지 않으며 모든 Original은 GridWidth/Height를 사용한다.</w:t>
+        <w:t>ArtifactId, DisplayName, ArtifactValue, Weight, GridWidth, GridHeight, ForgeryType, ForgeryTemplateId, MinimumForgeryScore, BaseInspectionDelay, OriginalWorldMesh, OriginalWorldMaterials, OriginalWorldVisualRelativeTransform. VisualActorClass는 제거됐다. Painting Visual은 Surface Template Texture로, Object Original/Replica는 Object Template/Part Mesh와 Material Data로 해석하며 Dropped Original은 Artifact Row의 Original World Visual을 사용한다. CarryMode 필드는 두지 않으며 모든 Original은 GridWidth/Height를 사용한다.</w:t>
       </w:r>
     </w:p>
     <w:p>
@@ -32340,7 +32331,7 @@
         </w:numPr>
       </w:pPr>
       <w:r>
-        <w:t>SoftClass는 기대 Base Class 파생 여부</w:t>
+        <w:t>UsableItem 등 실제 Spawn Class 필드는 기대 Base Class 파생 여부를 검증한다. Loot/Artifact Row에는 Variant별 Actor Class를 두지 않는다.</w:t>
       </w:r>
     </w:p>
     <w:p>
@@ -32608,14 +32599,8 @@
             <w:vAlign w:val="center"/>
           </w:tcPr>
           <w:p>
-            <w:pPr>
-              <w:pStyle w:val="TableText"/>
-            </w:pPr>
-            <w:r>
-              <w:rPr>
-                <w:sz w:val="16"/>
-              </w:rPr>
-              <w:t>공통 모듈 + M01/M02/M03 테마, Painting/Object Case, Exit, Signage, Floor Plan</w:t>
+            <w:r>
+              <w:t>공통 모듈 + M01/M02/M03 테마, BP_PaintingDisplayCase 1종, BP_ObjectDisplayCase 1종, BP_Vent 1종, Signage, Floor Plan</w:t>
             </w:r>
           </w:p>
         </w:tc>
@@ -32728,14 +32713,8 @@
             <w:vAlign w:val="center"/>
           </w:tcPr>
           <w:p>
-            <w:pPr>
-              <w:pStyle w:val="TableText"/>
-            </w:pPr>
-            <w:r>
-              <w:rPr>
-                <w:sz w:val="16"/>
-              </w:rPr>
-              <w:t>Crown, Vase, Sword, Necklace 등 최소 5종</w:t>
+            <w:r>
+              <w:t>Crown, Vase, Sword, Necklace 등 최소 5개 Data Variant + 공용 BP_Loot 1종. Item별 Actor Blueprint 금지.</w:t>
             </w:r>
           </w:p>
         </w:tc>
@@ -33289,14 +33268,8 @@
             <w:vAlign w:val="center"/>
           </w:tcPr>
           <w:p>
-            <w:pPr>
-              <w:pStyle w:val="TableText"/>
-            </w:pPr>
-            <w:r>
-              <w:rPr>
-                <w:sz w:val="16"/>
-              </w:rPr>
-              <w:t>Owner-only, 25~35초, 서버 Part/Socket/Orientation, Compact Replica, Cleanup</w:t>
+            <w:r>
+              <w:t>Owner-only, 25~35초, 서버 Part/Socket/Orientation, BP_ObjectDisplayCase 단일 Shell, Data 기반 Original/Replica 재구성, Original 회수·Deposit, Compact Replica, Cleanup</w:t>
             </w:r>
           </w:p>
         </w:tc>
@@ -36175,6 +36148,503 @@
     <w:tbl>
       <w:tblPr>
         <w:tblStyle w:val="af9"/>
+        <w:tblW w:type="dxa" w:w="9866"/>
+        <w:tblLayout w:type="fixed"/>
+        <w:tblLook w:firstColumn="1" w:firstRow="1" w:lastColumn="0" w:lastRow="0" w:noHBand="0" w:noVBand="1" w:val="04A0"/>
+        <w:tblInd w:type="dxa" w:w="120"/>
+      </w:tblPr>
+      <w:tblGrid>
+        <w:gridCol w:w="2200"/>
+        <w:gridCol w:w="3200"/>
+        <w:gridCol w:w="4466"/>
+      </w:tblGrid>
+      <w:tr>
+        <w:tc>
+          <w:tcPr>
+            <w:tcW w:type="dxa" w:w="2200"/>
+            <w:vAlign w:val="center"/>
+            <w:tcMar>
+              <w:top w:w="80" w:type="dxa"/>
+              <w:left w:w="120" w:type="dxa"/>
+              <w:bottom w:w="80" w:type="dxa"/>
+              <w:right w:w="120" w:type="dxa"/>
+            </w:tcMar>
+          </w:tcPr>
+          <w:p>
+            <w:pPr>
+              <w:jc w:val="left"/>
+            </w:pPr>
+            <w:r>
+              <w:rPr>
+                <w:b/>
+              </w:rPr>
+              <w:t>Gameplay Family</w:t>
+            </w:r>
+          </w:p>
+        </w:tc>
+        <w:tc>
+          <w:tcPr>
+            <w:tcW w:type="dxa" w:w="3200"/>
+            <w:vAlign w:val="center"/>
+            <w:tcMar>
+              <w:top w:w="80" w:type="dxa"/>
+              <w:left w:w="120" w:type="dxa"/>
+              <w:bottom w:w="80" w:type="dxa"/>
+              <w:right w:w="120" w:type="dxa"/>
+            </w:tcMar>
+          </w:tcPr>
+          <w:p>
+            <w:pPr>
+              <w:jc w:val="center"/>
+            </w:pPr>
+            <w:r>
+              <w:rPr>
+                <w:b/>
+              </w:rPr>
+              <w:t>Canonical Blueprint Shell</w:t>
+            </w:r>
+          </w:p>
+        </w:tc>
+        <w:tc>
+          <w:tcPr>
+            <w:tcW w:type="dxa" w:w="4466"/>
+            <w:vAlign w:val="center"/>
+            <w:tcMar>
+              <w:top w:w="80" w:type="dxa"/>
+              <w:left w:w="120" w:type="dxa"/>
+              <w:bottom w:w="80" w:type="dxa"/>
+              <w:right w:w="120" w:type="dxa"/>
+            </w:tcMar>
+          </w:tcPr>
+          <w:p>
+            <w:pPr>
+              <w:jc w:val="left"/>
+            </w:pPr>
+            <w:r>
+              <w:rPr>
+                <w:b/>
+              </w:rPr>
+              <w:t>Data-owned Variant</w:t>
+            </w:r>
+          </w:p>
+        </w:tc>
+      </w:tr>
+      <w:tr>
+        <w:tc>
+          <w:tcPr>
+            <w:tcW w:type="dxa" w:w="2200"/>
+            <w:vAlign w:val="center"/>
+            <w:tcMar>
+              <w:top w:w="80" w:type="dxa"/>
+              <w:left w:w="120" w:type="dxa"/>
+              <w:bottom w:w="80" w:type="dxa"/>
+              <w:right w:w="120" w:type="dxa"/>
+            </w:tcMar>
+          </w:tcPr>
+          <w:p>
+            <w:pPr>
+              <w:jc w:val="left"/>
+            </w:pPr>
+            <w:r>
+              <w:t>Loose Loot World Pickup</w:t>
+            </w:r>
+          </w:p>
+        </w:tc>
+        <w:tc>
+          <w:tcPr>
+            <w:tcW w:type="dxa" w:w="3200"/>
+            <w:vAlign w:val="center"/>
+            <w:tcMar>
+              <w:top w:w="80" w:type="dxa"/>
+              <w:left w:w="120" w:type="dxa"/>
+              <w:bottom w:w="80" w:type="dxa"/>
+              <w:right w:w="120" w:type="dxa"/>
+            </w:tcMar>
+          </w:tcPr>
+          <w:p>
+            <w:pPr>
+              <w:jc w:val="center"/>
+            </w:pPr>
+            <w:r>
+              <w:t>AHeistLootActor / BP_Loot</w:t>
+            </w:r>
+          </w:p>
+        </w:tc>
+        <w:tc>
+          <w:tcPr>
+            <w:tcW w:type="dxa" w:w="4466"/>
+            <w:vAlign w:val="center"/>
+            <w:tcMar>
+              <w:top w:w="80" w:type="dxa"/>
+              <w:left w:w="120" w:type="dxa"/>
+              <w:bottom w:w="80" w:type="dxa"/>
+              <w:right w:w="120" w:type="dxa"/>
+            </w:tcMar>
+          </w:tcPr>
+          <w:p>
+            <w:pPr>
+              <w:jc w:val="left"/>
+            </w:pPr>
+            <w:r>
+              <w:t>ItemId → DT_ItemData + DT_LootData Mesh/Material/Visual Transform</w:t>
+            </w:r>
+          </w:p>
+        </w:tc>
+      </w:tr>
+      <w:tr>
+        <w:tc>
+          <w:tcPr>
+            <w:tcW w:type="dxa" w:w="2200"/>
+            <w:vAlign w:val="center"/>
+            <w:tcMar>
+              <w:top w:w="80" w:type="dxa"/>
+              <w:left w:w="120" w:type="dxa"/>
+              <w:bottom w:w="80" w:type="dxa"/>
+              <w:right w:w="120" w:type="dxa"/>
+            </w:tcMar>
+          </w:tcPr>
+          <w:p>
+            <w:pPr>
+              <w:jc w:val="left"/>
+            </w:pPr>
+            <w:r>
+              <w:t>Dropped Original Recovery</w:t>
+            </w:r>
+          </w:p>
+        </w:tc>
+        <w:tc>
+          <w:tcPr>
+            <w:tcW w:type="dxa" w:w="3200"/>
+            <w:vAlign w:val="center"/>
+            <w:tcMar>
+              <w:top w:w="80" w:type="dxa"/>
+              <w:left w:w="120" w:type="dxa"/>
+              <w:bottom w:w="80" w:type="dxa"/>
+              <w:right w:w="120" w:type="dxa"/>
+            </w:tcMar>
+          </w:tcPr>
+          <w:p>
+            <w:pPr>
+              <w:jc w:val="center"/>
+            </w:pPr>
+            <w:r>
+              <w:t>AHeistDroppedOriginalActor / BP_DroppedOriginal</w:t>
+            </w:r>
+          </w:p>
+        </w:tc>
+        <w:tc>
+          <w:tcPr>
+            <w:tcW w:type="dxa" w:w="4466"/>
+            <w:vAlign w:val="center"/>
+            <w:tcMar>
+              <w:top w:w="80" w:type="dxa"/>
+              <w:left w:w="120" w:type="dxa"/>
+              <w:bottom w:w="80" w:type="dxa"/>
+              <w:right w:w="120" w:type="dxa"/>
+            </w:tcMar>
+          </w:tcPr>
+          <w:p>
+            <w:pPr>
+              <w:jc w:val="left"/>
+            </w:pPr>
+            <w:r>
+              <w:t>Replicated ArtifactId → Artifact/Original Visual Data</w:t>
+            </w:r>
+          </w:p>
+        </w:tc>
+      </w:tr>
+      <w:tr>
+        <w:tc>
+          <w:tcPr>
+            <w:tcW w:type="dxa" w:w="2200"/>
+            <w:vAlign w:val="center"/>
+            <w:tcMar>
+              <w:top w:w="80" w:type="dxa"/>
+              <w:left w:w="120" w:type="dxa"/>
+              <w:bottom w:w="80" w:type="dxa"/>
+              <w:right w:w="120" w:type="dxa"/>
+            </w:tcMar>
+          </w:tcPr>
+          <w:p>
+            <w:pPr>
+              <w:jc w:val="left"/>
+            </w:pPr>
+            <w:r>
+              <w:t>Painting Display Case</w:t>
+            </w:r>
+          </w:p>
+        </w:tc>
+        <w:tc>
+          <w:tcPr>
+            <w:tcW w:type="dxa" w:w="3200"/>
+            <w:vAlign w:val="center"/>
+            <w:tcMar>
+              <w:top w:w="80" w:type="dxa"/>
+              <w:left w:w="120" w:type="dxa"/>
+              <w:bottom w:w="80" w:type="dxa"/>
+              <w:right w:w="120" w:type="dxa"/>
+            </w:tcMar>
+          </w:tcPr>
+          <w:p>
+            <w:pPr>
+              <w:jc w:val="center"/>
+            </w:pPr>
+            <w:r>
+              <w:t>AHeistPaintingDisplayCaseActor / BP_PaintingDisplayCase</w:t>
+            </w:r>
+          </w:p>
+        </w:tc>
+        <w:tc>
+          <w:tcPr>
+            <w:tcW w:type="dxa" w:w="4466"/>
+            <w:vAlign w:val="center"/>
+            <w:tcMar>
+              <w:top w:w="80" w:type="dxa"/>
+              <w:left w:w="120" w:type="dxa"/>
+              <w:bottom w:w="80" w:type="dxa"/>
+              <w:right w:w="120" w:type="dxa"/>
+            </w:tcMar>
+          </w:tcPr>
+          <w:p>
+            <w:pPr>
+              <w:jc w:val="left"/>
+            </w:pPr>
+            <w:r>
+              <w:t>CaseId/ArtifactId → DT_ArtifactData + DT_ForgeryTemplate</w:t>
+            </w:r>
+          </w:p>
+        </w:tc>
+      </w:tr>
+      <w:tr>
+        <w:tc>
+          <w:tcPr>
+            <w:tcW w:type="dxa" w:w="2200"/>
+            <w:vAlign w:val="center"/>
+            <w:tcMar>
+              <w:top w:w="80" w:type="dxa"/>
+              <w:left w:w="120" w:type="dxa"/>
+              <w:bottom w:w="80" w:type="dxa"/>
+              <w:right w:w="120" w:type="dxa"/>
+            </w:tcMar>
+          </w:tcPr>
+          <w:p>
+            <w:pPr>
+              <w:jc w:val="left"/>
+            </w:pPr>
+            <w:r>
+              <w:t>Object Assembly Display Case</w:t>
+            </w:r>
+          </w:p>
+        </w:tc>
+        <w:tc>
+          <w:tcPr>
+            <w:tcW w:type="dxa" w:w="3200"/>
+            <w:vAlign w:val="center"/>
+            <w:tcMar>
+              <w:top w:w="80" w:type="dxa"/>
+              <w:left w:w="120" w:type="dxa"/>
+              <w:bottom w:w="80" w:type="dxa"/>
+              <w:right w:w="120" w:type="dxa"/>
+            </w:tcMar>
+          </w:tcPr>
+          <w:p>
+            <w:pPr>
+              <w:jc w:val="center"/>
+            </w:pPr>
+            <w:r>
+              <w:t>AHeistObjectDisplayCaseActor / BP_ObjectDisplayCase</w:t>
+            </w:r>
+          </w:p>
+        </w:tc>
+        <w:tc>
+          <w:tcPr>
+            <w:tcW w:type="dxa" w:w="4466"/>
+            <w:vAlign w:val="center"/>
+            <w:tcMar>
+              <w:top w:w="80" w:type="dxa"/>
+              <w:left w:w="120" w:type="dxa"/>
+              <w:bottom w:w="80" w:type="dxa"/>
+              <w:right w:w="120" w:type="dxa"/>
+            </w:tcMar>
+          </w:tcPr>
+          <w:p>
+            <w:pPr>
+              <w:jc w:val="left"/>
+            </w:pPr>
+            <w:r>
+              <w:t>CaseId/ArtifactId → Object Template + Part Mesh/Material Data</w:t>
+            </w:r>
+          </w:p>
+        </w:tc>
+      </w:tr>
+      <w:tr>
+        <w:tc>
+          <w:tcPr>
+            <w:tcW w:type="dxa" w:w="2200"/>
+            <w:vAlign w:val="center"/>
+            <w:tcMar>
+              <w:top w:w="80" w:type="dxa"/>
+              <w:left w:w="120" w:type="dxa"/>
+              <w:bottom w:w="80" w:type="dxa"/>
+              <w:right w:w="120" w:type="dxa"/>
+            </w:tcMar>
+          </w:tcPr>
+          <w:p>
+            <w:pPr>
+              <w:jc w:val="left"/>
+            </w:pPr>
+            <w:r>
+              <w:t>Shared Extraction</w:t>
+            </w:r>
+          </w:p>
+        </w:tc>
+        <w:tc>
+          <w:tcPr>
+            <w:tcW w:type="dxa" w:w="3200"/>
+            <w:vAlign w:val="center"/>
+            <w:tcMar>
+              <w:top w:w="80" w:type="dxa"/>
+              <w:left w:w="120" w:type="dxa"/>
+              <w:bottom w:w="80" w:type="dxa"/>
+              <w:right w:w="120" w:type="dxa"/>
+            </w:tcMar>
+          </w:tcPr>
+          <w:p>
+            <w:pPr>
+              <w:jc w:val="center"/>
+            </w:pPr>
+            <w:r>
+              <w:t>AHeistVentActor / BP_Vent</w:t>
+            </w:r>
+          </w:p>
+        </w:tc>
+        <w:tc>
+          <w:tcPr>
+            <w:tcW w:type="dxa" w:w="4466"/>
+            <w:vAlign w:val="center"/>
+            <w:tcMar>
+              <w:top w:w="80" w:type="dxa"/>
+              <w:left w:w="120" w:type="dxa"/>
+              <w:bottom w:w="80" w:type="dxa"/>
+              <w:right w:w="120" w:type="dxa"/>
+            </w:tcMar>
+          </w:tcPr>
+          <w:p>
+            <w:pPr>
+              <w:jc w:val="left"/>
+            </w:pPr>
+            <w:r>
+              <w:t>Map Instance Identity + common Vent Presentation</w:t>
+            </w:r>
+          </w:p>
+        </w:tc>
+      </w:tr>
+      <w:tr>
+        <w:tc>
+          <w:tcPr>
+            <w:tcW w:type="dxa" w:w="2200"/>
+            <w:vAlign w:val="center"/>
+            <w:tcMar>
+              <w:top w:w="80" w:type="dxa"/>
+              <w:left w:w="120" w:type="dxa"/>
+              <w:bottom w:w="80" w:type="dxa"/>
+              <w:right w:w="120" w:type="dxa"/>
+            </w:tcMar>
+          </w:tcPr>
+          <w:p>
+            <w:pPr>
+              <w:jc w:val="left"/>
+            </w:pPr>
+            <w:r>
+              <w:t>Loot Spawn Point</w:t>
+            </w:r>
+          </w:p>
+        </w:tc>
+        <w:tc>
+          <w:tcPr>
+            <w:tcW w:type="dxa" w:w="3200"/>
+            <w:vAlign w:val="center"/>
+            <w:tcMar>
+              <w:top w:w="80" w:type="dxa"/>
+              <w:left w:w="120" w:type="dxa"/>
+              <w:bottom w:w="80" w:type="dxa"/>
+              <w:right w:w="120" w:type="dxa"/>
+            </w:tcMar>
+          </w:tcPr>
+          <w:p>
+            <w:pPr>
+              <w:jc w:val="center"/>
+            </w:pPr>
+            <w:r>
+              <w:t>AHeistLootSpawnPoint / BP_LootSpawnPoint</w:t>
+            </w:r>
+          </w:p>
+        </w:tc>
+        <w:tc>
+          <w:tcPr>
+            <w:tcW w:type="dxa" w:w="4466"/>
+            <w:vAlign w:val="center"/>
+            <w:tcMar>
+              <w:top w:w="80" w:type="dxa"/>
+              <w:left w:w="120" w:type="dxa"/>
+              <w:bottom w:w="80" w:type="dxa"/>
+              <w:right w:w="120" w:type="dxa"/>
+            </w:tcMar>
+          </w:tcPr>
+          <w:p>
+            <w:pPr>
+              <w:jc w:val="left"/>
+            </w:pPr>
+            <w:r>
+              <w:t>Spawn Category/Zone/Transform</w:t>
+            </w:r>
+          </w:p>
+        </w:tc>
+      </w:tr>
+    </w:tbl>
+    <w:p>
+      <w:pPr>
+        <w:pStyle w:val="a0"/>
+      </w:pPr>
+      <w:r>
+        <w:t>Mesh, Material, Texture, Icon, Visual Transform 또는 Balance만 다른 Variant는 Data Row로 추가하고 Actor Blueprint를 만들지 않는다.</w:t>
+      </w:r>
+    </w:p>
+    <w:p>
+      <w:pPr>
+        <w:pStyle w:val="a0"/>
+      </w:pPr>
+      <w:r>
+        <w:t>Loose Loot와 Dropped Original은 서버 상태와 회수 Transaction이 다르므로 각각 하나의 공용 Shell을 유지한다.</w:t>
+      </w:r>
+    </w:p>
+    <w:p>
+      <w:pPr>
+        <w:pStyle w:val="a0"/>
+      </w:pPr>
+      <w:r>
+        <w:t>BP_SculptureDisplayCase, BP_CeramicDisplayCase와 Item별 Loot BP는 제거됐으며 신규 Map, Data Row 또는 Debug Fixture에서 다시 생성하거나 참조하지 않는다.</w:t>
+      </w:r>
+    </w:p>
+    <w:p>
+      <w:pPr>
+        <w:pStyle w:val="a0"/>
+      </w:pPr>
+      <w:r>
+        <w:t>서버는 Row Id와 Revision을 확정·복제하고 Client는 같은 Data Row에서 Mesh/Material을 해석한다. Blueprint의 ItemId/ArtifactId Switch로 Asset을 하드코딩하지 않는다.</w:t>
+      </w:r>
+    </w:p>
+    <w:p>
+      <w:pPr>
+        <w:pStyle w:val="a0"/>
+      </w:pPr>
+      <w:r>
+        <w:t>Debug Spawn도 Canonical Blueprint Shell을 로드하며 실패 시 순수 C++ Actor로 Fallback하지 않고 FAIL/BLOCKED로 처리한다.</w:t>
+      </w:r>
+    </w:p>
+    <w:tbl>
+      <w:tblPr>
+        <w:tblStyle w:val="af9"/>
         <w:tblW w:w="9864" w:type="dxa"/>
         <w:jc w:val="center"/>
         <w:tblLayout w:type="fixed"/>
@@ -36415,14 +36885,8 @@
             <w:vAlign w:val="center"/>
           </w:tcPr>
           <w:p>
-            <w:pPr>
-              <w:pStyle w:val="TableText"/>
-            </w:pPr>
-            <w:r>
-              <w:rPr>
-                <w:sz w:val="16"/>
-              </w:rPr>
-              <w:t>ArtifactId, Family, Value, Weight, ForgeryType, TemplatePool</w:t>
+            <w:r>
+              <w:t>ArtifactId, Family, Value, Weight, ForgeryType, TemplateId. Actor Class 없음.</w:t>
             </w:r>
           </w:p>
         </w:tc>
@@ -36432,14 +36896,8 @@
             <w:vAlign w:val="center"/>
           </w:tcPr>
           <w:p>
-            <w:pPr>
-              <w:pStyle w:val="TableText"/>
-            </w:pPr>
-            <w:r>
-              <w:rPr>
-                <w:sz w:val="16"/>
-              </w:rPr>
-              <w:t>Value&gt;0, Case/Family 호환</w:t>
+            <w:r>
+              <w:t>Value&gt;0, Case/Family/Template 호환, Presentation Data 해석 가능</w:t>
             </w:r>
           </w:p>
         </w:tc>
@@ -36559,6 +37017,38 @@
         </w:tc>
       </w:tr>
       <w:tr>
+        <w:tc>
+          <w:tcPr>
+            <w:tcW w:type="dxa" w:w="2137"/>
+          </w:tcPr>
+          <w:p>
+            <w:r>
+              <w:t>FHeistObjectAssemblyPartRow</w:t>
+            </w:r>
+          </w:p>
+        </w:tc>
+        <w:tc>
+          <w:tcPr>
+            <w:tcW w:type="dxa" w:w="3617"/>
+          </w:tcPr>
+          <w:p>
+            <w:r>
+              <w:t>PartId, FamilyId, StaticMesh, Socket, Orientation, Material Variant Data</w:t>
+            </w:r>
+          </w:p>
+        </w:tc>
+        <w:tc>
+          <w:tcPr>
+            <w:tcW w:type="dxa" w:w="4110"/>
+          </w:tcPr>
+          <w:p>
+            <w:r>
+              <w:t>Mesh/Socket/Orientation/MaterialId가 Family 안에서 해석 가능</w:t>
+            </w:r>
+          </w:p>
+        </w:tc>
+      </w:tr>
+      <w:tr>
         <w:trPr>
           <w:cantSplit/>
           <w:jc w:val="center"/>
@@ -36586,14 +37076,8 @@
             <w:vAlign w:val="center"/>
           </w:tcPr>
           <w:p>
-            <w:pPr>
-              <w:pStyle w:val="TableText"/>
-            </w:pPr>
-            <w:r>
-              <w:rPr>
-                <w:sz w:val="16"/>
-              </w:rPr>
-              <w:t>ItemId, Value, Weight, Grid, SpawnCategory</w:t>
+            <w:r>
+              <w:t>ItemId, Value, SpawnCategory, SpawnWeight, WorldMesh, WorldMaterials, VisualRelativeTransform</w:t>
             </w:r>
           </w:p>
         </w:tc>
@@ -36603,14 +37087,8 @@
             <w:vAlign w:val="center"/>
           </w:tcPr>
           <w:p>
-            <w:pPr>
-              <w:pStyle w:val="TableText"/>
-            </w:pPr>
-            <w:r>
-              <w:rPr>
-                <w:sz w:val="16"/>
-              </w:rPr>
-              <w:t>Value/Weight/Grid 유효</w:t>
+            <w:r>
+              <w:t>Item Row 존재, Visual Asset 유효, Actor Class 없음</w:t>
             </w:r>
           </w:p>
         </w:tc>

</xml_diff>

<commit_message>
Run W9 legacy cleanup and asset provenance pass
This changeset removes deprecated competitive/prototype systems (rare loot event flow, related tags/widgets/debug hooks, legacy match/display-case states, obsolete components, and old prototype DataTable rows) and aligns runtime contracts with the current co-op contract run rules. It also simplifies inspection behavior to delay-only scheduling and removes obsolete forgery timeout-penalty fields from code/data.

On the content side, it refreshes Object Assembly gallery assets and maps, adds deterministic source OBJ files plus a rebuild script under `SourceArt/ObjectAssembly`, updates DataTable import paths to `/Game/Assets/...`, and introduces shipping-license tracking docs (`SHIPPING_ASSET_MANIFEST.md`, `THIRD_PARTY_NOTICES.md`) for release auditability.
</commit_message>
<xml_diff>
--- a/Museum_Heist_TDD.docx
+++ b/Museum_Heist_TDD.docx
@@ -564,7 +564,7 @@
       <w:r>
         <w:fldChar w:fldCharType="separate"/>
       </w:r>
-      <w:hyperlink w:anchor="_Toc237172704" w:history="1">
+      <w:hyperlink w:anchor="_Toc237735155" w:history="1">
         <w:r>
           <w:rPr>
             <w:rStyle w:val="aff1"/>
@@ -591,7 +591,7 @@
             <w:noProof/>
             <w:webHidden/>
           </w:rPr>
-          <w:instrText xml:space="preserve"> PAGEREF _Toc237172704 \h </w:instrText>
+          <w:instrText xml:space="preserve"> PAGEREF _Toc237735155 \h </w:instrText>
         </w:r>
         <w:r>
           <w:rPr>
@@ -640,7 +640,7 @@
           <w14:ligatures w14:val="standardContextual"/>
         </w:rPr>
       </w:pPr>
-      <w:hyperlink w:anchor="_Toc237172705" w:history="1">
+      <w:hyperlink w:anchor="_Toc237735156" w:history="1">
         <w:r>
           <w:rPr>
             <w:rStyle w:val="aff1"/>
@@ -667,7 +667,7 @@
             <w:noProof/>
             <w:webHidden/>
           </w:rPr>
-          <w:instrText xml:space="preserve"> PAGEREF _Toc237172705 \h </w:instrText>
+          <w:instrText xml:space="preserve"> PAGEREF _Toc237735156 \h </w:instrText>
         </w:r>
         <w:r>
           <w:rPr>
@@ -716,7 +716,7 @@
           <w14:ligatures w14:val="standardContextual"/>
         </w:rPr>
       </w:pPr>
-      <w:hyperlink w:anchor="_Toc237172706" w:history="1">
+      <w:hyperlink w:anchor="_Toc237735157" w:history="1">
         <w:r>
           <w:rPr>
             <w:rStyle w:val="aff1"/>
@@ -743,7 +743,7 @@
             <w:noProof/>
             <w:webHidden/>
           </w:rPr>
-          <w:instrText xml:space="preserve"> PAGEREF _Toc237172706 \h </w:instrText>
+          <w:instrText xml:space="preserve"> PAGEREF _Toc237735157 \h </w:instrText>
         </w:r>
         <w:r>
           <w:rPr>
@@ -792,7 +792,7 @@
           <w14:ligatures w14:val="standardContextual"/>
         </w:rPr>
       </w:pPr>
-      <w:hyperlink w:anchor="_Toc237172707" w:history="1">
+      <w:hyperlink w:anchor="_Toc237735158" w:history="1">
         <w:r>
           <w:rPr>
             <w:rStyle w:val="aff1"/>
@@ -819,7 +819,7 @@
             <w:noProof/>
             <w:webHidden/>
           </w:rPr>
-          <w:instrText xml:space="preserve"> PAGEREF _Toc237172707 \h </w:instrText>
+          <w:instrText xml:space="preserve"> PAGEREF _Toc237735158 \h </w:instrText>
         </w:r>
         <w:r>
           <w:rPr>
@@ -868,7 +868,7 @@
           <w14:ligatures w14:val="standardContextual"/>
         </w:rPr>
       </w:pPr>
-      <w:hyperlink w:anchor="_Toc237172708" w:history="1">
+      <w:hyperlink w:anchor="_Toc237735159" w:history="1">
         <w:r>
           <w:rPr>
             <w:rStyle w:val="aff1"/>
@@ -895,7 +895,7 @@
             <w:noProof/>
             <w:webHidden/>
           </w:rPr>
-          <w:instrText xml:space="preserve"> PAGEREF _Toc237172708 \h </w:instrText>
+          <w:instrText xml:space="preserve"> PAGEREF _Toc237735159 \h </w:instrText>
         </w:r>
         <w:r>
           <w:rPr>
@@ -944,7 +944,7 @@
           <w14:ligatures w14:val="standardContextual"/>
         </w:rPr>
       </w:pPr>
-      <w:hyperlink w:anchor="_Toc237172709" w:history="1">
+      <w:hyperlink w:anchor="_Toc237735160" w:history="1">
         <w:r>
           <w:rPr>
             <w:rStyle w:val="aff1"/>
@@ -971,7 +971,7 @@
             <w:noProof/>
             <w:webHidden/>
           </w:rPr>
-          <w:instrText xml:space="preserve"> PAGEREF _Toc237172709 \h </w:instrText>
+          <w:instrText xml:space="preserve"> PAGEREF _Toc237735160 \h </w:instrText>
         </w:r>
         <w:r>
           <w:rPr>
@@ -1020,7 +1020,7 @@
           <w14:ligatures w14:val="standardContextual"/>
         </w:rPr>
       </w:pPr>
-      <w:hyperlink w:anchor="_Toc237172710" w:history="1">
+      <w:hyperlink w:anchor="_Toc237735161" w:history="1">
         <w:r>
           <w:rPr>
             <w:rStyle w:val="aff1"/>
@@ -1047,7 +1047,7 @@
             <w:noProof/>
             <w:webHidden/>
           </w:rPr>
-          <w:instrText xml:space="preserve"> PAGEREF _Toc237172710 \h </w:instrText>
+          <w:instrText xml:space="preserve"> PAGEREF _Toc237735161 \h </w:instrText>
         </w:r>
         <w:r>
           <w:rPr>
@@ -1096,7 +1096,7 @@
           <w14:ligatures w14:val="standardContextual"/>
         </w:rPr>
       </w:pPr>
-      <w:hyperlink w:anchor="_Toc237172711" w:history="1">
+      <w:hyperlink w:anchor="_Toc237735162" w:history="1">
         <w:r>
           <w:rPr>
             <w:rStyle w:val="aff1"/>
@@ -1123,7 +1123,7 @@
             <w:noProof/>
             <w:webHidden/>
           </w:rPr>
-          <w:instrText xml:space="preserve"> PAGEREF _Toc237172711 \h </w:instrText>
+          <w:instrText xml:space="preserve"> PAGEREF _Toc237735162 \h </w:instrText>
         </w:r>
         <w:r>
           <w:rPr>
@@ -1172,7 +1172,7 @@
           <w14:ligatures w14:val="standardContextual"/>
         </w:rPr>
       </w:pPr>
-      <w:hyperlink w:anchor="_Toc237172712" w:history="1">
+      <w:hyperlink w:anchor="_Toc237735163" w:history="1">
         <w:r>
           <w:rPr>
             <w:rStyle w:val="aff1"/>
@@ -1199,7 +1199,7 @@
             <w:noProof/>
             <w:webHidden/>
           </w:rPr>
-          <w:instrText xml:space="preserve"> PAGEREF _Toc237172712 \h </w:instrText>
+          <w:instrText xml:space="preserve"> PAGEREF _Toc237735163 \h </w:instrText>
         </w:r>
         <w:r>
           <w:rPr>
@@ -1248,7 +1248,7 @@
           <w14:ligatures w14:val="standardContextual"/>
         </w:rPr>
       </w:pPr>
-      <w:hyperlink w:anchor="_Toc237172713" w:history="1">
+      <w:hyperlink w:anchor="_Toc237735164" w:history="1">
         <w:r>
           <w:rPr>
             <w:rStyle w:val="aff1"/>
@@ -1275,7 +1275,7 @@
             <w:noProof/>
             <w:webHidden/>
           </w:rPr>
-          <w:instrText xml:space="preserve"> PAGEREF _Toc237172713 \h </w:instrText>
+          <w:instrText xml:space="preserve"> PAGEREF _Toc237735164 \h </w:instrText>
         </w:r>
         <w:r>
           <w:rPr>
@@ -1324,7 +1324,7 @@
           <w14:ligatures w14:val="standardContextual"/>
         </w:rPr>
       </w:pPr>
-      <w:hyperlink w:anchor="_Toc237172714" w:history="1">
+      <w:hyperlink w:anchor="_Toc237735165" w:history="1">
         <w:r>
           <w:rPr>
             <w:rStyle w:val="aff1"/>
@@ -1351,7 +1351,7 @@
             <w:noProof/>
             <w:webHidden/>
           </w:rPr>
-          <w:instrText xml:space="preserve"> PAGEREF _Toc237172714 \h </w:instrText>
+          <w:instrText xml:space="preserve"> PAGEREF _Toc237735165 \h </w:instrText>
         </w:r>
         <w:r>
           <w:rPr>
@@ -1399,7 +1399,7 @@
           <w14:ligatures w14:val="standardContextual"/>
         </w:rPr>
       </w:pPr>
-      <w:hyperlink w:anchor="_Toc237172715" w:history="1">
+      <w:hyperlink w:anchor="_Toc237735166" w:history="1">
         <w:r>
           <w:rPr>
             <w:rStyle w:val="aff1"/>
@@ -1426,7 +1426,7 @@
             <w:noProof/>
             <w:webHidden/>
           </w:rPr>
-          <w:instrText xml:space="preserve"> PAGEREF _Toc237172715 \h </w:instrText>
+          <w:instrText xml:space="preserve"> PAGEREF _Toc237735166 \h </w:instrText>
         </w:r>
         <w:r>
           <w:rPr>
@@ -1475,7 +1475,7 @@
           <w14:ligatures w14:val="standardContextual"/>
         </w:rPr>
       </w:pPr>
-      <w:hyperlink w:anchor="_Toc237172716" w:history="1">
+      <w:hyperlink w:anchor="_Toc237735167" w:history="1">
         <w:r>
           <w:rPr>
             <w:rStyle w:val="aff1"/>
@@ -1502,15 +1502,7 @@
             <w:noProof/>
             <w:webHidden/>
           </w:rPr>
-          <w:instrText xml:space="preserve"> PAGERE</w:instrText>
-        </w:r>
-        <w:r>
-          <w:rPr>
-            <w:noProof/>
-            <w:webHidden/>
-          </w:rPr>
-          <w:lastRenderedPageBreak/>
-          <w:instrText xml:space="preserve">F _Toc237172716 \h </w:instrText>
+          <w:instrText xml:space="preserve"> PAGEREF _Toc237735167 \h </w:instrText>
         </w:r>
         <w:r>
           <w:rPr>
@@ -1559,7 +1551,7 @@
           <w14:ligatures w14:val="standardContextual"/>
         </w:rPr>
       </w:pPr>
-      <w:hyperlink w:anchor="_Toc237172717" w:history="1">
+      <w:hyperlink w:anchor="_Toc237735168" w:history="1">
         <w:r>
           <w:rPr>
             <w:rStyle w:val="aff1"/>
@@ -1586,7 +1578,7 @@
             <w:noProof/>
             <w:webHidden/>
           </w:rPr>
-          <w:instrText xml:space="preserve"> PAGEREF _Toc237172717 \h </w:instrText>
+          <w:instrText xml:space="preserve"> PAGEREF _Toc237735168 \h </w:instrText>
         </w:r>
         <w:r>
           <w:rPr>
@@ -1635,7 +1627,7 @@
           <w14:ligatures w14:val="standardContextual"/>
         </w:rPr>
       </w:pPr>
-      <w:hyperlink w:anchor="_Toc237172718" w:history="1">
+      <w:hyperlink w:anchor="_Toc237735169" w:history="1">
         <w:r>
           <w:rPr>
             <w:rStyle w:val="aff1"/>
@@ -1662,7 +1654,7 @@
             <w:noProof/>
             <w:webHidden/>
           </w:rPr>
-          <w:instrText xml:space="preserve"> PAGEREF _Toc237172718 \h </w:instrText>
+          <w:instrText xml:space="preserve"> PAGEREF _Toc237735169 \h </w:instrText>
         </w:r>
         <w:r>
           <w:rPr>
@@ -1711,7 +1703,7 @@
           <w14:ligatures w14:val="standardContextual"/>
         </w:rPr>
       </w:pPr>
-      <w:hyperlink w:anchor="_Toc237172719" w:history="1">
+      <w:hyperlink w:anchor="_Toc237735170" w:history="1">
         <w:r>
           <w:rPr>
             <w:rStyle w:val="aff1"/>
@@ -1738,7 +1730,7 @@
             <w:noProof/>
             <w:webHidden/>
           </w:rPr>
-          <w:instrText xml:space="preserve"> PAGEREF _Toc237172719 \h </w:instrText>
+          <w:instrText xml:space="preserve"> PAGEREF _Toc237735170 \h </w:instrText>
         </w:r>
         <w:r>
           <w:rPr>
@@ -1787,7 +1779,7 @@
           <w14:ligatures w14:val="standardContextual"/>
         </w:rPr>
       </w:pPr>
-      <w:hyperlink w:anchor="_Toc237172720" w:history="1">
+      <w:hyperlink w:anchor="_Toc237735171" w:history="1">
         <w:r>
           <w:rPr>
             <w:rStyle w:val="aff1"/>
@@ -1814,7 +1806,7 @@
             <w:noProof/>
             <w:webHidden/>
           </w:rPr>
-          <w:instrText xml:space="preserve"> PAGEREF _Toc237172720 \h </w:instrText>
+          <w:instrText xml:space="preserve"> PAGEREF _Toc237735171 \h </w:instrText>
         </w:r>
         <w:r>
           <w:rPr>
@@ -1863,7 +1855,7 @@
           <w14:ligatures w14:val="standardContextual"/>
         </w:rPr>
       </w:pPr>
-      <w:hyperlink w:anchor="_Toc237172721" w:history="1">
+      <w:hyperlink w:anchor="_Toc237735172" w:history="1">
         <w:r>
           <w:rPr>
             <w:rStyle w:val="aff1"/>
@@ -1890,7 +1882,7 @@
             <w:noProof/>
             <w:webHidden/>
           </w:rPr>
-          <w:instrText xml:space="preserve"> PAGEREF _Toc237172721 \h </w:instrText>
+          <w:instrText xml:space="preserve"> PAGEREF _Toc237735172 \h </w:instrText>
         </w:r>
         <w:r>
           <w:rPr>
@@ -1939,7 +1931,7 @@
           <w14:ligatures w14:val="standardContextual"/>
         </w:rPr>
       </w:pPr>
-      <w:hyperlink w:anchor="_Toc237172722" w:history="1">
+      <w:hyperlink w:anchor="_Toc237735173" w:history="1">
         <w:r>
           <w:rPr>
             <w:rStyle w:val="aff1"/>
@@ -1966,7 +1958,7 @@
             <w:noProof/>
             <w:webHidden/>
           </w:rPr>
-          <w:instrText xml:space="preserve"> PAGEREF _Toc237172722 \h </w:instrText>
+          <w:instrText xml:space="preserve"> PAGEREF _Toc237735173 \h </w:instrText>
         </w:r>
         <w:r>
           <w:rPr>
@@ -2015,7 +2007,7 @@
           <w14:ligatures w14:val="standardContextual"/>
         </w:rPr>
       </w:pPr>
-      <w:hyperlink w:anchor="_Toc237172723" w:history="1">
+      <w:hyperlink w:anchor="_Toc237735174" w:history="1">
         <w:r>
           <w:rPr>
             <w:rStyle w:val="aff1"/>
@@ -2042,7 +2034,7 @@
             <w:noProof/>
             <w:webHidden/>
           </w:rPr>
-          <w:instrText xml:space="preserve"> PAGEREF _Toc237172723 \h </w:instrText>
+          <w:instrText xml:space="preserve"> PAGEREF _Toc237735174 \h </w:instrText>
         </w:r>
         <w:r>
           <w:rPr>
@@ -2091,7 +2083,7 @@
           <w14:ligatures w14:val="standardContextual"/>
         </w:rPr>
       </w:pPr>
-      <w:hyperlink w:anchor="_Toc237172724" w:history="1">
+      <w:hyperlink w:anchor="_Toc237735175" w:history="1">
         <w:r>
           <w:rPr>
             <w:rStyle w:val="aff1"/>
@@ -2118,7 +2110,7 @@
             <w:noProof/>
             <w:webHidden/>
           </w:rPr>
-          <w:instrText xml:space="preserve"> PAGEREF _Toc237172724 \h </w:instrText>
+          <w:instrText xml:space="preserve"> PAGEREF _Toc237735175 \h </w:instrText>
         </w:r>
         <w:r>
           <w:rPr>
@@ -2167,7 +2159,7 @@
           <w14:ligatures w14:val="standardContextual"/>
         </w:rPr>
       </w:pPr>
-      <w:hyperlink w:anchor="_Toc237172725" w:history="1">
+      <w:hyperlink w:anchor="_Toc237735176" w:history="1">
         <w:r>
           <w:rPr>
             <w:rStyle w:val="aff1"/>
@@ -2194,7 +2186,7 @@
             <w:noProof/>
             <w:webHidden/>
           </w:rPr>
-          <w:instrText xml:space="preserve"> PAGEREF _Toc237172725 \h </w:instrText>
+          <w:instrText xml:space="preserve"> PAGEREF _Toc237735176 \h </w:instrText>
         </w:r>
         <w:r>
           <w:rPr>
@@ -2243,7 +2235,7 @@
           <w14:ligatures w14:val="standardContextual"/>
         </w:rPr>
       </w:pPr>
-      <w:hyperlink w:anchor="_Toc237172726" w:history="1">
+      <w:hyperlink w:anchor="_Toc237735177" w:history="1">
         <w:r>
           <w:rPr>
             <w:rStyle w:val="aff1"/>
@@ -2270,7 +2262,7 @@
             <w:noProof/>
             <w:webHidden/>
           </w:rPr>
-          <w:instrText xml:space="preserve"> PAGEREF _Toc237172726 \h </w:instrText>
+          <w:instrText xml:space="preserve"> PAGEREF _Toc237735177 \h </w:instrText>
         </w:r>
         <w:r>
           <w:rPr>
@@ -2319,7 +2311,7 @@
           <w14:ligatures w14:val="standardContextual"/>
         </w:rPr>
       </w:pPr>
-      <w:hyperlink w:anchor="_Toc237172727" w:history="1">
+      <w:hyperlink w:anchor="_Toc237735178" w:history="1">
         <w:r>
           <w:rPr>
             <w:rStyle w:val="aff1"/>
@@ -2346,7 +2338,7 @@
             <w:noProof/>
             <w:webHidden/>
           </w:rPr>
-          <w:instrText xml:space="preserve"> PAGEREF _Toc237172727 \h </w:instrText>
+          <w:instrText xml:space="preserve"> PAGEREF _Toc237735178 \h </w:instrText>
         </w:r>
         <w:r>
           <w:rPr>
@@ -2395,7 +2387,7 @@
           <w14:ligatures w14:val="standardContextual"/>
         </w:rPr>
       </w:pPr>
-      <w:hyperlink w:anchor="_Toc237172728" w:history="1">
+      <w:hyperlink w:anchor="_Toc237735179" w:history="1">
         <w:r>
           <w:rPr>
             <w:rStyle w:val="aff1"/>
@@ -2422,7 +2414,7 @@
             <w:noProof/>
             <w:webHidden/>
           </w:rPr>
-          <w:instrText xml:space="preserve"> PAGEREF _Toc237172728 \h </w:instrText>
+          <w:instrText xml:space="preserve"> PAGEREF _Toc237735179 \h </w:instrText>
         </w:r>
         <w:r>
           <w:rPr>
@@ -2471,7 +2463,7 @@
           <w14:ligatures w14:val="standardContextual"/>
         </w:rPr>
       </w:pPr>
-      <w:hyperlink w:anchor="_Toc237172729" w:history="1">
+      <w:hyperlink w:anchor="_Toc237735180" w:history="1">
         <w:r>
           <w:rPr>
             <w:rStyle w:val="aff1"/>
@@ -2498,7 +2490,7 @@
             <w:noProof/>
             <w:webHidden/>
           </w:rPr>
-          <w:instrText xml:space="preserve"> PAGEREF _Toc237172729 \h </w:instrText>
+          <w:instrText xml:space="preserve"> PAGEREF _Toc237735180 \h </w:instrText>
         </w:r>
         <w:r>
           <w:rPr>
@@ -2547,7 +2539,7 @@
           <w14:ligatures w14:val="standardContextual"/>
         </w:rPr>
       </w:pPr>
-      <w:hyperlink w:anchor="_Toc237172730" w:history="1">
+      <w:hyperlink w:anchor="_Toc237735181" w:history="1">
         <w:r>
           <w:rPr>
             <w:rStyle w:val="aff1"/>
@@ -2574,7 +2566,7 @@
             <w:noProof/>
             <w:webHidden/>
           </w:rPr>
-          <w:instrText xml:space="preserve"> PAGEREF _Toc237172730 \h </w:instrText>
+          <w:instrText xml:space="preserve"> PAGEREF _Toc237735181 \h </w:instrText>
         </w:r>
         <w:r>
           <w:rPr>
@@ -2623,7 +2615,7 @@
           <w14:ligatures w14:val="standardContextual"/>
         </w:rPr>
       </w:pPr>
-      <w:hyperlink w:anchor="_Toc237172731" w:history="1">
+      <w:hyperlink w:anchor="_Toc237735182" w:history="1">
         <w:r>
           <w:rPr>
             <w:rStyle w:val="aff1"/>
@@ -2650,7 +2642,7 @@
             <w:noProof/>
             <w:webHidden/>
           </w:rPr>
-          <w:instrText xml:space="preserve"> PAGEREF _Toc237172731 \h </w:instrText>
+          <w:instrText xml:space="preserve"> PAGEREF _Toc237735182 \h </w:instrText>
         </w:r>
         <w:r>
           <w:rPr>
@@ -2699,7 +2691,7 @@
           <w14:ligatures w14:val="standardContextual"/>
         </w:rPr>
       </w:pPr>
-      <w:hyperlink w:anchor="_Toc237172732" w:history="1">
+      <w:hyperlink w:anchor="_Toc237735183" w:history="1">
         <w:r>
           <w:rPr>
             <w:rStyle w:val="aff1"/>
@@ -2726,7 +2718,7 @@
             <w:noProof/>
             <w:webHidden/>
           </w:rPr>
-          <w:instrText xml:space="preserve"> PAGEREF _Toc237172732 \h </w:instrText>
+          <w:instrText xml:space="preserve"> PAGEREF _Toc237735183 \h </w:instrText>
         </w:r>
         <w:r>
           <w:rPr>
@@ -2775,7 +2767,7 @@
           <w14:ligatures w14:val="standardContextual"/>
         </w:rPr>
       </w:pPr>
-      <w:hyperlink w:anchor="_Toc237172733" w:history="1">
+      <w:hyperlink w:anchor="_Toc237735184" w:history="1">
         <w:r>
           <w:rPr>
             <w:rStyle w:val="aff1"/>
@@ -2802,7 +2794,7 @@
             <w:noProof/>
             <w:webHidden/>
           </w:rPr>
-          <w:instrText xml:space="preserve"> PAGEREF _Toc237172733 \h </w:instrText>
+          <w:instrText xml:space="preserve"> PAGEREF _Toc237735184 \h </w:instrText>
         </w:r>
         <w:r>
           <w:rPr>
@@ -2851,7 +2843,7 @@
           <w14:ligatures w14:val="standardContextual"/>
         </w:rPr>
       </w:pPr>
-      <w:hyperlink w:anchor="_Toc237172734" w:history="1">
+      <w:hyperlink w:anchor="_Toc237735185" w:history="1">
         <w:r>
           <w:rPr>
             <w:rStyle w:val="aff1"/>
@@ -2878,7 +2870,7 @@
             <w:noProof/>
             <w:webHidden/>
           </w:rPr>
-          <w:instrText xml:space="preserve"> PAGEREF _Toc237172734 \h </w:instrText>
+          <w:instrText xml:space="preserve"> PAGEREF _Toc237735185 \h </w:instrText>
         </w:r>
         <w:r>
           <w:rPr>
@@ -2927,7 +2919,7 @@
           <w14:ligatures w14:val="standardContextual"/>
         </w:rPr>
       </w:pPr>
-      <w:hyperlink w:anchor="_Toc237172735" w:history="1">
+      <w:hyperlink w:anchor="_Toc237735186" w:history="1">
         <w:r>
           <w:rPr>
             <w:rStyle w:val="aff1"/>
@@ -2954,7 +2946,7 @@
             <w:noProof/>
             <w:webHidden/>
           </w:rPr>
-          <w:instrText xml:space="preserve"> PAGEREF _Toc237172735 \h </w:instrText>
+          <w:instrText xml:space="preserve"> PAGEREF _Toc237735186 \h </w:instrText>
         </w:r>
         <w:r>
           <w:rPr>
@@ -3003,7 +2995,7 @@
           <w14:ligatures w14:val="standardContextual"/>
         </w:rPr>
       </w:pPr>
-      <w:hyperlink w:anchor="_Toc237172736" w:history="1">
+      <w:hyperlink w:anchor="_Toc237735187" w:history="1">
         <w:r>
           <w:rPr>
             <w:rStyle w:val="aff1"/>
@@ -3030,7 +3022,7 @@
             <w:noProof/>
             <w:webHidden/>
           </w:rPr>
-          <w:instrText xml:space="preserve"> PAGEREF _Toc237172736 \h </w:instrText>
+          <w:instrText xml:space="preserve"> PAGEREF _Toc237735187 \h </w:instrText>
         </w:r>
         <w:r>
           <w:rPr>
@@ -3079,7 +3071,7 @@
           <w14:ligatures w14:val="standardContextual"/>
         </w:rPr>
       </w:pPr>
-      <w:hyperlink w:anchor="_Toc237172737" w:history="1">
+      <w:hyperlink w:anchor="_Toc237735188" w:history="1">
         <w:r>
           <w:rPr>
             <w:rStyle w:val="aff1"/>
@@ -3106,7 +3098,7 @@
             <w:noProof/>
             <w:webHidden/>
           </w:rPr>
-          <w:instrText xml:space="preserve"> PAGEREF _Toc237172737 \h </w:instrText>
+          <w:instrText xml:space="preserve"> PAGEREF _Toc237735188 \h </w:instrText>
         </w:r>
         <w:r>
           <w:rPr>
@@ -3155,7 +3147,7 @@
           <w14:ligatures w14:val="standardContextual"/>
         </w:rPr>
       </w:pPr>
-      <w:hyperlink w:anchor="_Toc237172738" w:history="1">
+      <w:hyperlink w:anchor="_Toc237735189" w:history="1">
         <w:r>
           <w:rPr>
             <w:rStyle w:val="aff1"/>
@@ -3182,7 +3174,7 @@
             <w:noProof/>
             <w:webHidden/>
           </w:rPr>
-          <w:instrText xml:space="preserve"> PAGEREF _Toc237172738 \h </w:instrText>
+          <w:instrText xml:space="preserve"> PAGEREF _Toc237735189 \h </w:instrText>
         </w:r>
         <w:r>
           <w:rPr>
@@ -3231,7 +3223,7 @@
           <w14:ligatures w14:val="standardContextual"/>
         </w:rPr>
       </w:pPr>
-      <w:hyperlink w:anchor="_Toc237172739" w:history="1">
+      <w:hyperlink w:anchor="_Toc237735190" w:history="1">
         <w:r>
           <w:rPr>
             <w:rStyle w:val="aff1"/>
@@ -3258,7 +3250,7 @@
             <w:noProof/>
             <w:webHidden/>
           </w:rPr>
-          <w:instrText xml:space="preserve"> PAGEREF _Toc237172739 \h </w:instrText>
+          <w:instrText xml:space="preserve"> PAGEREF _Toc237735190 \h </w:instrText>
         </w:r>
         <w:r>
           <w:rPr>
@@ -3307,7 +3299,7 @@
           <w14:ligatures w14:val="standardContextual"/>
         </w:rPr>
       </w:pPr>
-      <w:hyperlink w:anchor="_Toc237172740" w:history="1">
+      <w:hyperlink w:anchor="_Toc237735191" w:history="1">
         <w:r>
           <w:rPr>
             <w:rStyle w:val="aff1"/>
@@ -3334,7 +3326,7 @@
             <w:noProof/>
             <w:webHidden/>
           </w:rPr>
-          <w:instrText xml:space="preserve"> PAGEREF _Toc237172740 \h </w:instrText>
+          <w:instrText xml:space="preserve"> PAGEREF _Toc237735191 \h </w:instrText>
         </w:r>
         <w:r>
           <w:rPr>
@@ -3383,7 +3375,7 @@
           <w14:ligatures w14:val="standardContextual"/>
         </w:rPr>
       </w:pPr>
-      <w:hyperlink w:anchor="_Toc237172741" w:history="1">
+      <w:hyperlink w:anchor="_Toc237735192" w:history="1">
         <w:r>
           <w:rPr>
             <w:rStyle w:val="aff1"/>
@@ -3410,7 +3402,7 @@
             <w:noProof/>
             <w:webHidden/>
           </w:rPr>
-          <w:instrText xml:space="preserve"> PAGEREF _Toc237172741 \h </w:instrText>
+          <w:instrText xml:space="preserve"> PAGEREF _Toc237735192 \h </w:instrText>
         </w:r>
         <w:r>
           <w:rPr>
@@ -3459,7 +3451,7 @@
           <w14:ligatures w14:val="standardContextual"/>
         </w:rPr>
       </w:pPr>
-      <w:hyperlink w:anchor="_Toc237172742" w:history="1">
+      <w:hyperlink w:anchor="_Toc237735193" w:history="1">
         <w:r>
           <w:rPr>
             <w:rStyle w:val="aff1"/>
@@ -3486,7 +3478,7 @@
             <w:noProof/>
             <w:webHidden/>
           </w:rPr>
-          <w:instrText xml:space="preserve"> PAGEREF _Toc237172742 \h </w:instrText>
+          <w:instrText xml:space="preserve"> PAGEREF _Toc237735193 \h </w:instrText>
         </w:r>
         <w:r>
           <w:rPr>
@@ -3535,7 +3527,7 @@
           <w14:ligatures w14:val="standardContextual"/>
         </w:rPr>
       </w:pPr>
-      <w:hyperlink w:anchor="_Toc237172743" w:history="1">
+      <w:hyperlink w:anchor="_Toc237735194" w:history="1">
         <w:r>
           <w:rPr>
             <w:rStyle w:val="aff1"/>
@@ -3562,7 +3554,7 @@
             <w:noProof/>
             <w:webHidden/>
           </w:rPr>
-          <w:instrText xml:space="preserve"> PAGEREF _Toc237172743 \h </w:instrText>
+          <w:instrText xml:space="preserve"> PAGEREF _Toc237735194 \h </w:instrText>
         </w:r>
         <w:r>
           <w:rPr>
@@ -3611,7 +3603,7 @@
           <w14:ligatures w14:val="standardContextual"/>
         </w:rPr>
       </w:pPr>
-      <w:hyperlink w:anchor="_Toc237172744" w:history="1">
+      <w:hyperlink w:anchor="_Toc237735195" w:history="1">
         <w:r>
           <w:rPr>
             <w:rStyle w:val="aff1"/>
@@ -3638,7 +3630,7 @@
             <w:noProof/>
             <w:webHidden/>
           </w:rPr>
-          <w:instrText xml:space="preserve"> PAGEREF _Toc237172744 \h </w:instrText>
+          <w:instrText xml:space="preserve"> PAGEREF _Toc237735195 \h </w:instrText>
         </w:r>
         <w:r>
           <w:rPr>
@@ -3687,7 +3679,7 @@
           <w14:ligatures w14:val="standardContextual"/>
         </w:rPr>
       </w:pPr>
-      <w:hyperlink w:anchor="_Toc237172745" w:history="1">
+      <w:hyperlink w:anchor="_Toc237735196" w:history="1">
         <w:r>
           <w:rPr>
             <w:rStyle w:val="aff1"/>
@@ -3714,7 +3706,7 @@
             <w:noProof/>
             <w:webHidden/>
           </w:rPr>
-          <w:instrText xml:space="preserve"> PAGEREF _Toc237172745 \h </w:instrText>
+          <w:instrText xml:space="preserve"> PAGEREF _Toc237735196 \h </w:instrText>
         </w:r>
         <w:r>
           <w:rPr>
@@ -3763,7 +3755,7 @@
           <w14:ligatures w14:val="standardContextual"/>
         </w:rPr>
       </w:pPr>
-      <w:hyperlink w:anchor="_Toc237172746" w:history="1">
+      <w:hyperlink w:anchor="_Toc237735197" w:history="1">
         <w:r>
           <w:rPr>
             <w:rStyle w:val="aff1"/>
@@ -3790,7 +3782,7 @@
             <w:noProof/>
             <w:webHidden/>
           </w:rPr>
-          <w:instrText xml:space="preserve"> PAGEREF _Toc237172746 \h </w:instrText>
+          <w:instrText xml:space="preserve"> PAGEREF _Toc237735197 \h </w:instrText>
         </w:r>
         <w:r>
           <w:rPr>
@@ -3839,7 +3831,7 @@
           <w14:ligatures w14:val="standardContextual"/>
         </w:rPr>
       </w:pPr>
-      <w:hyperlink w:anchor="_Toc237172747" w:history="1">
+      <w:hyperlink w:anchor="_Toc237735198" w:history="1">
         <w:r>
           <w:rPr>
             <w:rStyle w:val="aff1"/>
@@ -3866,7 +3858,7 @@
             <w:noProof/>
             <w:webHidden/>
           </w:rPr>
-          <w:instrText xml:space="preserve"> PAGEREF _Toc237172747 \h </w:instrText>
+          <w:instrText xml:space="preserve"> PAGEREF _Toc237735198 \h </w:instrText>
         </w:r>
         <w:r>
           <w:rPr>
@@ -3915,7 +3907,7 @@
           <w14:ligatures w14:val="standardContextual"/>
         </w:rPr>
       </w:pPr>
-      <w:hyperlink w:anchor="_Toc237172748" w:history="1">
+      <w:hyperlink w:anchor="_Toc237735199" w:history="1">
         <w:r>
           <w:rPr>
             <w:rStyle w:val="aff1"/>
@@ -3942,7 +3934,7 @@
             <w:noProof/>
             <w:webHidden/>
           </w:rPr>
-          <w:instrText xml:space="preserve"> PAGEREF _Toc237172748 \h </w:instrText>
+          <w:instrText xml:space="preserve"> PAGEREF _Toc237735199 \h </w:instrText>
         </w:r>
         <w:r>
           <w:rPr>
@@ -3991,7 +3983,7 @@
           <w14:ligatures w14:val="standardContextual"/>
         </w:rPr>
       </w:pPr>
-      <w:hyperlink w:anchor="_Toc237172749" w:history="1">
+      <w:hyperlink w:anchor="_Toc237735200" w:history="1">
         <w:r>
           <w:rPr>
             <w:rStyle w:val="aff1"/>
@@ -4018,7 +4010,7 @@
             <w:noProof/>
             <w:webHidden/>
           </w:rPr>
-          <w:instrText xml:space="preserve"> PAGEREF _Toc237172749 \h </w:instrText>
+          <w:instrText xml:space="preserve"> PAGEREF _Toc237735200 \h </w:instrText>
         </w:r>
         <w:r>
           <w:rPr>
@@ -4066,7 +4058,7 @@
           <w14:ligatures w14:val="standardContextual"/>
         </w:rPr>
       </w:pPr>
-      <w:hyperlink w:anchor="_Toc237172750" w:history="1">
+      <w:hyperlink w:anchor="_Toc237735201" w:history="1">
         <w:r>
           <w:rPr>
             <w:rStyle w:val="aff1"/>
@@ -4093,7 +4085,7 @@
             <w:noProof/>
             <w:webHidden/>
           </w:rPr>
-          <w:instrText xml:space="preserve"> PAGEREF _Toc237172750 \h </w:instrText>
+          <w:instrText xml:space="preserve"> PAGEREF _Toc237735201 \h </w:instrText>
         </w:r>
         <w:r>
           <w:rPr>
@@ -4142,7 +4134,7 @@
           <w14:ligatures w14:val="standardContextual"/>
         </w:rPr>
       </w:pPr>
-      <w:hyperlink w:anchor="_Toc237172751" w:history="1">
+      <w:hyperlink w:anchor="_Toc237735202" w:history="1">
         <w:r>
           <w:rPr>
             <w:rStyle w:val="aff1"/>
@@ -4169,7 +4161,7 @@
             <w:noProof/>
             <w:webHidden/>
           </w:rPr>
-          <w:instrText xml:space="preserve"> PAGEREF _Toc237172751 \h </w:instrText>
+          <w:instrText xml:space="preserve"> PAGEREF _Toc237735202 \h </w:instrText>
         </w:r>
         <w:r>
           <w:rPr>
@@ -4218,7 +4210,7 @@
           <w14:ligatures w14:val="standardContextual"/>
         </w:rPr>
       </w:pPr>
-      <w:hyperlink w:anchor="_Toc237172752" w:history="1">
+      <w:hyperlink w:anchor="_Toc237735203" w:history="1">
         <w:r>
           <w:rPr>
             <w:rStyle w:val="aff1"/>
@@ -4245,7 +4237,7 @@
             <w:noProof/>
             <w:webHidden/>
           </w:rPr>
-          <w:instrText xml:space="preserve"> PAGEREF _Toc237172752 \h </w:instrText>
+          <w:instrText xml:space="preserve"> PAGEREF _Toc237735203 \h </w:instrText>
         </w:r>
         <w:r>
           <w:rPr>
@@ -4294,7 +4286,7 @@
           <w14:ligatures w14:val="standardContextual"/>
         </w:rPr>
       </w:pPr>
-      <w:hyperlink w:anchor="_Toc237172753" w:history="1">
+      <w:hyperlink w:anchor="_Toc237735204" w:history="1">
         <w:r>
           <w:rPr>
             <w:rStyle w:val="aff1"/>
@@ -4321,7 +4313,7 @@
             <w:noProof/>
             <w:webHidden/>
           </w:rPr>
-          <w:instrText xml:space="preserve"> PAGEREF _Toc237172753 \h </w:instrText>
+          <w:instrText xml:space="preserve"> PAGEREF _Toc237735204 \h </w:instrText>
         </w:r>
         <w:r>
           <w:rPr>
@@ -4370,7 +4362,7 @@
           <w14:ligatures w14:val="standardContextual"/>
         </w:rPr>
       </w:pPr>
-      <w:hyperlink w:anchor="_Toc237172754" w:history="1">
+      <w:hyperlink w:anchor="_Toc237735205" w:history="1">
         <w:r>
           <w:rPr>
             <w:rStyle w:val="aff1"/>
@@ -4397,7 +4389,7 @@
             <w:noProof/>
             <w:webHidden/>
           </w:rPr>
-          <w:instrText xml:space="preserve"> PAGEREF _Toc237172754 \h </w:instrText>
+          <w:instrText xml:space="preserve"> PAGEREF _Toc237735205 \h </w:instrText>
         </w:r>
         <w:r>
           <w:rPr>
@@ -4446,7 +4438,7 @@
           <w14:ligatures w14:val="standardContextual"/>
         </w:rPr>
       </w:pPr>
-      <w:hyperlink w:anchor="_Toc237172755" w:history="1">
+      <w:hyperlink w:anchor="_Toc237735206" w:history="1">
         <w:r>
           <w:rPr>
             <w:rStyle w:val="aff1"/>
@@ -4473,7 +4465,7 @@
             <w:noProof/>
             <w:webHidden/>
           </w:rPr>
-          <w:instrText xml:space="preserve"> PAGEREF _Toc237172755 \h </w:instrText>
+          <w:instrText xml:space="preserve"> PAGEREF _Toc237735206 \h </w:instrText>
         </w:r>
         <w:r>
           <w:rPr>
@@ -4522,7 +4514,7 @@
           <w14:ligatures w14:val="standardContextual"/>
         </w:rPr>
       </w:pPr>
-      <w:hyperlink w:anchor="_Toc237172756" w:history="1">
+      <w:hyperlink w:anchor="_Toc237735207" w:history="1">
         <w:r>
           <w:rPr>
             <w:rStyle w:val="aff1"/>
@@ -4549,7 +4541,7 @@
             <w:noProof/>
             <w:webHidden/>
           </w:rPr>
-          <w:instrText xml:space="preserve"> PAGEREF _Toc237172756 \h </w:instrText>
+          <w:instrText xml:space="preserve"> PAGEREF _Toc237735207 \h </w:instrText>
         </w:r>
         <w:r>
           <w:rPr>
@@ -4598,7 +4590,7 @@
           <w14:ligatures w14:val="standardContextual"/>
         </w:rPr>
       </w:pPr>
-      <w:hyperlink w:anchor="_Toc237172757" w:history="1">
+      <w:hyperlink w:anchor="_Toc237735208" w:history="1">
         <w:r>
           <w:rPr>
             <w:rStyle w:val="aff1"/>
@@ -4625,7 +4617,7 @@
             <w:noProof/>
             <w:webHidden/>
           </w:rPr>
-          <w:instrText xml:space="preserve"> PAGEREF _Toc237172757 \h </w:instrText>
+          <w:instrText xml:space="preserve"> PAGEREF _Toc237735208 \h </w:instrText>
         </w:r>
         <w:r>
           <w:rPr>
@@ -4674,7 +4666,7 @@
           <w14:ligatures w14:val="standardContextual"/>
         </w:rPr>
       </w:pPr>
-      <w:hyperlink w:anchor="_Toc237172758" w:history="1">
+      <w:hyperlink w:anchor="_Toc237735209" w:history="1">
         <w:r>
           <w:rPr>
             <w:rStyle w:val="aff1"/>
@@ -4701,7 +4693,7 @@
             <w:noProof/>
             <w:webHidden/>
           </w:rPr>
-          <w:instrText xml:space="preserve"> PAGEREF _Toc237172758 \h </w:instrText>
+          <w:instrText xml:space="preserve"> PAGEREF _Toc237735209 \h </w:instrText>
         </w:r>
         <w:r>
           <w:rPr>
@@ -4750,7 +4742,7 @@
           <w14:ligatures w14:val="standardContextual"/>
         </w:rPr>
       </w:pPr>
-      <w:hyperlink w:anchor="_Toc237172759" w:history="1">
+      <w:hyperlink w:anchor="_Toc237735210" w:history="1">
         <w:r>
           <w:rPr>
             <w:rStyle w:val="aff1"/>
@@ -4777,7 +4769,7 @@
             <w:noProof/>
             <w:webHidden/>
           </w:rPr>
-          <w:instrText xml:space="preserve"> PAGEREF _Toc237172759 \h </w:instrText>
+          <w:instrText xml:space="preserve"> PAGEREF _Toc237735210 \h </w:instrText>
         </w:r>
         <w:r>
           <w:rPr>
@@ -4826,7 +4818,7 @@
           <w14:ligatures w14:val="standardContextual"/>
         </w:rPr>
       </w:pPr>
-      <w:hyperlink w:anchor="_Toc237172760" w:history="1">
+      <w:hyperlink w:anchor="_Toc237735211" w:history="1">
         <w:r>
           <w:rPr>
             <w:rStyle w:val="aff1"/>
@@ -4853,7 +4845,7 @@
             <w:noProof/>
             <w:webHidden/>
           </w:rPr>
-          <w:instrText xml:space="preserve"> PAGEREF _Toc237172760 \h </w:instrText>
+          <w:instrText xml:space="preserve"> PAGEREF _Toc237735211 \h </w:instrText>
         </w:r>
         <w:r>
           <w:rPr>
@@ -4902,7 +4894,7 @@
           <w14:ligatures w14:val="standardContextual"/>
         </w:rPr>
       </w:pPr>
-      <w:hyperlink w:anchor="_Toc237172761" w:history="1">
+      <w:hyperlink w:anchor="_Toc237735212" w:history="1">
         <w:r>
           <w:rPr>
             <w:rStyle w:val="aff1"/>
@@ -4929,7 +4921,7 @@
             <w:noProof/>
             <w:webHidden/>
           </w:rPr>
-          <w:instrText xml:space="preserve"> PAGEREF _Toc237172761 \h </w:instrText>
+          <w:instrText xml:space="preserve"> PAGEREF _Toc237735212 \h </w:instrText>
         </w:r>
         <w:r>
           <w:rPr>
@@ -4978,7 +4970,7 @@
           <w14:ligatures w14:val="standardContextual"/>
         </w:rPr>
       </w:pPr>
-      <w:hyperlink w:anchor="_Toc237172762" w:history="1">
+      <w:hyperlink w:anchor="_Toc237735213" w:history="1">
         <w:r>
           <w:rPr>
             <w:rStyle w:val="aff1"/>
@@ -5005,7 +4997,7 @@
             <w:noProof/>
             <w:webHidden/>
           </w:rPr>
-          <w:instrText xml:space="preserve"> PAGEREF _Toc237172762 \h </w:instrText>
+          <w:instrText xml:space="preserve"> PAGEREF _Toc237735213 \h </w:instrText>
         </w:r>
         <w:r>
           <w:rPr>
@@ -5054,7 +5046,7 @@
           <w14:ligatures w14:val="standardContextual"/>
         </w:rPr>
       </w:pPr>
-      <w:hyperlink w:anchor="_Toc237172763" w:history="1">
+      <w:hyperlink w:anchor="_Toc237735214" w:history="1">
         <w:r>
           <w:rPr>
             <w:rStyle w:val="aff1"/>
@@ -5081,7 +5073,7 @@
             <w:noProof/>
             <w:webHidden/>
           </w:rPr>
-          <w:instrText xml:space="preserve"> PAGEREF _Toc237172763 \h </w:instrText>
+          <w:instrText xml:space="preserve"> PAGEREF _Toc237735214 \h </w:instrText>
         </w:r>
         <w:r>
           <w:rPr>
@@ -5130,7 +5122,7 @@
           <w14:ligatures w14:val="standardContextual"/>
         </w:rPr>
       </w:pPr>
-      <w:hyperlink w:anchor="_Toc237172764" w:history="1">
+      <w:hyperlink w:anchor="_Toc237735215" w:history="1">
         <w:r>
           <w:rPr>
             <w:rStyle w:val="aff1"/>
@@ -5157,7 +5149,7 @@
             <w:noProof/>
             <w:webHidden/>
           </w:rPr>
-          <w:instrText xml:space="preserve"> PAGEREF _Toc237172764 \h </w:instrText>
+          <w:instrText xml:space="preserve"> PAGEREF _Toc237735215 \h </w:instrText>
         </w:r>
         <w:r>
           <w:rPr>
@@ -5206,7 +5198,7 @@
           <w14:ligatures w14:val="standardContextual"/>
         </w:rPr>
       </w:pPr>
-      <w:hyperlink w:anchor="_Toc237172765" w:history="1">
+      <w:hyperlink w:anchor="_Toc237735216" w:history="1">
         <w:r>
           <w:rPr>
             <w:rStyle w:val="aff1"/>
@@ -5233,7 +5225,7 @@
             <w:noProof/>
             <w:webHidden/>
           </w:rPr>
-          <w:instrText xml:space="preserve"> PAGEREF _Toc237172765 \h </w:instrText>
+          <w:instrText xml:space="preserve"> PAGEREF _Toc237735216 \h </w:instrText>
         </w:r>
         <w:r>
           <w:rPr>
@@ -5282,7 +5274,7 @@
           <w14:ligatures w14:val="standardContextual"/>
         </w:rPr>
       </w:pPr>
-      <w:hyperlink w:anchor="_Toc237172766" w:history="1">
+      <w:hyperlink w:anchor="_Toc237735217" w:history="1">
         <w:r>
           <w:rPr>
             <w:rStyle w:val="aff1"/>
@@ -5309,7 +5301,7 @@
             <w:noProof/>
             <w:webHidden/>
           </w:rPr>
-          <w:instrText xml:space="preserve"> PAGEREF _Toc237172766 \h </w:instrText>
+          <w:instrText xml:space="preserve"> PAGEREF _Toc237735217 \h </w:instrText>
         </w:r>
         <w:r>
           <w:rPr>
@@ -5358,7 +5350,7 @@
           <w14:ligatures w14:val="standardContextual"/>
         </w:rPr>
       </w:pPr>
-      <w:hyperlink w:anchor="_Toc237172767" w:history="1">
+      <w:hyperlink w:anchor="_Toc237735218" w:history="1">
         <w:r>
           <w:rPr>
             <w:rStyle w:val="aff1"/>
@@ -5385,8 +5377,7 @@
             <w:noProof/>
             <w:webHidden/>
           </w:rPr>
-          <w:lastRenderedPageBreak/>
-          <w:instrText xml:space="preserve"> PAGEREF _Toc237172767 \h </w:instrText>
+          <w:instrText xml:space="preserve"> PAGEREF _Toc237735218 \h </w:instrText>
         </w:r>
         <w:r>
           <w:rPr>
@@ -5435,7 +5426,7 @@
           <w14:ligatures w14:val="standardContextual"/>
         </w:rPr>
       </w:pPr>
-      <w:hyperlink w:anchor="_Toc237172768" w:history="1">
+      <w:hyperlink w:anchor="_Toc237735219" w:history="1">
         <w:r>
           <w:rPr>
             <w:rStyle w:val="aff1"/>
@@ -5462,7 +5453,7 @@
             <w:noProof/>
             <w:webHidden/>
           </w:rPr>
-          <w:instrText xml:space="preserve"> PAGEREF _Toc237172768 \h </w:instrText>
+          <w:instrText xml:space="preserve"> PAGEREF _Toc237735219 \h </w:instrText>
         </w:r>
         <w:r>
           <w:rPr>
@@ -5511,7 +5502,7 @@
           <w14:ligatures w14:val="standardContextual"/>
         </w:rPr>
       </w:pPr>
-      <w:hyperlink w:anchor="_Toc237172769" w:history="1">
+      <w:hyperlink w:anchor="_Toc237735220" w:history="1">
         <w:r>
           <w:rPr>
             <w:rStyle w:val="aff1"/>
@@ -5538,7 +5529,7 @@
             <w:noProof/>
             <w:webHidden/>
           </w:rPr>
-          <w:instrText xml:space="preserve"> PAGEREF _Toc237172769 \h </w:instrText>
+          <w:instrText xml:space="preserve"> PAGEREF _Toc237735220 \h </w:instrText>
         </w:r>
         <w:r>
           <w:rPr>
@@ -5586,7 +5577,7 @@
           <w14:ligatures w14:val="standardContextual"/>
         </w:rPr>
       </w:pPr>
-      <w:hyperlink w:anchor="_Toc237172770" w:history="1">
+      <w:hyperlink w:anchor="_Toc237735221" w:history="1">
         <w:r>
           <w:rPr>
             <w:rStyle w:val="aff1"/>
@@ -5613,7 +5604,7 @@
             <w:noProof/>
             <w:webHidden/>
           </w:rPr>
-          <w:instrText xml:space="preserve"> PAGEREF _Toc237172770 \h </w:instrText>
+          <w:instrText xml:space="preserve"> PAGEREF _Toc237735221 \h </w:instrText>
         </w:r>
         <w:r>
           <w:rPr>
@@ -5662,7 +5653,7 @@
           <w14:ligatures w14:val="standardContextual"/>
         </w:rPr>
       </w:pPr>
-      <w:hyperlink w:anchor="_Toc237172771" w:history="1">
+      <w:hyperlink w:anchor="_Toc237735222" w:history="1">
         <w:r>
           <w:rPr>
             <w:rStyle w:val="aff1"/>
@@ -5689,7 +5680,7 @@
             <w:noProof/>
             <w:webHidden/>
           </w:rPr>
-          <w:instrText xml:space="preserve"> PAGEREF _Toc237172771 \h </w:instrText>
+          <w:instrText xml:space="preserve"> PAGEREF _Toc237735222 \h </w:instrText>
         </w:r>
         <w:r>
           <w:rPr>
@@ -5738,7 +5729,7 @@
           <w14:ligatures w14:val="standardContextual"/>
         </w:rPr>
       </w:pPr>
-      <w:hyperlink w:anchor="_Toc237172772" w:history="1">
+      <w:hyperlink w:anchor="_Toc237735223" w:history="1">
         <w:r>
           <w:rPr>
             <w:rStyle w:val="aff1"/>
@@ -5765,7 +5756,7 @@
             <w:noProof/>
             <w:webHidden/>
           </w:rPr>
-          <w:instrText xml:space="preserve"> PAGEREF _Toc237172772 \h </w:instrText>
+          <w:instrText xml:space="preserve"> PAGEREF _Toc237735223 \h </w:instrText>
         </w:r>
         <w:r>
           <w:rPr>
@@ -5814,7 +5805,7 @@
           <w14:ligatures w14:val="standardContextual"/>
         </w:rPr>
       </w:pPr>
-      <w:hyperlink w:anchor="_Toc237172773" w:history="1">
+      <w:hyperlink w:anchor="_Toc237735224" w:history="1">
         <w:r>
           <w:rPr>
             <w:rStyle w:val="aff1"/>
@@ -5841,7 +5832,7 @@
             <w:noProof/>
             <w:webHidden/>
           </w:rPr>
-          <w:instrText xml:space="preserve"> PAGEREF _Toc237172773 \h </w:instrText>
+          <w:instrText xml:space="preserve"> PAGEREF _Toc237735224 \h </w:instrText>
         </w:r>
         <w:r>
           <w:rPr>
@@ -5890,7 +5881,7 @@
           <w14:ligatures w14:val="standardContextual"/>
         </w:rPr>
       </w:pPr>
-      <w:hyperlink w:anchor="_Toc237172774" w:history="1">
+      <w:hyperlink w:anchor="_Toc237735225" w:history="1">
         <w:r>
           <w:rPr>
             <w:rStyle w:val="aff1"/>
@@ -5917,7 +5908,7 @@
             <w:noProof/>
             <w:webHidden/>
           </w:rPr>
-          <w:instrText xml:space="preserve"> PAGEREF _Toc237172774 \h </w:instrText>
+          <w:instrText xml:space="preserve"> PAGEREF _Toc237735225 \h </w:instrText>
         </w:r>
         <w:r>
           <w:rPr>
@@ -5966,7 +5957,7 @@
           <w14:ligatures w14:val="standardContextual"/>
         </w:rPr>
       </w:pPr>
-      <w:hyperlink w:anchor="_Toc237172775" w:history="1">
+      <w:hyperlink w:anchor="_Toc237735226" w:history="1">
         <w:r>
           <w:rPr>
             <w:rStyle w:val="aff1"/>
@@ -5993,7 +5984,7 @@
             <w:noProof/>
             <w:webHidden/>
           </w:rPr>
-          <w:instrText xml:space="preserve"> PAGEREF _Toc237172775 \h </w:instrText>
+          <w:instrText xml:space="preserve"> PAGEREF _Toc237735226 \h </w:instrText>
         </w:r>
         <w:r>
           <w:rPr>
@@ -6042,7 +6033,7 @@
           <w14:ligatures w14:val="standardContextual"/>
         </w:rPr>
       </w:pPr>
-      <w:hyperlink w:anchor="_Toc237172776" w:history="1">
+      <w:hyperlink w:anchor="_Toc237735227" w:history="1">
         <w:r>
           <w:rPr>
             <w:rStyle w:val="aff1"/>
@@ -6069,7 +6060,7 @@
             <w:noProof/>
             <w:webHidden/>
           </w:rPr>
-          <w:instrText xml:space="preserve"> PAGEREF _Toc237172776 \h </w:instrText>
+          <w:instrText xml:space="preserve"> PAGEREF _Toc237735227 \h </w:instrText>
         </w:r>
         <w:r>
           <w:rPr>
@@ -6118,7 +6109,7 @@
           <w14:ligatures w14:val="standardContextual"/>
         </w:rPr>
       </w:pPr>
-      <w:hyperlink w:anchor="_Toc237172777" w:history="1">
+      <w:hyperlink w:anchor="_Toc237735228" w:history="1">
         <w:r>
           <w:rPr>
             <w:rStyle w:val="aff1"/>
@@ -6145,7 +6136,7 @@
             <w:noProof/>
             <w:webHidden/>
           </w:rPr>
-          <w:instrText xml:space="preserve"> PAGEREF _Toc237172777 \h </w:instrText>
+          <w:instrText xml:space="preserve"> PAGEREF _Toc237735228 \h </w:instrText>
         </w:r>
         <w:r>
           <w:rPr>
@@ -6194,7 +6185,7 @@
           <w14:ligatures w14:val="standardContextual"/>
         </w:rPr>
       </w:pPr>
-      <w:hyperlink w:anchor="_Toc237172778" w:history="1">
+      <w:hyperlink w:anchor="_Toc237735229" w:history="1">
         <w:r>
           <w:rPr>
             <w:rStyle w:val="aff1"/>
@@ -6221,7 +6212,7 @@
             <w:noProof/>
             <w:webHidden/>
           </w:rPr>
-          <w:instrText xml:space="preserve"> PAGEREF _Toc237172778 \h </w:instrText>
+          <w:instrText xml:space="preserve"> PAGEREF _Toc237735229 \h </w:instrText>
         </w:r>
         <w:r>
           <w:rPr>
@@ -6270,7 +6261,7 @@
           <w14:ligatures w14:val="standardContextual"/>
         </w:rPr>
       </w:pPr>
-      <w:hyperlink w:anchor="_Toc237172779" w:history="1">
+      <w:hyperlink w:anchor="_Toc237735230" w:history="1">
         <w:r>
           <w:rPr>
             <w:rStyle w:val="aff1"/>
@@ -6297,7 +6288,7 @@
             <w:noProof/>
             <w:webHidden/>
           </w:rPr>
-          <w:instrText xml:space="preserve"> PAGEREF _Toc237172779 \h </w:instrText>
+          <w:instrText xml:space="preserve"> PAGEREF _Toc237735230 \h </w:instrText>
         </w:r>
         <w:r>
           <w:rPr>
@@ -6346,7 +6337,7 @@
           <w14:ligatures w14:val="standardContextual"/>
         </w:rPr>
       </w:pPr>
-      <w:hyperlink w:anchor="_Toc237172780" w:history="1">
+      <w:hyperlink w:anchor="_Toc237735231" w:history="1">
         <w:r>
           <w:rPr>
             <w:rStyle w:val="aff1"/>
@@ -6373,7 +6364,7 @@
             <w:noProof/>
             <w:webHidden/>
           </w:rPr>
-          <w:instrText xml:space="preserve"> PAGEREF _Toc237172780 \h </w:instrText>
+          <w:instrText xml:space="preserve"> PAGEREF _Toc237735231 \h </w:instrText>
         </w:r>
         <w:r>
           <w:rPr>
@@ -6422,7 +6413,7 @@
           <w14:ligatures w14:val="standardContextual"/>
         </w:rPr>
       </w:pPr>
-      <w:hyperlink w:anchor="_Toc237172781" w:history="1">
+      <w:hyperlink w:anchor="_Toc237735232" w:history="1">
         <w:r>
           <w:rPr>
             <w:rStyle w:val="aff1"/>
@@ -6449,7 +6440,7 @@
             <w:noProof/>
             <w:webHidden/>
           </w:rPr>
-          <w:instrText xml:space="preserve"> PAGEREF _Toc237172781 \h </w:instrText>
+          <w:instrText xml:space="preserve"> PAGEREF _Toc237735232 \h </w:instrText>
         </w:r>
         <w:r>
           <w:rPr>
@@ -6498,7 +6489,7 @@
           <w14:ligatures w14:val="standardContextual"/>
         </w:rPr>
       </w:pPr>
-      <w:hyperlink w:anchor="_Toc237172782" w:history="1">
+      <w:hyperlink w:anchor="_Toc237735233" w:history="1">
         <w:r>
           <w:rPr>
             <w:rStyle w:val="aff1"/>
@@ -6525,7 +6516,7 @@
             <w:noProof/>
             <w:webHidden/>
           </w:rPr>
-          <w:instrText xml:space="preserve"> PAGEREF _Toc237172782 \h </w:instrText>
+          <w:instrText xml:space="preserve"> PAGEREF _Toc237735233 \h </w:instrText>
         </w:r>
         <w:r>
           <w:rPr>
@@ -6574,7 +6565,7 @@
           <w14:ligatures w14:val="standardContextual"/>
         </w:rPr>
       </w:pPr>
-      <w:hyperlink w:anchor="_Toc237172783" w:history="1">
+      <w:hyperlink w:anchor="_Toc237735234" w:history="1">
         <w:r>
           <w:rPr>
             <w:rStyle w:val="aff1"/>
@@ -6601,7 +6592,7 @@
             <w:noProof/>
             <w:webHidden/>
           </w:rPr>
-          <w:instrText xml:space="preserve"> PAGEREF _Toc237172783 \h </w:instrText>
+          <w:instrText xml:space="preserve"> PAGEREF _Toc237735234 \h </w:instrText>
         </w:r>
         <w:r>
           <w:rPr>
@@ -6650,7 +6641,7 @@
           <w14:ligatures w14:val="standardContextual"/>
         </w:rPr>
       </w:pPr>
-      <w:hyperlink w:anchor="_Toc237172784" w:history="1">
+      <w:hyperlink w:anchor="_Toc237735235" w:history="1">
         <w:r>
           <w:rPr>
             <w:rStyle w:val="aff1"/>
@@ -6677,7 +6668,7 @@
             <w:noProof/>
             <w:webHidden/>
           </w:rPr>
-          <w:instrText xml:space="preserve"> PAGEREF _Toc237172784 \h </w:instrText>
+          <w:instrText xml:space="preserve"> PAGEREF _Toc237735235 \h </w:instrText>
         </w:r>
         <w:r>
           <w:rPr>
@@ -6726,7 +6717,7 @@
           <w14:ligatures w14:val="standardContextual"/>
         </w:rPr>
       </w:pPr>
-      <w:hyperlink w:anchor="_Toc237172785" w:history="1">
+      <w:hyperlink w:anchor="_Toc237735236" w:history="1">
         <w:r>
           <w:rPr>
             <w:rStyle w:val="aff1"/>
@@ -6753,7 +6744,7 @@
             <w:noProof/>
             <w:webHidden/>
           </w:rPr>
-          <w:instrText xml:space="preserve"> PAGEREF _Toc237172785 \h </w:instrText>
+          <w:instrText xml:space="preserve"> PAGEREF _Toc237735236 \h </w:instrText>
         </w:r>
         <w:r>
           <w:rPr>
@@ -6802,7 +6793,7 @@
           <w14:ligatures w14:val="standardContextual"/>
         </w:rPr>
       </w:pPr>
-      <w:hyperlink w:anchor="_Toc237172786" w:history="1">
+      <w:hyperlink w:anchor="_Toc237735237" w:history="1">
         <w:r>
           <w:rPr>
             <w:rStyle w:val="aff1"/>
@@ -6829,7 +6820,7 @@
             <w:noProof/>
             <w:webHidden/>
           </w:rPr>
-          <w:instrText xml:space="preserve"> PAGEREF _Toc237172786 \h </w:instrText>
+          <w:instrText xml:space="preserve"> PAGEREF _Toc237735237 \h </w:instrText>
         </w:r>
         <w:r>
           <w:rPr>
@@ -6878,7 +6869,7 @@
           <w14:ligatures w14:val="standardContextual"/>
         </w:rPr>
       </w:pPr>
-      <w:hyperlink w:anchor="_Toc237172787" w:history="1">
+      <w:hyperlink w:anchor="_Toc237735238" w:history="1">
         <w:r>
           <w:rPr>
             <w:rStyle w:val="aff1"/>
@@ -6905,7 +6896,7 @@
             <w:noProof/>
             <w:webHidden/>
           </w:rPr>
-          <w:instrText xml:space="preserve"> PAGEREF _Toc237172787 \h </w:instrText>
+          <w:instrText xml:space="preserve"> PAGEREF _Toc237735238 \h </w:instrText>
         </w:r>
         <w:r>
           <w:rPr>
@@ -6954,7 +6945,7 @@
           <w14:ligatures w14:val="standardContextual"/>
         </w:rPr>
       </w:pPr>
-      <w:hyperlink w:anchor="_Toc237172788" w:history="1">
+      <w:hyperlink w:anchor="_Toc237735239" w:history="1">
         <w:r>
           <w:rPr>
             <w:rStyle w:val="aff1"/>
@@ -6981,7 +6972,7 @@
             <w:noProof/>
             <w:webHidden/>
           </w:rPr>
-          <w:instrText xml:space="preserve"> PAGEREF _Toc237172788 \h </w:instrText>
+          <w:instrText xml:space="preserve"> PAGEREF _Toc237735239 \h </w:instrText>
         </w:r>
         <w:r>
           <w:rPr>
@@ -7030,7 +7021,7 @@
           <w14:ligatures w14:val="standardContextual"/>
         </w:rPr>
       </w:pPr>
-      <w:hyperlink w:anchor="_Toc237172789" w:history="1">
+      <w:hyperlink w:anchor="_Toc237735240" w:history="1">
         <w:r>
           <w:rPr>
             <w:rStyle w:val="aff1"/>
@@ -7057,7 +7048,7 @@
             <w:noProof/>
             <w:webHidden/>
           </w:rPr>
-          <w:instrText xml:space="preserve"> PAGEREF _Toc237172789 \h </w:instrText>
+          <w:instrText xml:space="preserve"> PAGEREF _Toc237735240 \h </w:instrText>
         </w:r>
         <w:r>
           <w:rPr>
@@ -7106,7 +7097,7 @@
           <w14:ligatures w14:val="standardContextual"/>
         </w:rPr>
       </w:pPr>
-      <w:hyperlink w:anchor="_Toc237172790" w:history="1">
+      <w:hyperlink w:anchor="_Toc237735241" w:history="1">
         <w:r>
           <w:rPr>
             <w:rStyle w:val="aff1"/>
@@ -7133,7 +7124,7 @@
             <w:noProof/>
             <w:webHidden/>
           </w:rPr>
-          <w:instrText xml:space="preserve"> PAGEREF _Toc237172790 \h </w:instrText>
+          <w:instrText xml:space="preserve"> PAGEREF _Toc237735241 \h </w:instrText>
         </w:r>
         <w:r>
           <w:rPr>
@@ -7182,7 +7173,7 @@
           <w14:ligatures w14:val="standardContextual"/>
         </w:rPr>
       </w:pPr>
-      <w:hyperlink w:anchor="_Toc237172791" w:history="1">
+      <w:hyperlink w:anchor="_Toc237735242" w:history="1">
         <w:r>
           <w:rPr>
             <w:rStyle w:val="aff1"/>
@@ -7209,7 +7200,7 @@
             <w:noProof/>
             <w:webHidden/>
           </w:rPr>
-          <w:instrText xml:space="preserve"> PAGEREF _Toc237172791 \h </w:instrText>
+          <w:instrText xml:space="preserve"> PAGEREF _Toc237735242 \h </w:instrText>
         </w:r>
         <w:r>
           <w:rPr>
@@ -7258,7 +7249,7 @@
           <w14:ligatures w14:val="standardContextual"/>
         </w:rPr>
       </w:pPr>
-      <w:hyperlink w:anchor="_Toc237172792" w:history="1">
+      <w:hyperlink w:anchor="_Toc237735243" w:history="1">
         <w:r>
           <w:rPr>
             <w:rStyle w:val="aff1"/>
@@ -7285,7 +7276,7 @@
             <w:noProof/>
             <w:webHidden/>
           </w:rPr>
-          <w:instrText xml:space="preserve"> PAGEREF _Toc237172792 \h </w:instrText>
+          <w:instrText xml:space="preserve"> PAGEREF _Toc237735243 \h </w:instrText>
         </w:r>
         <w:r>
           <w:rPr>
@@ -7334,7 +7325,7 @@
           <w14:ligatures w14:val="standardContextual"/>
         </w:rPr>
       </w:pPr>
-      <w:hyperlink w:anchor="_Toc237172793" w:history="1">
+      <w:hyperlink w:anchor="_Toc237735244" w:history="1">
         <w:r>
           <w:rPr>
             <w:rStyle w:val="aff1"/>
@@ -7361,7 +7352,7 @@
             <w:noProof/>
             <w:webHidden/>
           </w:rPr>
-          <w:instrText xml:space="preserve"> PAGEREF _Toc237172793 \h </w:instrText>
+          <w:instrText xml:space="preserve"> PAGEREF _Toc237735244 \h </w:instrText>
         </w:r>
         <w:r>
           <w:rPr>
@@ -7410,7 +7401,7 @@
           <w14:ligatures w14:val="standardContextual"/>
         </w:rPr>
       </w:pPr>
-      <w:hyperlink w:anchor="_Toc237172794" w:history="1">
+      <w:hyperlink w:anchor="_Toc237735245" w:history="1">
         <w:r>
           <w:rPr>
             <w:rStyle w:val="aff1"/>
@@ -7437,7 +7428,7 @@
             <w:noProof/>
             <w:webHidden/>
           </w:rPr>
-          <w:instrText xml:space="preserve"> PAGEREF _Toc237172794 \h </w:instrText>
+          <w:instrText xml:space="preserve"> PAGEREF _Toc237735245 \h </w:instrText>
         </w:r>
         <w:r>
           <w:rPr>
@@ -7486,7 +7477,7 @@
           <w14:ligatures w14:val="standardContextual"/>
         </w:rPr>
       </w:pPr>
-      <w:hyperlink w:anchor="_Toc237172795" w:history="1">
+      <w:hyperlink w:anchor="_Toc237735246" w:history="1">
         <w:r>
           <w:rPr>
             <w:rStyle w:val="aff1"/>
@@ -7513,7 +7504,7 @@
             <w:noProof/>
             <w:webHidden/>
           </w:rPr>
-          <w:instrText xml:space="preserve"> PAGEREF _Toc237172795 \h </w:instrText>
+          <w:instrText xml:space="preserve"> PAGEREF _Toc237735246 \h </w:instrText>
         </w:r>
         <w:r>
           <w:rPr>
@@ -7562,7 +7553,7 @@
           <w14:ligatures w14:val="standardContextual"/>
         </w:rPr>
       </w:pPr>
-      <w:hyperlink w:anchor="_Toc237172796" w:history="1">
+      <w:hyperlink w:anchor="_Toc237735247" w:history="1">
         <w:r>
           <w:rPr>
             <w:rStyle w:val="aff1"/>
@@ -7589,7 +7580,7 @@
             <w:noProof/>
             <w:webHidden/>
           </w:rPr>
-          <w:instrText xml:space="preserve"> PAGEREF _Toc237172796 \h </w:instrText>
+          <w:instrText xml:space="preserve"> PAGEREF _Toc237735247 \h </w:instrText>
         </w:r>
         <w:r>
           <w:rPr>
@@ -7638,7 +7629,7 @@
           <w14:ligatures w14:val="standardContextual"/>
         </w:rPr>
       </w:pPr>
-      <w:hyperlink w:anchor="_Toc237172797" w:history="1">
+      <w:hyperlink w:anchor="_Toc237735248" w:history="1">
         <w:r>
           <w:rPr>
             <w:rStyle w:val="aff1"/>
@@ -7665,7 +7656,7 @@
             <w:noProof/>
             <w:webHidden/>
           </w:rPr>
-          <w:instrText xml:space="preserve"> PAGEREF _Toc237172797 \h </w:instrText>
+          <w:instrText xml:space="preserve"> PAGEREF _Toc237735248 \h </w:instrText>
         </w:r>
         <w:r>
           <w:rPr>
@@ -7714,7 +7705,7 @@
           <w14:ligatures w14:val="standardContextual"/>
         </w:rPr>
       </w:pPr>
-      <w:hyperlink w:anchor="_Toc237172798" w:history="1">
+      <w:hyperlink w:anchor="_Toc237735249" w:history="1">
         <w:r>
           <w:rPr>
             <w:rStyle w:val="aff1"/>
@@ -7741,7 +7732,7 @@
             <w:noProof/>
             <w:webHidden/>
           </w:rPr>
-          <w:instrText xml:space="preserve"> PAGEREF _Toc237172798 \h </w:instrText>
+          <w:instrText xml:space="preserve"> PAGEREF _Toc237735249 \h </w:instrText>
         </w:r>
         <w:r>
           <w:rPr>
@@ -7790,7 +7781,7 @@
           <w14:ligatures w14:val="standardContextual"/>
         </w:rPr>
       </w:pPr>
-      <w:hyperlink w:anchor="_Toc237172799" w:history="1">
+      <w:hyperlink w:anchor="_Toc237735250" w:history="1">
         <w:r>
           <w:rPr>
             <w:rStyle w:val="aff1"/>
@@ -7817,7 +7808,7 @@
             <w:noProof/>
             <w:webHidden/>
           </w:rPr>
-          <w:instrText xml:space="preserve"> PAGEREF _Toc237172799 \h </w:instrText>
+          <w:instrText xml:space="preserve"> PAGEREF _Toc237735250 \h </w:instrText>
         </w:r>
         <w:r>
           <w:rPr>
@@ -7866,7 +7857,7 @@
           <w14:ligatures w14:val="standardContextual"/>
         </w:rPr>
       </w:pPr>
-      <w:hyperlink w:anchor="_Toc237172800" w:history="1">
+      <w:hyperlink w:anchor="_Toc237735251" w:history="1">
         <w:r>
           <w:rPr>
             <w:rStyle w:val="aff1"/>
@@ -7893,7 +7884,7 @@
             <w:noProof/>
             <w:webHidden/>
           </w:rPr>
-          <w:instrText xml:space="preserve"> PAGEREF _Toc237172800 \h </w:instrText>
+          <w:instrText xml:space="preserve"> PAGEREF _Toc237735251 \h </w:instrText>
         </w:r>
         <w:r>
           <w:rPr>
@@ -7942,7 +7933,7 @@
           <w14:ligatures w14:val="standardContextual"/>
         </w:rPr>
       </w:pPr>
-      <w:hyperlink w:anchor="_Toc237172801" w:history="1">
+      <w:hyperlink w:anchor="_Toc237735252" w:history="1">
         <w:r>
           <w:rPr>
             <w:rStyle w:val="aff1"/>
@@ -7969,7 +7960,7 @@
             <w:noProof/>
             <w:webHidden/>
           </w:rPr>
-          <w:instrText xml:space="preserve"> PAGEREF _Toc237172801 \h </w:instrText>
+          <w:instrText xml:space="preserve"> PAGEREF _Toc237735252 \h </w:instrText>
         </w:r>
         <w:r>
           <w:rPr>
@@ -8018,7 +8009,7 @@
           <w14:ligatures w14:val="standardContextual"/>
         </w:rPr>
       </w:pPr>
-      <w:hyperlink w:anchor="_Toc237172802" w:history="1">
+      <w:hyperlink w:anchor="_Toc237735253" w:history="1">
         <w:r>
           <w:rPr>
             <w:rStyle w:val="aff1"/>
@@ -8045,7 +8036,7 @@
             <w:noProof/>
             <w:webHidden/>
           </w:rPr>
-          <w:instrText xml:space="preserve"> PAGEREF _Toc237172802 \h </w:instrText>
+          <w:instrText xml:space="preserve"> PAGEREF _Toc237735253 \h </w:instrText>
         </w:r>
         <w:r>
           <w:rPr>
@@ -8094,7 +8085,7 @@
           <w14:ligatures w14:val="standardContextual"/>
         </w:rPr>
       </w:pPr>
-      <w:hyperlink w:anchor="_Toc237172803" w:history="1">
+      <w:hyperlink w:anchor="_Toc237735254" w:history="1">
         <w:r>
           <w:rPr>
             <w:rStyle w:val="aff1"/>
@@ -8121,7 +8112,7 @@
             <w:noProof/>
             <w:webHidden/>
           </w:rPr>
-          <w:instrText xml:space="preserve"> PAGEREF _Toc237172803 \h </w:instrText>
+          <w:instrText xml:space="preserve"> PAGEREF _Toc237735254 \h </w:instrText>
         </w:r>
         <w:r>
           <w:rPr>
@@ -8170,7 +8161,7 @@
           <w14:ligatures w14:val="standardContextual"/>
         </w:rPr>
       </w:pPr>
-      <w:hyperlink w:anchor="_Toc237172804" w:history="1">
+      <w:hyperlink w:anchor="_Toc237735255" w:history="1">
         <w:r>
           <w:rPr>
             <w:rStyle w:val="aff1"/>
@@ -8197,7 +8188,7 @@
             <w:noProof/>
             <w:webHidden/>
           </w:rPr>
-          <w:instrText xml:space="preserve"> PAGEREF _Toc237172804 \h </w:instrText>
+          <w:instrText xml:space="preserve"> PAGEREF _Toc237735255 \h </w:instrText>
         </w:r>
         <w:r>
           <w:rPr>
@@ -8246,7 +8237,7 @@
           <w14:ligatures w14:val="standardContextual"/>
         </w:rPr>
       </w:pPr>
-      <w:hyperlink w:anchor="_Toc237172805" w:history="1">
+      <w:hyperlink w:anchor="_Toc237735256" w:history="1">
         <w:r>
           <w:rPr>
             <w:rStyle w:val="aff1"/>
@@ -8273,7 +8264,7 @@
             <w:noProof/>
             <w:webHidden/>
           </w:rPr>
-          <w:instrText xml:space="preserve"> PAGEREF _Toc237172805 \h </w:instrText>
+          <w:instrText xml:space="preserve"> PAGEREF _Toc237735256 \h </w:instrText>
         </w:r>
         <w:r>
           <w:rPr>
@@ -8321,7 +8312,7 @@
           <w14:ligatures w14:val="standardContextual"/>
         </w:rPr>
       </w:pPr>
-      <w:hyperlink w:anchor="_Toc237172806" w:history="1">
+      <w:hyperlink w:anchor="_Toc237735257" w:history="1">
         <w:r>
           <w:rPr>
             <w:rStyle w:val="aff1"/>
@@ -8348,7 +8339,7 @@
             <w:noProof/>
             <w:webHidden/>
           </w:rPr>
-          <w:instrText xml:space="preserve"> PAGEREF _Toc237172806 \h </w:instrText>
+          <w:instrText xml:space="preserve"> PAGEREF _Toc237735257 \h </w:instrText>
         </w:r>
         <w:r>
           <w:rPr>
@@ -8408,7 +8399,7 @@
           <w:numId w:val="10"/>
         </w:numPr>
       </w:pPr>
-      <w:bookmarkStart w:id="0" w:name="_Toc237172704"/>
+      <w:bookmarkStart w:id="0" w:name="_Toc237735155"/>
       <w:r>
         <w:lastRenderedPageBreak/>
         <w:t>기술</w:t>
@@ -8441,7 +8432,7 @@
           <w:numId w:val="10"/>
         </w:numPr>
       </w:pPr>
-      <w:bookmarkStart w:id="1" w:name="_Toc237172705"/>
+      <w:bookmarkStart w:id="1" w:name="_Toc237735156"/>
       <w:r>
         <w:t>Network Authority / Data</w:t>
       </w:r>
@@ -8455,7 +8446,7 @@
           <w:numId w:val="10"/>
         </w:numPr>
       </w:pPr>
-      <w:bookmarkStart w:id="2" w:name="_Toc237172706"/>
+      <w:bookmarkStart w:id="2" w:name="_Toc237735157"/>
       <w:r>
         <w:t>Authority Flow</w:t>
       </w:r>
@@ -8514,7 +8505,7 @@
           <w:numId w:val="10"/>
         </w:numPr>
       </w:pPr>
-      <w:bookmarkStart w:id="3" w:name="_Toc237172707"/>
+      <w:bookmarkStart w:id="3" w:name="_Toc237735158"/>
       <w:r>
         <w:t>Client Cannot Commit</w:t>
       </w:r>
@@ -8600,7 +8591,7 @@
           <w:numId w:val="10"/>
         </w:numPr>
       </w:pPr>
-      <w:bookmarkStart w:id="4" w:name="_Toc237172708"/>
+      <w:bookmarkStart w:id="4" w:name="_Toc237735159"/>
       <w:r>
         <w:t>Data Tables</w:t>
       </w:r>
@@ -9013,7 +9004,7 @@
           <w:numId w:val="10"/>
         </w:numPr>
       </w:pPr>
-      <w:bookmarkStart w:id="5" w:name="_Toc237172709"/>
+      <w:bookmarkStart w:id="5" w:name="_Toc237735160"/>
       <w:r>
         <w:t>W1~W3 Implementation Baseline</w:t>
       </w:r>
@@ -9027,7 +9018,7 @@
           <w:numId w:val="10"/>
         </w:numPr>
       </w:pPr>
-      <w:bookmarkStart w:id="6" w:name="_Toc237172710"/>
+      <w:bookmarkStart w:id="6" w:name="_Toc237735161"/>
       <w:r>
         <w:t>W1 — Core Multiplayer / Inventory</w:t>
       </w:r>
@@ -9323,7 +9314,7 @@
           <w:numId w:val="10"/>
         </w:numPr>
       </w:pPr>
-      <w:bookmarkStart w:id="7" w:name="_Toc237172711"/>
+      <w:bookmarkStart w:id="7" w:name="_Toc237735162"/>
       <w:r>
         <w:t>W2 — Blueprint / UI / Guard Shell</w:t>
       </w:r>
@@ -9660,7 +9651,7 @@
               <w:rPr>
                 <w:sz w:val="16"/>
               </w:rPr>
-              <w:t>Gap Tracker / Rare Loot / Winner UI</w:t>
+              <w:t>Gap Tracker / Winner / Rare Loot 경쟁 UI</w:t>
             </w:r>
           </w:p>
         </w:tc>
@@ -9677,7 +9668,7 @@
               <w:rPr>
                 <w:sz w:val="16"/>
               </w:rPr>
-              <w:t>Legacy 또는 Repurpose</w:t>
+              <w:t>제거. Optional Rare Artifact가 승인되면 기존 타이머·방향 마커·Widget을 재사용하지 않고 현재 계약으로 재설계</w:t>
             </w:r>
           </w:p>
         </w:tc>
@@ -9696,7 +9687,7 @@
           <w:numId w:val="10"/>
         </w:numPr>
       </w:pPr>
-      <w:bookmarkStart w:id="8" w:name="_Toc237172712"/>
+      <w:bookmarkStart w:id="8" w:name="_Toc237735163"/>
       <w:r>
         <w:t>W3 Start Rule</w:t>
       </w:r>
@@ -9760,7 +9751,7 @@
           <w:numId w:val="10"/>
         </w:numPr>
       </w:pPr>
-      <w:bookmarkStart w:id="9" w:name="_Toc237172713"/>
+      <w:bookmarkStart w:id="9" w:name="_Toc237735164"/>
       <w:r>
         <w:t>Risk / Cut Rules</w:t>
       </w:r>
@@ -10133,7 +10124,7 @@
           <w:numId w:val="10"/>
         </w:numPr>
       </w:pPr>
-      <w:bookmarkStart w:id="10" w:name="_Toc237172714"/>
+      <w:bookmarkStart w:id="10" w:name="_Toc237735165"/>
       <w:r>
         <w:lastRenderedPageBreak/>
         <w:t>Automatic Cut Order</w:t>
@@ -10263,7 +10254,7 @@
           <w:numId w:val="10"/>
         </w:numPr>
       </w:pPr>
-      <w:bookmarkStart w:id="11" w:name="_Toc237172715"/>
+      <w:bookmarkStart w:id="11" w:name="_Toc237735166"/>
       <w:r>
         <w:lastRenderedPageBreak/>
         <w:t>런타임</w:t>
@@ -10284,7 +10275,7 @@
           <w:numId w:val="10"/>
         </w:numPr>
       </w:pPr>
-      <w:bookmarkStart w:id="12" w:name="_Toc237172716"/>
+      <w:bookmarkStart w:id="12" w:name="_Toc237735167"/>
       <w:r>
         <w:t>구현</w:t>
       </w:r>
@@ -10310,7 +10301,7 @@
           <w:numId w:val="10"/>
         </w:numPr>
       </w:pPr>
-      <w:bookmarkStart w:id="13" w:name="_Toc237172717"/>
+      <w:bookmarkStart w:id="13" w:name="_Toc237735168"/>
       <w:r>
         <w:t>재사용</w:t>
       </w:r>
@@ -10905,7 +10896,7 @@
           <w:numId w:val="10"/>
         </w:numPr>
       </w:pPr>
-      <w:bookmarkStart w:id="14" w:name="_Toc237172718"/>
+      <w:bookmarkStart w:id="14" w:name="_Toc237735169"/>
       <w:r>
         <w:t xml:space="preserve">Legacy </w:t>
       </w:r>
@@ -11341,7 +11332,7 @@
               <w:rPr>
                 <w:sz w:val="16"/>
               </w:rPr>
-              <w:t>Deferred</w:t>
+              <w:t>Remove</w:t>
             </w:r>
           </w:p>
         </w:tc>
@@ -11358,7 +11349,7 @@
               <w:rPr>
                 <w:sz w:val="16"/>
               </w:rPr>
-              <w:t>Optional Objective로 재설계 전까지 비활성</w:t>
+              <w:t>v1.0 Runtime State·Timer·방향 Marker·Widget을 제거한다. Optional Rare Artifact는 Stretch 승인 후 새 계약으로 재설계한다.</w:t>
             </w:r>
           </w:p>
         </w:tc>
@@ -11434,7 +11425,7 @@
           <w:numId w:val="10"/>
         </w:numPr>
       </w:pPr>
-      <w:bookmarkStart w:id="15" w:name="_Toc237172719"/>
+      <w:bookmarkStart w:id="15" w:name="_Toc237735170"/>
       <w:r>
         <w:lastRenderedPageBreak/>
         <w:t>캐릭터</w:t>
@@ -11473,7 +11464,7 @@
           <w:numId w:val="10"/>
         </w:numPr>
       </w:pPr>
-      <w:bookmarkStart w:id="16" w:name="_Toc237172720"/>
+      <w:bookmarkStart w:id="16" w:name="_Toc237735171"/>
       <w:r>
         <w:t>기본</w:t>
       </w:r>
@@ -12158,7 +12149,7 @@
           <w:numId w:val="10"/>
         </w:numPr>
       </w:pPr>
-      <w:bookmarkStart w:id="17" w:name="_Toc237172721"/>
+      <w:bookmarkStart w:id="17" w:name="_Toc237735172"/>
       <w:r>
         <w:t>1</w:t>
       </w:r>
@@ -12235,7 +12226,7 @@
           <w:numId w:val="10"/>
         </w:numPr>
       </w:pPr>
-      <w:bookmarkStart w:id="18" w:name="_Toc237172722"/>
+      <w:bookmarkStart w:id="18" w:name="_Toc237735173"/>
       <w:r>
         <w:t>커스터마이징</w:t>
       </w:r>
@@ -13487,7 +13478,7 @@
           <w:numId w:val="10"/>
         </w:numPr>
       </w:pPr>
-      <w:bookmarkStart w:id="19" w:name="_Toc237172723"/>
+      <w:bookmarkStart w:id="19" w:name="_Toc237735174"/>
       <w:r>
         <w:t xml:space="preserve">Grid Inventory, Loose Loot </w:t>
       </w:r>
@@ -13510,7 +13501,7 @@
           <w:numId w:val="10"/>
         </w:numPr>
       </w:pPr>
-      <w:bookmarkStart w:id="20" w:name="_Toc237172724"/>
+      <w:bookmarkStart w:id="20" w:name="_Toc237735175"/>
       <w:r>
         <w:t xml:space="preserve">Grid Inventory </w:t>
       </w:r>
@@ -13593,7 +13584,7 @@
           <w:numId w:val="10"/>
         </w:numPr>
       </w:pPr>
-      <w:bookmarkStart w:id="21" w:name="_Toc237172725"/>
+      <w:bookmarkStart w:id="21" w:name="_Toc237735176"/>
       <w:r>
         <w:t xml:space="preserve">Loose Loot </w:t>
       </w:r>
@@ -14459,7 +14450,7 @@
           <w:numId w:val="10"/>
         </w:numPr>
       </w:pPr>
-      <w:bookmarkStart w:id="22" w:name="_Toc237172726"/>
+      <w:bookmarkStart w:id="22" w:name="_Toc237735177"/>
       <w:r>
         <w:t>무게</w:t>
       </w:r>
@@ -14534,7 +14525,7 @@
           <w:numId w:val="10"/>
         </w:numPr>
       </w:pPr>
-      <w:bookmarkStart w:id="23" w:name="_Toc237172727"/>
+      <w:bookmarkStart w:id="23" w:name="_Toc237735178"/>
       <w:r>
         <w:t>QuickSlot</w:t>
       </w:r>
@@ -14793,7 +14784,7 @@
           <w:numId w:val="10"/>
         </w:numPr>
       </w:pPr>
-      <w:bookmarkStart w:id="24" w:name="_Toc237172728"/>
+      <w:bookmarkStart w:id="24" w:name="_Toc237735179"/>
       <w:r>
         <w:t xml:space="preserve">First-Person </w:t>
       </w:r>
@@ -14831,7 +14822,7 @@
           <w:numId w:val="10"/>
         </w:numPr>
       </w:pPr>
-      <w:bookmarkStart w:id="25" w:name="_Toc237172729"/>
+      <w:bookmarkStart w:id="25" w:name="_Toc237735180"/>
       <w:r>
         <w:t>손전등</w:t>
       </w:r>
@@ -15238,7 +15229,7 @@
           <w:numId w:val="10"/>
         </w:numPr>
       </w:pPr>
-      <w:bookmarkStart w:id="26" w:name="_Toc237172730"/>
+      <w:bookmarkStart w:id="26" w:name="_Toc237735181"/>
       <w:r>
         <w:t>Noise Level</w:t>
       </w:r>
@@ -15807,7 +15798,7 @@
           <w:numId w:val="10"/>
         </w:numPr>
       </w:pPr>
-      <w:bookmarkStart w:id="27" w:name="_Toc237172731"/>
+      <w:bookmarkStart w:id="27" w:name="_Toc237735182"/>
       <w:r>
         <w:t xml:space="preserve">Guard SoundPing </w:t>
       </w:r>
@@ -16091,7 +16082,7 @@
           <w:numId w:val="10"/>
         </w:numPr>
       </w:pPr>
-      <w:bookmarkStart w:id="28" w:name="_Toc237172732"/>
+      <w:bookmarkStart w:id="28" w:name="_Toc237735183"/>
       <w:r>
         <w:lastRenderedPageBreak/>
         <w:t xml:space="preserve">Guard PvE AI </w:t>
@@ -16109,7 +16100,7 @@
           <w:numId w:val="10"/>
         </w:numPr>
       </w:pPr>
-      <w:bookmarkStart w:id="29" w:name="_Toc237172733"/>
+      <w:bookmarkStart w:id="29" w:name="_Toc237735184"/>
       <w:r>
         <w:t>기본</w:t>
       </w:r>
@@ -16644,7 +16635,7 @@
           <w:numId w:val="10"/>
         </w:numPr>
       </w:pPr>
-      <w:bookmarkStart w:id="30" w:name="_Toc237172734"/>
+      <w:bookmarkStart w:id="30" w:name="_Toc237735185"/>
       <w:r>
         <w:t>상태</w:t>
       </w:r>
@@ -17316,7 +17307,7 @@
           <w:numId w:val="10"/>
         </w:numPr>
       </w:pPr>
-      <w:bookmarkStart w:id="31" w:name="_Toc237172735"/>
+      <w:bookmarkStart w:id="31" w:name="_Toc237735186"/>
       <w:r>
         <w:t>InspectExhibit</w:t>
       </w:r>
@@ -17378,7 +17369,7 @@
           <w:numId w:val="10"/>
         </w:numPr>
       </w:pPr>
-      <w:bookmarkStart w:id="32" w:name="_Toc237172736"/>
+      <w:bookmarkStart w:id="32" w:name="_Toc237735187"/>
       <w:r>
         <w:lastRenderedPageBreak/>
         <w:t>Arrest</w:t>
@@ -17413,7 +17404,7 @@
           <w:numId w:val="10"/>
         </w:numPr>
       </w:pPr>
-      <w:bookmarkStart w:id="33" w:name="_Toc237172737"/>
+      <w:bookmarkStart w:id="33" w:name="_Toc237735188"/>
       <w:r>
         <w:t xml:space="preserve">Target Artifact, Exhibit Case Isolation </w:t>
       </w:r>
@@ -17436,7 +17427,7 @@
           <w:numId w:val="10"/>
         </w:numPr>
       </w:pPr>
-      <w:bookmarkStart w:id="34" w:name="_Toc237172738"/>
+      <w:bookmarkStart w:id="34" w:name="_Toc237735189"/>
       <w:r>
         <w:t xml:space="preserve">Artifact / Exhibit Case </w:t>
       </w:r>
@@ -17841,7 +17832,7 @@
           <w:numId w:val="10"/>
         </w:numPr>
       </w:pPr>
-      <w:bookmarkStart w:id="35" w:name="_Toc237172739"/>
+      <w:bookmarkStart w:id="35" w:name="_Toc237735190"/>
       <w:r>
         <w:t xml:space="preserve">Painting Display Case </w:t>
       </w:r>
@@ -17892,7 +17883,7 @@
           </w:tcPr>
           <w:p>
             <w:r>
-              <w:t>State Flow / Secured → Observed → ForgeryInProgress → ReplicaReady; ReplicaReady --R→ ForgeryInProgress; ReplicaReady --E atomic→ ReplicaPlaced → OriginalAvailable → OriginalRemoved; 이후 Inspecting → Completed | Suspected → Alarmed</w:t>
+              <w:t>State Flow / Secured → Observed → ForgeryInProgress → ReplicaReady; ReplicaReady --R→ ForgeryInProgress; ReplicaReady --E atomic→ ReplicaPlaced → OriginalAvailable → OriginalRemoved; 이후 Inspecting → Completed</w:t>
             </w:r>
           </w:p>
         </w:tc>
@@ -18487,7 +18478,7 @@
           <w:numId w:val="10"/>
         </w:numPr>
       </w:pPr>
-      <w:bookmarkStart w:id="36" w:name="_Toc237172740"/>
+      <w:bookmarkStart w:id="36" w:name="_Toc237735191"/>
       <w:r>
         <w:t>Observation / Full-Screen Mode</w:t>
       </w:r>
@@ -18561,7 +18552,7 @@
           <w:numId w:val="10"/>
         </w:numPr>
       </w:pPr>
-      <w:bookmarkStart w:id="37" w:name="_Toc237172741"/>
+      <w:bookmarkStart w:id="37" w:name="_Toc237735192"/>
       <w:r>
         <w:t>Replica Review / Atomic Swap</w:t>
       </w:r>
@@ -18639,7 +18630,7 @@
           <w:numId w:val="10"/>
         </w:numPr>
       </w:pPr>
-      <w:bookmarkStart w:id="38" w:name="_Toc237172742"/>
+      <w:bookmarkStart w:id="38" w:name="_Toc237735193"/>
       <w:r>
         <w:t xml:space="preserve">Stroke </w:t>
       </w:r>
@@ -18705,11 +18696,8 @@
         </w:numPr>
       </w:pPr>
       <w:r>
-        <w:t xml:space="preserve">Client는 Submit 시 16-bit X/Y Pair로 Packing한 Stroke Point, Stroke별 Point Count, PaletteIndex와 BrushPresetIndex만 RPC로 전달하며 최종 Score를 보내지 않는다. 서버는 Packed </w:t>
-      </w:r>
-      <w:r>
         <w:lastRenderedPageBreak/>
-        <w:t>Point를 정규화 FVector2D로 복원해 범위, 배열 구성, Point Budget, Payload Size와 Session Revision을 검증한다. 서버가 만든 256×256 Replica Palette Raster는 FHeistReplicaPaintingData 전용 NetSerialize가 Palette와 4-bit Packed Index Buffer를 연속 바이트로 직렬화한다. Packed Buffer는 32,768 bytes이며 일반 반영형 배열 요소 직렬화로 64KB Actor Bunch 제한을 초과하지 않는다.</w:t>
+        <w:t>Client는 Submit 시 16-bit X/Y Pair로 Packing한 Stroke Point, Stroke별 Point Count, PaletteIndex와 BrushPresetIndex만 RPC로 전달하며 최종 Score를 보내지 않는다. 서버는 Packed Point를 정규화 FVector2D로 복원해 범위, 배열 구성, Point Budget, Payload Size와 Session Revision을 검증한다. 서버가 만든 256×256 Replica Palette Raster는 FHeistReplicaPaintingData 전용 NetSerialize가 Palette와 4-bit Packed Index Buffer를 연속 바이트로 직렬화한다. Packed Buffer는 32,768 bytes이며 일반 반영형 배열 요소 직렬화로 64KB Actor Bunch 제한을 초과하지 않는다.</w:t>
       </w:r>
     </w:p>
     <w:p>
@@ -18720,7 +18708,7 @@
           <w:numId w:val="10"/>
         </w:numPr>
       </w:pPr>
-      <w:bookmarkStart w:id="39" w:name="_Toc237172743"/>
+      <w:bookmarkStart w:id="39" w:name="_Toc237735194"/>
       <w:r>
         <w:t>Forgery Score And Replica Acceptance</w:t>
       </w:r>
@@ -19000,7 +18988,7 @@
           <w:numId w:val="10"/>
         </w:numPr>
       </w:pPr>
-      <w:bookmarkStart w:id="40" w:name="_Toc237172744"/>
+      <w:bookmarkStart w:id="40" w:name="_Toc237735195"/>
       <w:r>
         <w:t xml:space="preserve">Template </w:t>
       </w:r>
@@ -19500,7 +19488,7 @@
               <w:rPr>
                 <w:sz w:val="16"/>
               </w:rPr>
-              <w:t>TimeoutPenalty</w:t>
+              <w:t>BackgroundFilterMode</w:t>
             </w:r>
           </w:p>
         </w:tc>
@@ -19510,8 +19498,14 @@
             <w:vAlign w:val="center"/>
           </w:tcPr>
           <w:p>
-            <w:r>
-              <w:t>호환 필드. Timeout은 Score를 계산하지 않으므로 런타임 제출 경로에서 적용하지 않음</w:t>
+            <w:pPr>
+              <w:pStyle w:val="TableText"/>
+            </w:pPr>
+            <w:r>
+              <w:rPr>
+                <w:sz w:val="16"/>
+              </w:rPr>
+              <w:t>None / Black / White</w:t>
             </w:r>
           </w:p>
         </w:tc>
@@ -19534,7 +19528,7 @@
               <w:rPr>
                 <w:sz w:val="16"/>
               </w:rPr>
-              <w:t>BackgroundFilterMode</w:t>
+              <w:t>BackgroundColorTolerance</w:t>
             </w:r>
           </w:p>
         </w:tc>
@@ -19551,7 +19545,7 @@
               <w:rPr>
                 <w:sz w:val="16"/>
               </w:rPr>
-              <w:t>None / Black / White</w:t>
+              <w:t>Black/White 배경 제외 허용 오차</w:t>
             </w:r>
           </w:p>
         </w:tc>
@@ -19575,7 +19569,7 @@
                 <w:sz w:val="16"/>
               </w:rPr>
               <w:lastRenderedPageBreak/>
-              <w:t>BackgroundColorTolerance</w:t>
+              <w:t>AllowedPalette</w:t>
             </w:r>
           </w:p>
         </w:tc>
@@ -19592,7 +19586,7 @@
               <w:rPr>
                 <w:sz w:val="16"/>
               </w:rPr>
-              <w:t>Black/White 배경 제외 허용 오차</w:t>
+              <w:t>플레이어 선택 가능 2~8색</w:t>
             </w:r>
           </w:p>
         </w:tc>
@@ -19615,7 +19609,7 @@
               <w:rPr>
                 <w:sz w:val="16"/>
               </w:rPr>
-              <w:t>AllowedPalette</w:t>
+              <w:t>ShapeAccuracyWeight</w:t>
             </w:r>
           </w:p>
         </w:tc>
@@ -19632,7 +19626,7 @@
               <w:rPr>
                 <w:sz w:val="16"/>
               </w:rPr>
-              <w:t>플레이어 선택 가능 2~8색</w:t>
+              <w:t>OpenCV 양방향 Distance Shape 가중치</w:t>
             </w:r>
           </w:p>
         </w:tc>
@@ -19655,7 +19649,7 @@
               <w:rPr>
                 <w:sz w:val="16"/>
               </w:rPr>
-              <w:t>ShapeAccuracyWeight</w:t>
+              <w:t>ColorAccuracyWeight</w:t>
             </w:r>
           </w:p>
         </w:tc>
@@ -19672,7 +19666,7 @@
               <w:rPr>
                 <w:sz w:val="16"/>
               </w:rPr>
-              <w:t>OpenCV 양방향 Distance Shape 가중치</w:t>
+              <w:t>Lab SSIM + Palette Histogram 가중치</w:t>
             </w:r>
           </w:p>
         </w:tc>
@@ -19695,7 +19689,7 @@
               <w:rPr>
                 <w:sz w:val="16"/>
               </w:rPr>
-              <w:t>ColorAccuracyWeight</w:t>
+              <w:t>MaximumPaintToReferenceRatio</w:t>
             </w:r>
           </w:p>
         </w:tc>
@@ -19712,7 +19706,7 @@
               <w:rPr>
                 <w:sz w:val="16"/>
               </w:rPr>
-              <w:t>Lab SSIM + Palette Histogram 가중치</w:t>
+              <w:t>Anti-Fill 판정 기준</w:t>
             </w:r>
           </w:p>
         </w:tc>
@@ -19735,7 +19729,7 @@
               <w:rPr>
                 <w:sz w:val="16"/>
               </w:rPr>
-              <w:t>MaximumPaintToReferenceRatio</w:t>
+              <w:t>OverpaintScoreCap</w:t>
             </w:r>
           </w:p>
         </w:tc>
@@ -19752,7 +19746,7 @@
               <w:rPr>
                 <w:sz w:val="16"/>
               </w:rPr>
-              <w:t>Anti-Fill 판정 기준</w:t>
+              <w:t>과잉 칠하기 최대 점수</w:t>
             </w:r>
           </w:p>
         </w:tc>
@@ -19775,7 +19769,7 @@
               <w:rPr>
                 <w:sz w:val="16"/>
               </w:rPr>
-              <w:t>OverpaintScoreCap</w:t>
+              <w:t>SourceLicense</w:t>
             </w:r>
           </w:p>
         </w:tc>
@@ -19792,7 +19786,7 @@
               <w:rPr>
                 <w:sz w:val="16"/>
               </w:rPr>
-              <w:t>과잉 칠하기 최대 점수</w:t>
+              <w:t>Public Domain / 직접 제작 / 상업 라이선스와 증빙</w:t>
             </w:r>
           </w:p>
         </w:tc>
@@ -19815,7 +19809,7 @@
               <w:rPr>
                 <w:sz w:val="16"/>
               </w:rPr>
-              <w:t>SourceLicense</w:t>
+              <w:t>SimplificationNotes</w:t>
             </w:r>
           </w:p>
         </w:tc>
@@ -19832,7 +19826,7 @@
               <w:rPr>
                 <w:sz w:val="16"/>
               </w:rPr>
-              <w:t>Public Domain / 직접 제작 / 상업 라이선스와 증빙</w:t>
+              <w:t>15초 내 식별 가능한 실루엣과 주요 덩어리 변환 기준</w:t>
             </w:r>
           </w:p>
         </w:tc>
@@ -19855,7 +19849,7 @@
               <w:rPr>
                 <w:sz w:val="16"/>
               </w:rPr>
-              <w:t>SimplificationNotes</w:t>
+              <w:t>RecommendedPaletteCount</w:t>
             </w:r>
           </w:p>
         </w:tc>
@@ -19872,7 +19866,7 @@
               <w:rPr>
                 <w:sz w:val="16"/>
               </w:rPr>
-              <w:t>15초 내 식별 가능한 실루엣과 주요 덩어리 변환 기준</w:t>
+              <w:t>일반 3~5색, 허용 범위 2~8색</w:t>
             </w:r>
           </w:p>
         </w:tc>
@@ -19888,46 +19882,6 @@
             <w:vAlign w:val="center"/>
           </w:tcPr>
           <w:p>
-            <w:pPr>
-              <w:pStyle w:val="TableText"/>
-            </w:pPr>
-            <w:r>
-              <w:rPr>
-                <w:sz w:val="16"/>
-              </w:rPr>
-              <w:t>RecommendedPaletteCount</w:t>
-            </w:r>
-          </w:p>
-        </w:tc>
-        <w:tc>
-          <w:tcPr>
-            <w:tcW w:w="7234" w:type="dxa"/>
-            <w:vAlign w:val="center"/>
-          </w:tcPr>
-          <w:p>
-            <w:pPr>
-              <w:pStyle w:val="TableText"/>
-            </w:pPr>
-            <w:r>
-              <w:rPr>
-                <w:sz w:val="16"/>
-              </w:rPr>
-              <w:t>일반 3~5색, 허용 범위 2~8색</w:t>
-            </w:r>
-          </w:p>
-        </w:tc>
-      </w:tr>
-      <w:tr>
-        <w:trPr>
-          <w:cantSplit/>
-          <w:jc w:val="center"/>
-        </w:trPr>
-        <w:tc>
-          <w:tcPr>
-            <w:tcW w:w="2630" w:type="dxa"/>
-            <w:vAlign w:val="center"/>
-          </w:tcPr>
-          <w:p>
             <w:r>
               <w:t>TimeoutPolicy</w:t>
             </w:r>
@@ -19959,7 +19913,7 @@
           <w:numId w:val="10"/>
         </w:numPr>
       </w:pPr>
-      <w:bookmarkStart w:id="41" w:name="_Toc237172745"/>
+      <w:bookmarkStart w:id="41" w:name="_Toc237735196"/>
       <w:r>
         <w:t xml:space="preserve">Alert, Lockdown, Shared Extraction </w:t>
       </w:r>
@@ -19982,7 +19936,7 @@
           <w:numId w:val="10"/>
         </w:numPr>
       </w:pPr>
-      <w:bookmarkStart w:id="42" w:name="_Toc237172746"/>
+      <w:bookmarkStart w:id="42" w:name="_Toc237735197"/>
       <w:r>
         <w:t>Alert Level</w:t>
       </w:r>
@@ -20340,7 +20294,7 @@
           <w:numId w:val="10"/>
         </w:numPr>
       </w:pPr>
-      <w:bookmarkStart w:id="43" w:name="_Toc237172747"/>
+      <w:bookmarkStart w:id="43" w:name="_Toc237735198"/>
       <w:r>
         <w:t>Shared Extraction</w:t>
       </w:r>
@@ -20414,7 +20368,7 @@
           <w:numId w:val="10"/>
         </w:numPr>
       </w:pPr>
-      <w:bookmarkStart w:id="44" w:name="_Toc237172748"/>
+      <w:bookmarkStart w:id="44" w:name="_Toc237735199"/>
       <w:r>
         <w:t>성공</w:t>
       </w:r>
@@ -20648,7 +20602,7 @@
           <w:numId w:val="10"/>
         </w:numPr>
       </w:pPr>
-      <w:bookmarkStart w:id="45" w:name="_Toc237172749"/>
+      <w:bookmarkStart w:id="45" w:name="_Toc237735200"/>
       <w:r>
         <w:t>Team Reward / Contribution</w:t>
       </w:r>
@@ -21103,7 +21057,7 @@
           <w:numId w:val="10"/>
         </w:numPr>
       </w:pPr>
-      <w:bookmarkStart w:id="46" w:name="_Toc237172750"/>
+      <w:bookmarkStart w:id="46" w:name="_Toc237735201"/>
       <w:r>
         <w:lastRenderedPageBreak/>
         <w:t>멀티플레이</w:t>
@@ -21130,7 +21084,7 @@
           <w:numId w:val="10"/>
         </w:numPr>
       </w:pPr>
-      <w:bookmarkStart w:id="47" w:name="_Toc237172751"/>
+      <w:bookmarkStart w:id="47" w:name="_Toc237735202"/>
       <w:r>
         <w:t>멀티플레이어</w:t>
       </w:r>
@@ -21156,7 +21110,7 @@
           <w:numId w:val="10"/>
         </w:numPr>
       </w:pPr>
-      <w:bookmarkStart w:id="48" w:name="_Toc237172752"/>
+      <w:bookmarkStart w:id="48" w:name="_Toc237735203"/>
       <w:r>
         <w:t>네트워크</w:t>
       </w:r>
@@ -21575,7 +21529,7 @@
           <w:numId w:val="10"/>
         </w:numPr>
       </w:pPr>
-      <w:bookmarkStart w:id="49" w:name="_Toc237172753"/>
+      <w:bookmarkStart w:id="49" w:name="_Toc237735204"/>
       <w:r>
         <w:t>주요</w:t>
       </w:r>
@@ -22329,7 +22283,7 @@
           <w:numId w:val="10"/>
         </w:numPr>
       </w:pPr>
-      <w:bookmarkStart w:id="50" w:name="_Toc237172754"/>
+      <w:bookmarkStart w:id="50" w:name="_Toc237735205"/>
       <w:r>
         <w:t>서버</w:t>
       </w:r>
@@ -22467,7 +22421,7 @@
           <w:numId w:val="10"/>
         </w:numPr>
       </w:pPr>
-      <w:bookmarkStart w:id="51" w:name="_Toc237172755"/>
+      <w:bookmarkStart w:id="51" w:name="_Toc237735206"/>
       <w:r>
         <w:t xml:space="preserve">Disconnect </w:t>
       </w:r>
@@ -22731,7 +22685,7 @@
           <w:numId w:val="10"/>
         </w:numPr>
       </w:pPr>
-      <w:bookmarkStart w:id="52" w:name="_Toc237172756"/>
+      <w:bookmarkStart w:id="52" w:name="_Toc237735207"/>
       <w:r>
         <w:t>필수</w:t>
       </w:r>
@@ -22868,7 +22822,7 @@
           <w:numId w:val="10"/>
         </w:numPr>
       </w:pPr>
-      <w:bookmarkStart w:id="53" w:name="_Toc237172757"/>
+      <w:bookmarkStart w:id="53" w:name="_Toc237735208"/>
       <w:r>
         <w:t xml:space="preserve">Gameplay Architecture, FastArray </w:t>
       </w:r>
@@ -22888,7 +22842,7 @@
           <w:numId w:val="10"/>
         </w:numPr>
       </w:pPr>
-      <w:bookmarkStart w:id="54" w:name="_Toc237172758"/>
+      <w:bookmarkStart w:id="54" w:name="_Toc237735209"/>
       <w:r>
         <w:t>책임</w:t>
       </w:r>
@@ -23348,7 +23302,7 @@
           <w:numId w:val="10"/>
         </w:numPr>
       </w:pPr>
-      <w:bookmarkStart w:id="55" w:name="_Toc237172759"/>
+      <w:bookmarkStart w:id="55" w:name="_Toc237735210"/>
       <w:r>
         <w:t xml:space="preserve">FastArray </w:t>
       </w:r>
@@ -23413,7 +23367,7 @@
           <w:numId w:val="10"/>
         </w:numPr>
       </w:pPr>
-      <w:bookmarkStart w:id="56" w:name="_Toc237172760"/>
+      <w:bookmarkStart w:id="56" w:name="_Toc237735211"/>
       <w:r>
         <w:t>서버</w:t>
       </w:r>
@@ -23792,7 +23746,7 @@
           <w:numId w:val="10"/>
         </w:numPr>
       </w:pPr>
-      <w:bookmarkStart w:id="57" w:name="_Toc237172761"/>
+      <w:bookmarkStart w:id="57" w:name="_Toc237735212"/>
       <w:r>
         <w:t>GameplayTag Dictionary</w:t>
       </w:r>
@@ -24087,7 +24041,7 @@
           <w:numId w:val="10"/>
         </w:numPr>
       </w:pPr>
-      <w:bookmarkStart w:id="58" w:name="_Toc237172762"/>
+      <w:bookmarkStart w:id="58" w:name="_Toc237735213"/>
       <w:r>
         <w:t xml:space="preserve">Tag Query </w:t>
       </w:r>
@@ -24386,7 +24340,7 @@
           <w:numId w:val="10"/>
         </w:numPr>
       </w:pPr>
-      <w:bookmarkStart w:id="59" w:name="_Toc237172763"/>
+      <w:bookmarkStart w:id="59" w:name="_Toc237735214"/>
       <w:r>
         <w:t xml:space="preserve">HUD, UI/UX </w:t>
       </w:r>
@@ -24409,7 +24363,7 @@
           <w:numId w:val="10"/>
         </w:numPr>
       </w:pPr>
-      <w:bookmarkStart w:id="60" w:name="_Toc237172764"/>
+      <w:bookmarkStart w:id="60" w:name="_Toc237735215"/>
       <w:r>
         <w:t xml:space="preserve">UI </w:t>
       </w:r>
@@ -24651,7 +24605,7 @@
           <w:numId w:val="10"/>
         </w:numPr>
       </w:pPr>
-      <w:bookmarkStart w:id="61" w:name="_Toc237172765"/>
+      <w:bookmarkStart w:id="61" w:name="_Toc237735216"/>
       <w:r>
         <w:t>화면</w:t>
       </w:r>
@@ -25184,7 +25138,7 @@
           <w:numId w:val="10"/>
         </w:numPr>
       </w:pPr>
-      <w:bookmarkStart w:id="62" w:name="_Toc237172766"/>
+      <w:bookmarkStart w:id="62" w:name="_Toc237735217"/>
       <w:r>
         <w:t xml:space="preserve">MVVM </w:t>
       </w:r>
@@ -25262,7 +25216,7 @@
           <w:numId w:val="10"/>
         </w:numPr>
       </w:pPr>
-      <w:bookmarkStart w:id="63" w:name="_Toc237172767"/>
+      <w:bookmarkStart w:id="63" w:name="_Toc237735218"/>
       <w:r>
         <w:t xml:space="preserve">ViewModel </w:t>
       </w:r>
@@ -25740,7 +25694,7 @@
           <w:numId w:val="10"/>
         </w:numPr>
       </w:pPr>
-      <w:bookmarkStart w:id="64" w:name="_Toc237172768"/>
+      <w:bookmarkStart w:id="64" w:name="_Toc237735219"/>
       <w:r>
         <w:t xml:space="preserve">Forgery </w:t>
       </w:r>
@@ -25754,7 +25708,11 @@
     </w:p>
     <w:p>
       <w:r>
-        <w:t>Surface Forgery와 Object Assembly WBP는 한글 중심으로 Mode Title, ‘예상 품질 {점수}/100 · 제출 가능 70+’ 단일 표시, Remaining Time, Submit, Cancel과 통합 하단 안내 순서를 공유한다. 별도 InstructionText와 ModeStatusText는 만들지 않는다. 별도 QualityRequirementText, 서버 점수, Template Name, Alert Warning과 Lockdown Countdown은 표시하지 않는다. 두 모드가 표시 중 Suspicious/Searching에서는 Session을 유지한다. Alarmed/Lockdown 진입 시 AHeistGameMode가 활성 Session을 AlertDanger로 서버에서 먼저 취소하고 Widget은 별도 Cancel Request 없이 즉시 닫아 Gameplay Input을 복원한다. Alarmed/Lockdown 중 신규 Observation과 Session Begin은 서버가 거부하며 Case Lock을 남기지 않는다. Surface 작업 영역은 Palette와 Drawing Content 안의 시각적 소/중/대 Brush 선택을 사용한다. Object Assembly는 Original/정답 실루엣과 UViewport Preview를 노출하지 않고 2D Part Tray와 Canvas Drag &amp; Drop을 사용한다. Drop 좌표는 가장 가까운 숨은 Socket Anchor로 양자화하고 회전은 승인된 Orientation Step만 사용하며, 중간 좌표는 복제하지 않고 Submit 시 기존 PartId/SocketId/QuantizedOrientation/MaterialId Payload만 전송한다. Surface Pointer 입력은 실제 Drawing Surface Geometry에서 정규화하고 서버 Score와 Replica Palette Raster는 256×256으로 정규화한다. 별도 Result Container를 만들지 않고 서버가 70점 이상 Submit을 수락하면 Widget을 닫으며 ReplicaReady E/R은 World HUD Prompt로 안내한다.</w:t>
+        <w:t xml:space="preserve">Surface Forgery와 Object Assembly WBP는 한글 중심으로 Mode Title, ‘예상 품질 {점수}/100 · 제출 가능 70+’ 단일 표시, Remaining Time, Submit, Cancel과 통합 하단 안내 순서를 공유한다. 별도 InstructionText와 ModeStatusText는 만들지 않는다. 별도 QualityRequirementText, 서버 점수, Template Name, Alert Warning과 Lockdown Countdown은 표시하지 않는다. 두 모드가 표시 중 Suspicious/Searching에서는 Session을 유지한다. Alarmed/Lockdown 진입 시 AHeistGameMode가 활성 Session을 AlertDanger로 서버에서 먼저 취소하고 Widget은 별도 Cancel Request 없이 즉시 닫아 Gameplay Input을 복원한다. Alarmed/Lockdown 중 신규 Observation과 Session Begin은 서버가 거부하며 Case Lock을 남기지 않는다. Surface 작업 영역은 Palette와 Drawing Content 안의 시각적 소/중/대 Brush 선택을 사용한다. Object Assembly는 Original/정답 실루엣과 UViewport Preview를 </w:t>
+      </w:r>
+      <w:r>
+        <w:lastRenderedPageBreak/>
+        <w:t>노출하지 않고 2D Part Tray와 Canvas Drag &amp; Drop을 사용한다. Drop 좌표는 가장 가까운 숨은 Socket Anchor로 양자화하고 회전은 승인된 Orientation Step만 사용하며, 중간 좌표는 복제하지 않고 Submit 시 기존 PartId/SocketId/QuantizedOrientation/MaterialId Payload만 전송한다. Surface Pointer 입력은 실제 Drawing Surface Geometry에서 정규화하고 서버 Score와 Replica Palette Raster는 256×256으로 정규화한다. 별도 Result Container를 만들지 않고 서버가 70점 이상 Submit을 수락하면 Widget을 닫으며 ReplicaReady E/R은 World HUD Prompt로 안내한다.</w:t>
       </w:r>
     </w:p>
     <w:p>
@@ -25765,9 +25723,8 @@
           <w:numId w:val="10"/>
         </w:numPr>
       </w:pPr>
-      <w:bookmarkStart w:id="65" w:name="_Toc237172769"/>
+      <w:bookmarkStart w:id="65" w:name="_Toc237735220"/>
       <w:r>
-        <w:lastRenderedPageBreak/>
         <w:t>상호작용</w:t>
       </w:r>
       <w:r>
@@ -26272,7 +26229,7 @@
           <w:numId w:val="10"/>
         </w:numPr>
       </w:pPr>
-      <w:bookmarkStart w:id="66" w:name="_Toc237172770"/>
+      <w:bookmarkStart w:id="66" w:name="_Toc237735221"/>
       <w:r>
         <w:lastRenderedPageBreak/>
         <w:t>데이터</w:t>
@@ -26299,7 +26256,7 @@
           <w:numId w:val="10"/>
         </w:numPr>
       </w:pPr>
-      <w:bookmarkStart w:id="67" w:name="_Toc237172771"/>
+      <w:bookmarkStart w:id="67" w:name="_Toc237735222"/>
       <w:r>
         <w:t xml:space="preserve">Debug, Telemetry, KPI </w:t>
       </w:r>
@@ -26319,7 +26276,7 @@
           <w:numId w:val="10"/>
         </w:numPr>
       </w:pPr>
-      <w:bookmarkStart w:id="68" w:name="_Toc237172772"/>
+      <w:bookmarkStart w:id="68" w:name="_Toc237735223"/>
       <w:r>
         <w:t>Debug Command</w:t>
       </w:r>
@@ -26726,7 +26683,7 @@
           <w:numId w:val="10"/>
         </w:numPr>
       </w:pPr>
-      <w:bookmarkStart w:id="69" w:name="_Toc237172773"/>
+      <w:bookmarkStart w:id="69" w:name="_Toc237735224"/>
       <w:r>
         <w:t>Telemetry / Log Event</w:t>
       </w:r>
@@ -27266,7 +27223,7 @@
           <w:numId w:val="10"/>
         </w:numPr>
       </w:pPr>
-      <w:bookmarkStart w:id="70" w:name="_Toc237172774"/>
+      <w:bookmarkStart w:id="70" w:name="_Toc237735225"/>
       <w:r>
         <w:t>Playtest KPI</w:t>
       </w:r>
@@ -27782,7 +27739,7 @@
           <w:numId w:val="10"/>
         </w:numPr>
       </w:pPr>
-      <w:bookmarkStart w:id="71" w:name="_Toc237172775"/>
+      <w:bookmarkStart w:id="71" w:name="_Toc237735226"/>
       <w:r>
         <w:t xml:space="preserve">Release QA </w:t>
       </w:r>
@@ -27919,7 +27876,7 @@
           <w:numId w:val="10"/>
         </w:numPr>
       </w:pPr>
-      <w:bookmarkStart w:id="72" w:name="_Toc237172776"/>
+      <w:bookmarkStart w:id="72" w:name="_Toc237735227"/>
       <w:r>
         <w:t xml:space="preserve">DataTable / DataAsset </w:t>
       </w:r>
@@ -27942,7 +27899,7 @@
           <w:numId w:val="10"/>
         </w:numPr>
       </w:pPr>
-      <w:bookmarkStart w:id="73" w:name="_Toc237172777"/>
+      <w:bookmarkStart w:id="73" w:name="_Toc237735228"/>
       <w:r>
         <w:t>데이터</w:t>
       </w:r>
@@ -28181,7 +28138,7 @@
           <w:numId w:val="10"/>
         </w:numPr>
       </w:pPr>
-      <w:bookmarkStart w:id="74" w:name="_Toc237172778"/>
+      <w:bookmarkStart w:id="74" w:name="_Toc237735229"/>
       <w:r>
         <w:t>주요</w:t>
       </w:r>
@@ -28705,7 +28662,7 @@
           <w:numId w:val="10"/>
         </w:numPr>
       </w:pPr>
-      <w:bookmarkStart w:id="75" w:name="_Toc237172779"/>
+      <w:bookmarkStart w:id="75" w:name="_Toc237735230"/>
       <w:r>
         <w:t>DT_ItemMaster</w:t>
       </w:r>
@@ -29563,7 +29520,7 @@
           <w:numId w:val="10"/>
         </w:numPr>
       </w:pPr>
-      <w:bookmarkStart w:id="76" w:name="_Toc237172780"/>
+      <w:bookmarkStart w:id="76" w:name="_Toc237735231"/>
       <w:r>
         <w:t>DT_LootData</w:t>
       </w:r>
@@ -29582,7 +29539,7 @@
           <w:numId w:val="10"/>
         </w:numPr>
       </w:pPr>
-      <w:bookmarkStart w:id="77" w:name="_Toc237172781"/>
+      <w:bookmarkStart w:id="77" w:name="_Toc237735232"/>
       <w:r>
         <w:lastRenderedPageBreak/>
         <w:t>DT_UsableItemData</w:t>
@@ -29896,7 +29853,7 @@
           <w:numId w:val="10"/>
         </w:numPr>
       </w:pPr>
-      <w:bookmarkStart w:id="78" w:name="_Toc237172782"/>
+      <w:bookmarkStart w:id="78" w:name="_Toc237735233"/>
       <w:r>
         <w:t>DT_SoundPingData</w:t>
       </w:r>
@@ -30706,7 +30663,7 @@
           <w:numId w:val="10"/>
         </w:numPr>
       </w:pPr>
-      <w:bookmarkStart w:id="79" w:name="_Toc237172783"/>
+      <w:bookmarkStart w:id="79" w:name="_Toc237735234"/>
       <w:r>
         <w:t>DT_GuardData</w:t>
       </w:r>
@@ -30725,7 +30682,7 @@
           <w:numId w:val="10"/>
         </w:numPr>
       </w:pPr>
-      <w:bookmarkStart w:id="80" w:name="_Toc237172784"/>
+      <w:bookmarkStart w:id="80" w:name="_Toc237735235"/>
       <w:r>
         <w:t>DT_ArtifactData</w:t>
       </w:r>
@@ -30744,7 +30701,7 @@
           <w:numId w:val="10"/>
         </w:numPr>
       </w:pPr>
-      <w:bookmarkStart w:id="81" w:name="_Toc237172785"/>
+      <w:bookmarkStart w:id="81" w:name="_Toc237735236"/>
       <w:r>
         <w:t>DT_ForgeryTemplate</w:t>
       </w:r>
@@ -30752,7 +30709,7 @@
     </w:p>
     <w:p>
       <w:r>
-        <w:t>TemplateId, ReferenceImage, ReferenceMask, BackgroundFilterMode/Tolerance, AllowedPalette, Observation/Forgery Duration, Stroke/Brush Limit, Shape/Color Weight, Paint Ratio/Overpaint Cap, TimeoutPenalty.</w:t>
+        <w:t>TemplateId, ReferenceImage, ReferenceMask, BackgroundFilterMode/Tolerance, AllowedPalette, Observation/Forgery Duration, Stroke/Brush Limit, Shape/Color Weight, Paint Ratio/Overpaint Cap.</w:t>
       </w:r>
     </w:p>
     <w:p>
@@ -30763,7 +30720,7 @@
           <w:numId w:val="10"/>
         </w:numPr>
       </w:pPr>
-      <w:bookmarkStart w:id="82" w:name="_Toc237172786"/>
+      <w:bookmarkStart w:id="82" w:name="_Toc237735237"/>
       <w:r>
         <w:lastRenderedPageBreak/>
         <w:t>기타</w:t>
@@ -31300,7 +31257,7 @@
           <w:numId w:val="10"/>
         </w:numPr>
       </w:pPr>
-      <w:bookmarkStart w:id="83" w:name="_Toc237172787"/>
+      <w:bookmarkStart w:id="83" w:name="_Toc237735238"/>
       <w:r>
         <w:t xml:space="preserve">Runtime </w:t>
       </w:r>
@@ -31750,7 +31707,7 @@
           <w:numId w:val="10"/>
         </w:numPr>
       </w:pPr>
-      <w:bookmarkStart w:id="84" w:name="_Toc237172788"/>
+      <w:bookmarkStart w:id="84" w:name="_Toc237735239"/>
       <w:r>
         <w:t>Validation</w:t>
       </w:r>
@@ -31848,7 +31805,7 @@
           <w:numId w:val="10"/>
         </w:numPr>
       </w:pPr>
-      <w:bookmarkStart w:id="85" w:name="_Toc237172789"/>
+      <w:bookmarkStart w:id="85" w:name="_Toc237735240"/>
       <w:r>
         <w:lastRenderedPageBreak/>
         <w:t>최소</w:t>
@@ -31887,7 +31844,7 @@
           <w:numId w:val="10"/>
         </w:numPr>
       </w:pPr>
-      <w:bookmarkStart w:id="86" w:name="_Toc237172790"/>
+      <w:bookmarkStart w:id="86" w:name="_Toc237735241"/>
       <w:r>
         <w:t>최소</w:t>
       </w:r>
@@ -32380,7 +32337,7 @@
           <w:numId w:val="10"/>
         </w:numPr>
       </w:pPr>
-      <w:bookmarkStart w:id="87" w:name="_Toc237172791"/>
+      <w:bookmarkStart w:id="87" w:name="_Toc237735242"/>
       <w:r>
         <w:t>시스템</w:t>
       </w:r>
@@ -32858,7 +32815,7 @@
           <w:numId w:val="10"/>
         </w:numPr>
       </w:pPr>
-      <w:bookmarkStart w:id="88" w:name="_Toc237172792"/>
+      <w:bookmarkStart w:id="88" w:name="_Toc237735243"/>
       <w:r>
         <w:lastRenderedPageBreak/>
         <w:t>Contract Run Runtime Contracts</w:t>
@@ -32873,7 +32830,7 @@
           <w:numId w:val="10"/>
         </w:numPr>
       </w:pPr>
-      <w:bookmarkStart w:id="89" w:name="_Toc237172793"/>
+      <w:bookmarkStart w:id="89" w:name="_Toc237735244"/>
       <w:r>
         <w:t>Contract Snapshot</w:t>
       </w:r>
@@ -33342,7 +33299,7 @@
           <w:numId w:val="10"/>
         </w:numPr>
       </w:pPr>
-      <w:bookmarkStart w:id="90" w:name="_Toc237172794"/>
+      <w:bookmarkStart w:id="90" w:name="_Toc237735245"/>
       <w:r>
         <w:t>Exhibit Assignment Snapshot</w:t>
       </w:r>
@@ -33651,7 +33608,7 @@
           <w:numId w:val="10"/>
         </w:numPr>
       </w:pPr>
-      <w:bookmarkStart w:id="91" w:name="_Toc237172795"/>
+      <w:bookmarkStart w:id="91" w:name="_Toc237735246"/>
       <w:r>
         <w:t>Forgery / Assembly Timer and Timeout Handling</w:t>
       </w:r>
@@ -33943,7 +33900,7 @@
           <w:numId w:val="10"/>
         </w:numPr>
       </w:pPr>
-      <w:bookmarkStart w:id="92" w:name="_Toc237172796"/>
+      <w:bookmarkStart w:id="92" w:name="_Toc237735247"/>
       <w:r>
         <w:t>Locomotion, Weight and Footstep</w:t>
       </w:r>
@@ -34235,7 +34192,7 @@
           <w:numId w:val="10"/>
         </w:numPr>
       </w:pPr>
-      <w:bookmarkStart w:id="93" w:name="_Toc237172797"/>
+      <w:bookmarkStart w:id="93" w:name="_Toc237735248"/>
       <w:r>
         <w:t>Identity, Nameplate and Team Status</w:t>
       </w:r>
@@ -34534,7 +34491,7 @@
           <w:numId w:val="10"/>
         </w:numPr>
       </w:pPr>
-      <w:bookmarkStart w:id="94" w:name="_Toc237172798"/>
+      <w:bookmarkStart w:id="94" w:name="_Toc237735249"/>
       <w:r>
         <w:t>Floor Plan Projection and Information Policy</w:t>
       </w:r>
@@ -34839,7 +34796,7 @@
           <w:numId w:val="10"/>
         </w:numPr>
       </w:pPr>
-      <w:bookmarkStart w:id="95" w:name="_Toc237172799"/>
+      <w:bookmarkStart w:id="95" w:name="_Toc237735250"/>
       <w:r>
         <w:t>Drop, Recovery, Deposit and Outcome</w:t>
       </w:r>
@@ -34940,7 +34897,7 @@
           <w:numId w:val="10"/>
         </w:numPr>
       </w:pPr>
-      <w:bookmarkStart w:id="96" w:name="_Toc237172800"/>
+      <w:bookmarkStart w:id="96" w:name="_Toc237735251"/>
       <w:r>
         <w:t>Greed Decision Telemetry Contract</w:t>
       </w:r>
@@ -35511,7 +35468,7 @@
           <w:numId w:val="10"/>
         </w:numPr>
       </w:pPr>
-      <w:bookmarkStart w:id="97" w:name="_Toc237172801"/>
+      <w:bookmarkStart w:id="97" w:name="_Toc237735252"/>
       <w:r>
         <w:t xml:space="preserve">Contract DataTable, DataAsset </w:t>
       </w:r>
@@ -35531,7 +35488,7 @@
           <w:numId w:val="10"/>
         </w:numPr>
       </w:pPr>
-      <w:bookmarkStart w:id="98" w:name="_Toc237172802"/>
+      <w:bookmarkStart w:id="98" w:name="_Toc237735253"/>
       <w:r>
         <w:t>Data Ownership</w:t>
       </w:r>
@@ -36527,7 +36484,7 @@
           <w:numId w:val="10"/>
         </w:numPr>
       </w:pPr>
-      <w:bookmarkStart w:id="99" w:name="_Toc237172803"/>
+      <w:bookmarkStart w:id="99" w:name="_Toc237735254"/>
       <w:r>
         <w:lastRenderedPageBreak/>
         <w:t>Contract Row Starting Example</w:t>
@@ -37048,7 +37005,7 @@
           <w:numId w:val="10"/>
         </w:numPr>
       </w:pPr>
-      <w:bookmarkStart w:id="100" w:name="_Toc237172804"/>
+      <w:bookmarkStart w:id="100" w:name="_Toc237735255"/>
       <w:r>
         <w:t>Runtime Snapshot and Replication</w:t>
       </w:r>
@@ -37445,7 +37402,7 @@
           <w:numId w:val="10"/>
         </w:numPr>
       </w:pPr>
-      <w:bookmarkStart w:id="101" w:name="_Toc237172805"/>
+      <w:bookmarkStart w:id="101" w:name="_Toc237735256"/>
       <w:r>
         <w:t>Data Validation Rules</w:t>
       </w:r>
@@ -37527,7 +37484,7 @@
       <w:pPr>
         <w:pStyle w:val="AppendixHeading"/>
       </w:pPr>
-      <w:bookmarkStart w:id="102" w:name="_Toc237172806"/>
+      <w:bookmarkStart w:id="102" w:name="_Toc237735257"/>
       <w:r>
         <w:lastRenderedPageBreak/>
         <w:t>Appendix C — Comprehensive Definition of Done</w:t>

</xml_diff>

<commit_message>
Rev14 scope rebaseline for v1 launch
Rebaseline the project to Rev14: v1 is now a 2–4 player, Surface Forgery-centered launch scope with Patrol, CCTV, and Laser Hold security, while Object Assembly remains preserved as Deferred Expansion and excluded from runtime/release use. Updated AGENTS, project status, shipping asset manifest, third-party notices, and local progress inbox to clarify public contract rules, deferred boundaries, and the remaining implementation/audit work required before RC and release sign-off.
</commit_message>
<xml_diff>
--- a/Museum_Heist_TDD.docx
+++ b/Museum_Heist_TDD.docx
@@ -101,7 +101,7 @@
           </w:tcPr>
           <w:p>
             <w:r>
-              <w:t>Rev 13 · 2026-08-15</w:t>
+              <w:t>Rev 14 · 2026-08-18</w:t>
             </w:r>
           </w:p>
         </w:tc>
@@ -8808,7 +8808,7 @@
               <w:rPr>
                 <w:sz w:val="16"/>
               </w:rPr>
-              <w:t>Object Template</w:t>
+              <w:t>Deferred Object Template</w:t>
             </w:r>
           </w:p>
         </w:tc>
@@ -8825,7 +8825,7 @@
               <w:rPr>
                 <w:sz w:val="16"/>
               </w:rPr>
-              <w:t>Core, Part/Socket/Orientation/Material 정답과 Score Weights</w:t>
+              <w:t>기존 Schema/Asset 호환 보존. v1 Runtime Assignment와 Cook 비활성</w:t>
             </w:r>
           </w:p>
         </w:tc>
@@ -9124,7 +9124,7 @@
               <w:pStyle w:val="TableText"/>
             </w:pPr>
             <w:r>
-              <w:t>1~4인 PvE Session</w:t>
+              <w:t>2~4인 PvE Session; 1인 PIE/Disconnect fallback 보존</w:t>
             </w:r>
           </w:p>
         </w:tc>
@@ -9588,7 +9588,7 @@
               <w:rPr>
                 <w:sz w:val="16"/>
               </w:rPr>
-              <w:t>Team Result / 1~4 Session으로 수정</w:t>
+              <w:t>Team Result / 2~4 Session / Host Start Gate로 수정</w:t>
             </w:r>
           </w:p>
         </w:tc>
@@ -9669,6 +9669,30 @@
                 <w:sz w:val="16"/>
               </w:rPr>
               <w:t>제거. Optional Rare Artifact가 승인되면 기존 타이머·방향 마커·Widget을 재사용하지 않고 현재 계약으로 재설계</w:t>
+            </w:r>
+          </w:p>
+        </w:tc>
+      </w:tr>
+      <w:tr>
+        <w:tc>
+          <w:tcPr>
+            <w:tcW w:type="dxa" w:w="2630"/>
+            <w:vAlign w:val="center"/>
+          </w:tcPr>
+          <w:p>
+            <w:r>
+              <w:t>CCTV / Laser / Hold Button</w:t>
+            </w:r>
+          </w:p>
+        </w:tc>
+        <w:tc>
+          <w:tcPr>
+            <w:tcW w:type="dxa" w:w="7234"/>
+            <w:vAlign w:val="center"/>
+          </w:tcPr>
+          <w:p>
+            <w:r>
+              <w:t>신규 v1 보안 협동 Actor. 기존 Interaction·Alert·Guard 조사 패턴 재사용</w:t>
             </w:r>
           </w:p>
         </w:tc>
@@ -10167,7 +10191,7 @@
         </w:numPr>
       </w:pPr>
       <w:r>
-        <w:t>추가 Object Assembly Kit / Template 초과분</w:t>
+        <w:t>CCTV 해킹·파괴, 다중 Laser Network와 Object Assembly 신규 Content</w:t>
       </w:r>
     </w:p>
     <w:p>
@@ -10235,7 +10259,7 @@
                 <w:b/>
                 <w:color w:val="17365D"/>
               </w:rPr>
-              <w:t>Do Not Cut First-Person PvE, Surface/Object Forgery, Contract Target/Quota, Walk/Sprint, Nameplate/Team Status, Floor Plan, 상태 피드백, Guard Inspection/Alert, Extraction Deposit, Online Session과 Packaging은 게임 정체성과 진행 가독성에 필수다.</w:t>
+              <w:t>Do Not Cut First-Person PvE, Surface Forgery, Contract Target/Quota, Walk/Sprint, Nameplate/Team Status, Floor Plan, 상태 피드백, Patrol/CCTV/Laser, Guard Inspection/Alert, Extraction Deposit, Online Session과 Packaging은 게임 정체성과 진행 가독성에 필수다.</w:t>
             </w:r>
           </w:p>
         </w:tc>
@@ -10461,7 +10485,7 @@
               <w:rPr>
                 <w:sz w:val="16"/>
               </w:rPr>
-              <w:t>1 Host + 3 Client Listen Server, PlayerState/GameState Replication</w:t>
+              <w:t>최대 1 Host + 3 Client Listen Server, PlayerState/GameState Replication</w:t>
             </w:r>
           </w:p>
         </w:tc>
@@ -10478,7 +10502,7 @@
               <w:rPr>
                 <w:sz w:val="16"/>
               </w:rPr>
-              <w:t>1~4인으로 조건 완화, 권한 구조 유지</w:t>
+              <w:t>공개 시작은 2~4인, PlayerId/1인 fallback은 유지</w:t>
             </w:r>
           </w:p>
         </w:tc>
@@ -11924,14 +11948,8 @@
             <w:vAlign w:val="center"/>
           </w:tcPr>
           <w:p>
-            <w:pPr>
-              <w:pStyle w:val="TableText"/>
-            </w:pPr>
-            <w:r>
-              <w:rPr>
-                <w:sz w:val="16"/>
-              </w:rPr>
-              <w:t>Object Assembly</w:t>
+            <w:r>
+              <w:t>CCTV Detection</w:t>
             </w:r>
           </w:p>
         </w:tc>
@@ -11948,7 +11966,7 @@
               <w:rPr>
                 <w:sz w:val="16"/>
               </w:rPr>
-              <w:t>30초 기본</w:t>
+              <w:t>1.35초 기본</w:t>
             </w:r>
           </w:p>
         </w:tc>
@@ -11959,7 +11977,7 @@
           </w:tcPr>
           <w:p>
             <w:r>
-              <w:t>Template 범위 25~35초 / 70점 Early Submit / Timeout Discard + nearby Guard once</w:t>
+              <w:t>0.15초 후보 검사 / 1.2~1.5초 Build-up / 사건당 Alert + nearby Guard once / Cooldown</w:t>
             </w:r>
           </w:p>
         </w:tc>
@@ -13512,7 +13530,7 @@
     </w:p>
     <w:p>
       <w:r>
-        <w:t>배낭은 가로 4칸 × 세로 5칸, 총 20칸이다. Painting/Object Original과 Loose Loot는 동일한 Owner-only FastArray Item Instance와 GridSlot을 사용한다. Original 전용 Carry Entry, CarryMode와 별도 UI 카드는 사용하지 않는다.</w:t>
+        <w:t>배낭은 가로 4칸 × 세로 5칸, 총 20칸이다. v1.0 Painting Original과 Loose Loot는 동일한 Owner-only FastArray Item Instance와 GridSlot을 사용한다. Original 전용 Carry Entry, CarryMode와 별도 UI 카드는 사용하지 않는다.</w:t>
       </w:r>
     </w:p>
     <w:p>
@@ -14773,7 +14791,7 @@
         </w:numPr>
       </w:pPr>
       <w:r>
-        <w:t>Forgery/Inventory/Arrest 상태에서는 사용 요청을 거부한다.</w:t>
+        <w:t>Forgery/Inventory/Map/Security Hold/Arrest 상태에서는 사용 요청을 거부한다.</w:t>
       </w:r>
     </w:p>
     <w:p>
@@ -17364,6 +17382,39 @@
     <w:p>
       <w:pPr>
         <w:pStyle w:val="31"/>
+      </w:pPr>
+      <w:r>
+        <w:t>CCTV와 Cooperative Laser</w:t>
+      </w:r>
+    </w:p>
+    <w:p>
+      <w:r>
+        <w:t>AHeistSecurityCameraActor는 서버 Timer에서 Overlap 후보만 0.15초 간격으로 거리·각도·LOS 검사한다. 기본 Detection Build-up은 1.35초, 허용 범위는 1.2~1.5초이며 완전 발각만 Suspicious와 근처 Guard 1회 Investigate를 요청한다. Client는 Sweep Epoch, LED/Cone과 Audio Presentation만 소비한다.</w:t>
+      </w:r>
+    </w:p>
+    <w:p>
+      <w:r>
+        <w:t>AHeistLaserBarrierActor는 물리 차단을 만들지 않는 서버 권한 경보선이다. 활성 Beam 통과는 사건당 Alert와 근처 Guard 조사를 한 번만 발생시키고, Player를 공간 안에 가두지 않는다.</w:t>
+      </w:r>
+    </w:p>
+    <w:p>
+      <w:r>
+        <w:t>AHeistSecurityHoldButtonActor는 AHeistInteractableActor를 상속한다. Input Started/Completed를 Reliable Server Request로 전달하며 Holder PlayerState, Bypass State와 Revision을 복제한다. 한 Player만 Holder가 될 수 있고 Client는 상태를 직접 확정하지 않는다.</w:t>
+      </w:r>
+    </w:p>
+    <w:p>
+      <w:r>
+        <w:t>Input Release, EndOverlap, 거리 초과, Stun, Arrest, Escape, Disconnect, Match End, Travel에서 Hold를 강제 해제하고 0.75초 Rearm Grace 뒤 Barrier를 활성화한다. 내부 Player는 활성 Beam을 경보 비용으로 통과할 수 있어 Soft-lock되지 않는다.</w:t>
+      </w:r>
+    </w:p>
+    <w:p>
+      <w:r>
+        <w:t>Laser Barrier는 Protected Painting Case를 EditInstanceOnly 직접 참조한다. Data Validation은 연결된 Artifact가 FourStar이고 v1 Painting Assignment인지 확인한다. Forgery Quality는 Laser 배치 기준으로 사용하지 않는다.</w:t>
+      </w:r>
+    </w:p>
+    <w:p>
+      <w:pPr>
+        <w:pStyle w:val="31"/>
         <w:numPr>
           <w:ilvl w:val="2"/>
           <w:numId w:val="10"/>
@@ -17438,7 +17489,7 @@
     </w:p>
     <w:p>
       <w:r>
-        <w:t>v1.0의 활성 Exhibit는 AHeistPaintingDisplayCaseActor와 AHeistObjectDisplayCaseActor다. Sculpture/Ceramic은 Object Assembly Vertical Slice의 Required Family이며 BP_ObjectDisplayCase 공용 Shell을 사용한다. AHeistDisplayCaseActor, AHeistSculptureDisplayCaseActor와 BP_SculptureDisplayCase는 제거됐다.</w:t>
+        <w:t>v1.0의 활성 Exhibit는 AHeistPaintingDisplayCaseActor 하나다. Required/Optional Assignment는 ForgeryType=Drawing인 Painting Case만 사용한다. AHeistObjectDisplayCaseActor와 BP_ObjectDisplayCase는 삭제하지 않고 Deferred Expansion Canonical Shell로 보존하며 Release Map, Assignment, UI Entry와 Cook에서는 비활성화한다.</w:t>
       </w:r>
     </w:p>
     <w:tbl>
@@ -17568,7 +17619,7 @@
               <w:pStyle w:val="TableText"/>
             </w:pPr>
             <w:r>
-              <w:t>Surface Observation/Forgery 또는 Object Assembly → Replica → Original</w:t>
+              <w:t>Surface Observation/Forgery → Replica → Painting Original</w:t>
             </w:r>
           </w:p>
         </w:tc>
@@ -17616,7 +17667,7 @@
               <w:pStyle w:val="TableText"/>
             </w:pPr>
             <w:r>
-              <w:t>Painting/Object Case State + Contract Assignment</w:t>
+              <w:t>Painting Case State + Contract Assignment</w:t>
             </w:r>
           </w:p>
         </w:tc>
@@ -17709,7 +17760,7 @@
               <w:pStyle w:val="TableText"/>
             </w:pPr>
             <w:r>
-              <w:t>Surface 36개 + Sculpture/Ceramic Object Template 최소 12개</w:t>
+              <w:t>Surface 36개. Object Template/Part Data는 Deferred Expansion 보존</w:t>
             </w:r>
           </w:p>
         </w:tc>
@@ -19908,6 +19959,29 @@
     <w:p>
       <w:pPr>
         <w:pStyle w:val="21"/>
+      </w:pPr>
+      <w:r>
+        <w:t>Deferred Expansion: Object Assembly</w:t>
+      </w:r>
+    </w:p>
+    <w:p>
+      <w:r>
+        <w:t>Object Assembly C++ Class, Component, ViewModel, Widget, Enum/Struct, Template/Part Data, Blueprint Shell과 SourceArt는 삭제하지 않고 보존한다. 이 절과 기존 세부 계약은 재활성화 시의 호환 경계다.</w:t>
+      </w:r>
+    </w:p>
+    <w:p>
+      <w:r>
+        <w:t>v1 Release Feature Gate는 Object Assembly를 비활성화한다. Object Case는 Assignment 후보에서 제외하고 직접 Begin은 FeatureDisabled로 거부하며 ObjectAssemblyWidgetClass와 Result Assembly 열을 노출하지 않는다.</w:t>
+      </w:r>
+    </w:p>
+    <w:p>
+      <w:r>
+        <w:t>Release Map과 Cook에는 BP_ObjectDisplayCase, WBP_HeistObjectAssembly, ObjectAssembly Runtime Art의 활성 참조를 남기지 않는다. 보존 경로는 Compile·Load·Cleanup·Serialization 호환만 검증하고 신규 Content를 추가하지 않는다.</w:t>
+      </w:r>
+    </w:p>
+    <w:p>
+      <w:pPr>
+        <w:pStyle w:val="21"/>
         <w:numPr>
           <w:ilvl w:val="1"/>
           <w:numId w:val="10"/>
@@ -20781,7 +20855,7 @@
               <w:rPr>
                 <w:sz w:val="16"/>
               </w:rPr>
-              <w:t>Assemblies / BestAssemblyQuality</w:t>
+              <w:t>Assemblies / BestAssemblyQuality (Deferred Compatibility)</w:t>
             </w:r>
           </w:p>
         </w:tc>
@@ -20798,7 +20872,7 @@
               <w:rPr>
                 <w:sz w:val="16"/>
               </w:rPr>
-              <w:t>Object Assembly 기여</w:t>
+              <w:t>v1 Result UI 비노출; 기존 Snapshot/Serialization 호환만 유지</w:t>
             </w:r>
           </w:p>
         </w:tc>
@@ -21263,14 +21337,8 @@
             <w:vAlign w:val="center"/>
           </w:tcPr>
           <w:p>
-            <w:pPr>
-              <w:pStyle w:val="TableText"/>
-            </w:pPr>
-            <w:r>
-              <w:rPr>
-                <w:sz w:val="16"/>
-              </w:rPr>
-              <w:t>1~4</w:t>
+            <w:r>
+              <w:t>2~4 Release / 1인 internal fallback</w:t>
             </w:r>
           </w:p>
         </w:tc>
@@ -21520,6 +21588,29 @@
       <w:pPr>
         <w:spacing w:after="20"/>
       </w:pPr>
+    </w:p>
+    <w:p>
+      <w:pPr>
+        <w:pStyle w:val="31"/>
+      </w:pPr>
+      <w:r>
+        <w:t>Release Player Count / Session Start</w:t>
+      </w:r>
+    </w:p>
+    <w:p>
+      <w:r>
+        <w:t>공개 제품은 2~4인 Listen Server를 지원하고 최대 Public Connection은 4를 유지한다. Lobby에서 Host를 포함해 2명 미만이면 Start Request를 서버가 MinimumPlayersRequired로 거부한다.</w:t>
+      </w:r>
+    </w:p>
+    <w:p>
+      <w:r>
+        <w:t>MatchStart 시 Crew Count로 Quota와 Exhibit Assignment를 한 번 확정한다. InGame 이후 Join In Progress는 허용하지 않으며, 진행 중 2→1 이탈은 즉시 Match Fail이나 Quota 재계산을 만들지 않는다.</w:t>
+      </w:r>
+    </w:p>
+    <w:p>
+      <w:r>
+        <w:t>PlayerId 1~4, 1인 Balance Row와 직접 Gameplay PIE는 Slot/Disconnect/자동화 fallback으로 보존하지만 Release Support와 Completion Gate에는 포함하지 않는다.</w:t>
+      </w:r>
     </w:p>
     <w:p>
       <w:pPr>
@@ -21945,7 +22036,7 @@
               <w:rPr>
                 <w:sz w:val="16"/>
               </w:rPr>
-              <w:t>Painting/Object Case State</w:t>
+              <w:t>Painting Case State</w:t>
             </w:r>
           </w:p>
         </w:tc>
@@ -22002,7 +22093,7 @@
               <w:rPr>
                 <w:sz w:val="16"/>
               </w:rPr>
-              <w:t>Forgery/Assembly Result</w:t>
+              <w:t>Surface Forgery Result</w:t>
             </w:r>
           </w:p>
         </w:tc>
@@ -22265,6 +22356,41 @@
                 <w:sz w:val="16"/>
               </w:rPr>
               <w:t>전체</w:t>
+            </w:r>
+          </w:p>
+        </w:tc>
+      </w:tr>
+      <w:tr>
+        <w:tc>
+          <w:tcPr>
+            <w:tcW w:type="dxa" w:w="2137"/>
+            <w:vAlign w:val="center"/>
+          </w:tcPr>
+          <w:p>
+            <w:r>
+              <w:t>CCTV / Laser / Hold State</w:t>
+            </w:r>
+          </w:p>
+        </w:tc>
+        <w:tc>
+          <w:tcPr>
+            <w:tcW w:type="dxa" w:w="3617"/>
+            <w:vAlign w:val="center"/>
+          </w:tcPr>
+          <w:p>
+            <w:r>
+              <w:t>Security Actor + Holder PlayerState</w:t>
+            </w:r>
+          </w:p>
+        </w:tc>
+        <w:tc>
+          <w:tcPr>
+            <w:tcW w:type="dxa" w:w="4110"/>
+            <w:vAlign w:val="center"/>
+          </w:tcPr>
+          <w:p>
+            <w:r>
+              <w:t>Relevant Client / 전체</w:t>
             </w:r>
           </w:p>
         </w:tc>
@@ -22402,7 +22528,7 @@
               <w:pStyle w:val="TableText"/>
             </w:pPr>
             <w:r>
-              <w:t>Input, Local drawing preview, ViewModel/Widget presentation, movement prediction</w:t>
+              <w:t>Input, Local drawing preview, CCTV/Laser presentation, ViewModel/Widget presentation, movement prediction</w:t>
             </w:r>
           </w:p>
         </w:tc>
@@ -22550,7 +22676,7 @@
               <w:pStyle w:val="TableText"/>
             </w:pPr>
             <w:r>
-              <w:t>Client Quit during run</w:t>
+              <w:t>Client Quit during run (2→1 포함)</w:t>
             </w:r>
           </w:p>
         </w:tc>
@@ -22564,7 +22690,7 @@
               <w:pStyle w:val="TableText"/>
             </w:pPr>
             <w:r>
-              <w:t>Loose Loot/Original을 월드 드롭, Session/Case Lock 해제, 나머지 인원 계속</w:t>
+              <w:t>Loose Loot/Original을 월드 드롭하고 Session/Case/Security Hold를 해제하며 남은 1명도 계속</w:t>
             </w:r>
           </w:p>
         </w:tc>
@@ -23163,7 +23289,7 @@
               <w:rPr>
                 <w:sz w:val="16"/>
               </w:rPr>
-              <w:t>Inventory/Interaction/Action/Vision/Noise/Forgery/Object Assembly</w:t>
+              <w:t>Inventory/Interaction/Action/Vision/Noise/Forgery + Deferred Object Assembly</w:t>
             </w:r>
           </w:p>
         </w:tc>
@@ -23203,7 +23329,7 @@
               <w:rPr>
                 <w:sz w:val="16"/>
               </w:rPr>
-              <w:t>Loot, Painting/Object Case, Vent/Extraction, Coin, Guard</w:t>
+              <w:t>Loot, Painting Case, Vent/Extraction, Coin, Guard, CCTV, Laser Barrier/Hold Button</w:t>
             </w:r>
           </w:p>
         </w:tc>
@@ -23852,7 +23978,7 @@
               <w:pStyle w:val="TableText"/>
             </w:pPr>
             <w:r>
-              <w:t>State.Arrested / State.Disabled / State.Forgery / State.Assembly / State.CarryingOriginal</w:t>
+              <w:t>State.Arrested / State.Disabled / State.Forgery / State.CarryingOriginal / State.SecurityHold (Assembly retained only)</w:t>
             </w:r>
           </w:p>
         </w:tc>
@@ -23954,7 +24080,7 @@
               <w:pStyle w:val="TableText"/>
             </w:pPr>
             <w:r>
-              <w:t>Event.SoundPing.* / Event.Alert.* / Event.Contract.* / Event.Objective.*</w:t>
+              <w:t>Event.SoundPing.* / Event.Alert.* / Event.Security.* / Event.Contract.* / Event.Objective.*</w:t>
             </w:r>
           </w:p>
         </w:tc>
@@ -24147,11 +24273,8 @@
             <w:vAlign w:val="center"/>
           </w:tcPr>
           <w:p>
-            <w:pPr>
-              <w:pStyle w:val="TableText"/>
-            </w:pPr>
-            <w:r>
-              <w:t>Arrested, Disabled, Stunned, Forgery, Assembly, Inventory, Map, Escaped</w:t>
+            <w:r>
+              <w:t>Arrested, Disabled, Stunned, Forgery, SecurityHold, Inventory, Map, Escaped</w:t>
             </w:r>
           </w:p>
         </w:tc>
@@ -24185,7 +24308,7 @@
               <w:pStyle w:val="TableText"/>
             </w:pPr>
             <w:r>
-              <w:t>Arrested, Disabled, Stunned, Forgery, Assembly, Inventory, Map, Extracting</w:t>
+              <w:t>Arrested, Disabled, Stunned, Forgery, SecurityHold, Inventory, Map, Extracting</w:t>
             </w:r>
           </w:p>
         </w:tc>
@@ -24215,11 +24338,8 @@
             <w:vAlign w:val="center"/>
           </w:tcPr>
           <w:p>
-            <w:pPr>
-              <w:pStyle w:val="TableText"/>
-            </w:pPr>
-            <w:r>
-              <w:t>Arrested, Disabled, Stunned, Forgery, Assembly, Inventory, Map, Escaped</w:t>
+            <w:r>
+              <w:t>Arrested, Disabled, Stunned, Forgery, SecurityHold, Inventory, Map, Escaped</w:t>
             </w:r>
           </w:p>
         </w:tc>
@@ -24253,7 +24373,7 @@
               <w:pStyle w:val="TableText"/>
             </w:pPr>
             <w:r>
-              <w:t>Arrested, Stunned, Forgery, Assembly, Map, Extracting</w:t>
+              <w:t>Arrested, Stunned, Forgery, SecurityHold, Map, Extracting</w:t>
             </w:r>
           </w:p>
         </w:tc>
@@ -24287,7 +24407,7 @@
               <w:pStyle w:val="TableText"/>
             </w:pPr>
             <w:r>
-              <w:t>Arrested, Stunned, Forgery, Assembly, Inventory, Extracting</w:t>
+              <w:t>Arrested, Stunned, Forgery, SecurityHold, Inventory, Extracting</w:t>
             </w:r>
           </w:p>
         </w:tc>
@@ -24307,7 +24427,7 @@
               <w:pStyle w:val="TableText"/>
             </w:pPr>
             <w:r>
-              <w:t>Begin Forgery/Assembly</w:t>
+              <w:t>Begin Forgery / Hold Security Button</w:t>
             </w:r>
           </w:p>
         </w:tc>
@@ -24765,7 +24885,7 @@
               <w:rPr>
                 <w:sz w:val="16"/>
               </w:rPr>
-              <w:t>WBP_Lobby, Player Slot 1~4 + Map Selection/Random + Ready/Start/Leave</w:t>
+              <w:t>WBP_Lobby, Player Slot 1~4 + Map Selection/Random + Host Start/Leave; 2인 미만 사유 표시</w:t>
             </w:r>
           </w:p>
         </w:tc>
@@ -24981,14 +25101,8 @@
             <w:vAlign w:val="center"/>
           </w:tcPr>
           <w:p>
-            <w:pPr>
-              <w:pStyle w:val="TableText"/>
-            </w:pPr>
-            <w:r>
-              <w:rPr>
-                <w:sz w:val="16"/>
-              </w:rPr>
-              <w:t>Object Assembly</w:t>
+            <w:r>
+              <w:t>Object Assembly (Deferred Asset)</w:t>
             </w:r>
           </w:p>
         </w:tc>
@@ -24999,7 +25113,7 @@
           </w:tcPr>
           <w:p>
             <w:r>
-              <w:t>Owner-only Full-Screen 2D Part Tray / Assembly Canvas</w:t>
+              <w:t>Deferred Expansion asset; v1 HUD에서 생성하지 않음</w:t>
             </w:r>
           </w:p>
         </w:tc>
@@ -25537,14 +25651,8 @@
             <w:vAlign w:val="center"/>
           </w:tcPr>
           <w:p>
-            <w:pPr>
-              <w:pStyle w:val="TableText"/>
-            </w:pPr>
-            <w:r>
-              <w:rPr>
-                <w:sz w:val="16"/>
-              </w:rPr>
-              <w:t>Object Assembly</w:t>
+            <w:r>
+              <w:t>Object Assembly ViewModel (Deferred)</w:t>
             </w:r>
           </w:p>
         </w:tc>
@@ -25555,7 +25663,7 @@
           </w:tcPr>
           <w:p>
             <w:r>
-              <w:t>한글 공통 Shell + 2D Part Tray/Assembly Canvas Drag &amp; Drop. Original/Template Name/정답 실루엣/UViewport와 Part·Socket 순회 버튼을 표시하지 않는다. Drop은 가장 가까운 호환 Socket Anchor로 양자화하고 Wheel 회전, 우클릭 제거, R Reset을 사용하며 중간 좌표는 복제하지 않는다.</w:t>
+              <w:t>Deferred Expansion ViewModel/Widget 호환 보존. v1 Player-facing Entry와 Result에는 표시하지 않는다.</w:t>
             </w:r>
           </w:p>
         </w:tc>
@@ -25708,11 +25816,7 @@
     </w:p>
     <w:p>
       <w:r>
-        <w:t xml:space="preserve">Surface Forgery와 Object Assembly WBP는 한글 중심으로 Mode Title, ‘예상 품질 {점수}/100 · 제출 가능 70+’ 단일 표시, Remaining Time, Submit, Cancel과 통합 하단 안내 순서를 공유한다. 별도 InstructionText와 ModeStatusText는 만들지 않는다. 별도 QualityRequirementText, 서버 점수, Template Name, Alert Warning과 Lockdown Countdown은 표시하지 않는다. 두 모드가 표시 중 Suspicious/Searching에서는 Session을 유지한다. Alarmed/Lockdown 진입 시 AHeistGameMode가 활성 Session을 AlertDanger로 서버에서 먼저 취소하고 Widget은 별도 Cancel Request 없이 즉시 닫아 Gameplay Input을 복원한다. Alarmed/Lockdown 중 신규 Observation과 Session Begin은 서버가 거부하며 Case Lock을 남기지 않는다. Surface 작업 영역은 Palette와 Drawing Content 안의 시각적 소/중/대 Brush 선택을 사용한다. Object Assembly는 Original/정답 실루엣과 UViewport Preview를 </w:t>
-      </w:r>
-      <w:r>
-        <w:lastRenderedPageBreak/>
-        <w:t>노출하지 않고 2D Part Tray와 Canvas Drag &amp; Drop을 사용한다. Drop 좌표는 가장 가까운 숨은 Socket Anchor로 양자화하고 회전은 승인된 Orientation Step만 사용하며, 중간 좌표는 복제하지 않고 Submit 시 기존 PartId/SocketId/QuantizedOrientation/MaterialId Payload만 전송한다. Surface Pointer 입력은 실제 Drawing Surface Geometry에서 정규화하고 서버 Score와 Replica Palette Raster는 256×256으로 정규화한다. 별도 Result Container를 만들지 않고 서버가 70점 이상 Submit을 수락하면 Widget을 닫으며 ReplicaReady E/R은 World HUD Prompt로 안내한다.</w:t>
+        <w:t>v1.0 Surface Forgery WBP는 한글 중심 Mode Title, ‘예상 품질 {점수}/100 · 제출 가능 70+’ 단일 표시, Remaining Time, Submit, Cancel과 통합 하단 안내를 사용한다. InstructionText, ModeStatusText, 별도 QualityRequirementText, 서버 점수, Alert Warning과 Lockdown Countdown은 표시하지 않는다. Suspicious/Searching에서는 Session을 유지하고 Alarmed/Lockdown 진입 시 AHeistGameMode가 활성 Session을 AlertDanger로 서버에서 먼저 취소한다. Widget은 즉시 닫아 Gameplay Input을 복원하며 위험 단계 신규 Observation/Session Begin은 서버가 거부한다. Surface 작업 영역은 Palette와 Drawing Content 안의 시각적 소/중/대 Brush를 사용한다. Pointer 입력은 실제 Drawing Surface Geometry에서 정규화하고 서버 Score와 Replica Palette Raster는 256×256으로 정규화한다. 서버가 70점 이상 Submit을 수락하면 Widget을 닫고 ReplicaReady E/R은 World HUD Prompt로 안내한다. WBP_HeistObjectAssembly는 Deferred Expansion 자산으로 보존하되 v1 HUD에서 생성·표시하지 않는다.</w:t>
       </w:r>
     </w:p>
     <w:p>
@@ -25894,7 +25998,7 @@
               <w:rPr>
                 <w:sz w:val="16"/>
               </w:rPr>
-              <w:t>Forgery/Assembly Rejected</w:t>
+              <w:t>Forgery Rejected / Security Hold Rejected</w:t>
             </w:r>
           </w:p>
         </w:tc>
@@ -25905,7 +26009,7 @@
           </w:tcPr>
           <w:p>
             <w:r>
-              <w:t>거리/상태/Lockdown/Template/QualityBelowMinimum 사유. 70 미만은 Session 유지</w:t>
+              <w:t>Forgery는 거리/상태/Lockdown/Template/QualityBelowMinimum, Hold는 거리/Owner/Player State 사유. 70 미만은 Forgery Session 유지</w:t>
             </w:r>
           </w:p>
         </w:tc>
@@ -26200,7 +26304,7 @@
           </w:tcPr>
           <w:p>
             <w:r>
-              <w:t>Forgery/Assembly Timeout</w:t>
+              <w:t>Forgery Timeout</w:t>
             </w:r>
           </w:p>
         </w:tc>
@@ -26210,7 +26314,31 @@
           </w:tcPr>
           <w:p>
             <w:r>
-              <w:t>작업 폐기 + Replica 없음 + 근처 Guard 한 명 1회 InvestigateNoise + Alert unchanged</w:t>
+              <w:t>Stroke 폐기 + Replica 없음 + 근처 Guard 한 명 1회 InvestigateNoise + Alert unchanged</w:t>
+            </w:r>
+          </w:p>
+        </w:tc>
+      </w:tr>
+      <w:tr>
+        <w:tc>
+          <w:tcPr>
+            <w:tcW w:type="dxa" w:w="2630"/>
+            <w:vAlign w:val="center"/>
+          </w:tcPr>
+          <w:p>
+            <w:r>
+              <w:t>CCTV/Laser</w:t>
+            </w:r>
+          </w:p>
+        </w:tc>
+        <w:tc>
+          <w:tcPr>
+            <w:tcW w:type="dxa" w:w="7234"/>
+            <w:vAlign w:val="center"/>
+          </w:tcPr>
+          <w:p>
+            <w:r>
+              <w:t>Build-up·Trip·Hold/Release를 World Visual + Audio + Owner Warning으로 표시. Guard/CCTV 위치 Cone HUD 금지</w:t>
             </w:r>
           </w:p>
         </w:tc>
@@ -27209,6 +27337,54 @@
           </w:p>
         </w:tc>
       </w:tr>
+      <w:tr>
+        <w:tc>
+          <w:tcPr>
+            <w:tcW w:type="dxa" w:w="2630"/>
+            <w:vAlign w:val="center"/>
+          </w:tcPr>
+          <w:p>
+            <w:r>
+              <w:t>SecurityCameraDetected</w:t>
+            </w:r>
+          </w:p>
+        </w:tc>
+        <w:tc>
+          <w:tcPr>
+            <w:tcW w:type="dxa" w:w="7234"/>
+            <w:vAlign w:val="center"/>
+          </w:tcPr>
+          <w:p>
+            <w:r>
+              <w:t>CameraId, PlayerId, BuildUp, AlertChanged, GuardId</w:t>
+            </w:r>
+          </w:p>
+        </w:tc>
+      </w:tr>
+      <w:tr>
+        <w:tc>
+          <w:tcPr>
+            <w:tcW w:type="dxa" w:w="2630"/>
+            <w:vAlign w:val="center"/>
+          </w:tcPr>
+          <w:p>
+            <w:r>
+              <w:t>LaserHoldChanged / LaserTripped</w:t>
+            </w:r>
+          </w:p>
+        </w:tc>
+        <w:tc>
+          <w:tcPr>
+            <w:tcW w:type="dxa" w:w="7234"/>
+            <w:vAlign w:val="center"/>
+          </w:tcPr>
+          <w:p>
+            <w:r>
+              <w:t>BarrierId, HolderPlayerId, Active, Reason, AlertChanged, GuardId</w:t>
+            </w:r>
+          </w:p>
+        </w:tc>
+      </w:tr>
     </w:tbl>
     <w:p>
       <w:pPr>
@@ -27337,7 +27513,7 @@
               <w:rPr>
                 <w:sz w:val="16"/>
               </w:rPr>
-              <w:t>1~4인 80% 이상 완주</w:t>
+              <w:t>2인·3인·4인 80% 이상 완주</w:t>
             </w:r>
           </w:p>
         </w:tc>
@@ -27418,7 +27594,7 @@
               <w:rPr>
                 <w:sz w:val="16"/>
               </w:rPr>
-              <w:t>Solo 2~3 / 2인 3~4 / 3~4인 4~6</w:t>
+              <w:t>2인 3~4 / 3인 4~5 / 4인 4~6</w:t>
             </w:r>
           </w:p>
         </w:tc>
@@ -27515,7 +27691,7 @@
               <w:rPr>
                 <w:sz w:val="16"/>
               </w:rPr>
-              <w:t>Object Duration</w:t>
+              <w:t>Security Cooperation</w:t>
             </w:r>
           </w:p>
         </w:tc>
@@ -27532,7 +27708,7 @@
               <w:rPr>
                 <w:sz w:val="16"/>
               </w:rPr>
-              <w:t>25~35초, Part/Socket/Orientation 이해</w:t>
+              <w:t>CCTV Build-up을 읽고 Laser Hold 2~5초 안에 팀원이 통과</w:t>
             </w:r>
           </w:p>
         </w:tc>
@@ -28523,7 +28699,7 @@
               <w:rPr>
                 <w:sz w:val="16"/>
               </w:rPr>
-              <w:t>None / Drawing / Assembly</w:t>
+              <w:t>None / Drawing / Assembly(Deferred Compatibility)</w:t>
             </w:r>
           </w:p>
         </w:tc>
@@ -30981,7 +31157,7 @@
               <w:rPr>
                 <w:sz w:val="16"/>
               </w:rPr>
-              <w:t>DT_ObjectAssemblyTemplate</w:t>
+              <w:t>DT_ObjectAssemblyTemplate (Deferred)</w:t>
             </w:r>
           </w:p>
         </w:tc>
@@ -30998,7 +31174,7 @@
               <w:rPr>
                 <w:sz w:val="16"/>
               </w:rPr>
-              <w:t>Core/Part/Socket/Orientation/Material/Score Data</w:t>
+              <w:t>Schema/Asset 호환 보존; v1 Runtime 미사용</w:t>
             </w:r>
           </w:p>
         </w:tc>
@@ -31239,6 +31415,30 @@
                 <w:sz w:val="16"/>
               </w:rPr>
               <w:t>Map Asset, Display Name, Eligible Case/Guard/Loot/Exit Preset. 신규 Manager 없음.</w:t>
+            </w:r>
+          </w:p>
+        </w:tc>
+      </w:tr>
+      <w:tr>
+        <w:tc>
+          <w:tcPr>
+            <w:tcW w:type="dxa" w:w="2630"/>
+            <w:vAlign w:val="center"/>
+          </w:tcPr>
+          <w:p>
+            <w:r>
+              <w:t>Map-authored Security Actors</w:t>
+            </w:r>
+          </w:p>
+        </w:tc>
+        <w:tc>
+          <w:tcPr>
+            <w:tcW w:type="dxa" w:w="7234"/>
+            <w:vAlign w:val="center"/>
+          </w:tcPr>
+          <w:p>
+            <w:r>
+              <w:t>CCTV Sweep/Range, Laser ProtectedCase, Hold Button Direct Link. 신규 Manager 없음.</w:t>
             </w:r>
           </w:p>
         </w:tc>
@@ -31551,7 +31751,7 @@
               <w:rPr>
                 <w:sz w:val="16"/>
               </w:rPr>
-              <w:t>FHeistObjectAssemblyResult</w:t>
+              <w:t>FHeistObjectAssemblyResult (Deferred)</w:t>
             </w:r>
           </w:p>
         </w:tc>
@@ -31568,7 +31768,7 @@
               <w:rPr>
                 <w:sz w:val="16"/>
               </w:rPr>
-              <w:t>Part/Socket/Orientation/Material/Completeness, Quality, Replica</w:t>
+              <w:t>기존 NetSerialize/Save 호환 보존; v1 Result UI 비노출</w:t>
             </w:r>
           </w:p>
         </w:tc>
@@ -31689,6 +31889,30 @@
                 <w:sz w:val="16"/>
               </w:rPr>
               <w:t>Forgery/Assembly, Carry, Secured Loot, Distraction, Rescue, Alarm, Escape</w:t>
+            </w:r>
+          </w:p>
+        </w:tc>
+      </w:tr>
+      <w:tr>
+        <w:tc>
+          <w:tcPr>
+            <w:tcW w:type="dxa" w:w="2630"/>
+            <w:vAlign w:val="center"/>
+          </w:tcPr>
+          <w:p>
+            <w:r>
+              <w:t>FHeistSecurityPresentationState</w:t>
+            </w:r>
+          </w:p>
+        </w:tc>
+        <w:tc>
+          <w:tcPr>
+            <w:tcW w:type="dxa" w:w="7234"/>
+            <w:vAlign w:val="center"/>
+          </w:tcPr>
+          <w:p>
+            <w:r>
+              <w:t>ActorId, State, HolderPlayerId, Revision, ServerEpoch; Gameplay 판정은 Actor Authority 소유</w:t>
             </w:r>
           </w:p>
         </w:tc>
@@ -31970,7 +32194,7 @@
               <w:rPr>
                 <w:sz w:val="16"/>
               </w:rPr>
-              <w:t>Base Body 1, Remote Nameplate, Walk/Sprint/Carry/Heavy/Forgery/Assembly/Stun/Arrest Pose</w:t>
+              <w:t>Base Body 1, Remote Nameplate, Walk/Sprint/Carry/Heavy/Forgery/Stun/Arrest Pose; Assembly Pose는 Deferred</w:t>
             </w:r>
           </w:p>
         </w:tc>
@@ -32004,7 +32228,7 @@
           </w:tcPr>
           <w:p>
             <w:r>
-              <w:t>공통 모듈 + M01/M02/M03 테마, BP_PaintingDisplayCase 1종, BP_ObjectDisplayCase 1종, BP_Vent 1종, Signage, Floor Plan</w:t>
+              <w:t>공통 모듈 + M01/M02/M03 테마, BP_PaintingDisplayCase, BP_Vent, BP_SecurityCamera, BP_LaserBarrier, BP_SecurityHoldButton, Signage, Floor Plan</w:t>
             </w:r>
           </w:p>
         </w:tc>
@@ -32084,7 +32308,7 @@
               <w:rPr>
                 <w:sz w:val="16"/>
               </w:rPr>
-              <w:t>Sculpture/Ceramic Kit 최소 2종, Object Assembly Template 최소 12개</w:t>
+              <w:t>기존 Kit/Template/SourceArt 보존; v1 Release/Cook 수량 기준 없음</w:t>
             </w:r>
           </w:p>
         </w:tc>
@@ -32238,7 +32462,7 @@
               <w:rPr>
                 <w:sz w:val="16"/>
               </w:rPr>
-              <w:t>Title, Lobby, HUD, Nameplate, Inventory, Map, Surface/Object Forgery, Result, Popup</w:t>
+              <w:t>Title, Lobby, HUD, Nameplate, Inventory, Map, Surface Forgery, Result, Popup; Assembly WBP는 Deferred</w:t>
             </w:r>
           </w:p>
         </w:tc>
@@ -32318,7 +32542,7 @@
               <w:rPr>
                 <w:sz w:val="16"/>
               </w:rPr>
-              <w:t>Walk/Sprint/Heavy, Guard, Surface/Object Forgery, Contract, Alert, Result</w:t>
+              <w:t>Walk/Sprint/Heavy, Guard, CCTV, Laser/Button, Surface Forgery, Contract, Alert, Result</w:t>
             </w:r>
           </w:p>
         </w:tc>
@@ -32454,7 +32678,7 @@
               <w:rPr>
                 <w:sz w:val="16"/>
               </w:rPr>
-              <w:t>Required Target/Quota/Assignment/Carried/Secured/Outcome 서버 확정과 1~4인 일치</w:t>
+              <w:t>Required Target/Quota/Assignment/Carried/Secured/Outcome 서버 확정과 2인·3인·4인 일치</w:t>
             </w:r>
           </w:p>
         </w:tc>
@@ -32618,14 +32842,8 @@
             <w:vAlign w:val="center"/>
           </w:tcPr>
           <w:p>
-            <w:pPr>
-              <w:pStyle w:val="TableText"/>
-            </w:pPr>
-            <w:r>
-              <w:rPr>
-                <w:sz w:val="16"/>
-              </w:rPr>
-              <w:t>Object Assembly</w:t>
+            <w:r>
+              <w:t>Object Assembly Compatibility</w:t>
             </w:r>
           </w:p>
         </w:tc>
@@ -32636,7 +32854,7 @@
           </w:tcPr>
           <w:p>
             <w:r>
-              <w:t>Owner-only, 25~35초, 기억 기반 2D Part Tray/Canvas Drag &amp; Drop, 숨은 Socket Anchor 양자화, 서버 Part/Socket/Orientation 70점 승인 Gate, 기준 미달 Session 유지, Timeout 폐기+근처 Guard 1회, Compact Payload 기반 3D Replica 재구성, Original 회수·Deposit, Cleanup</w:t>
+              <w:t>Deferred Expansion. Class/Data/NetSerialize/Cleanup 호환을 보존하되 v1 Assignment/UI/Map/Cook/Release Gate에서 비활성</w:t>
             </w:r>
           </w:p>
         </w:tc>
@@ -32796,7 +33014,7 @@
               <w:rPr>
                 <w:sz w:val="16"/>
               </w:rPr>
-              <w:t>3 Map × 1~4인, Development/Shipping, Crash/Blocker 0</w:t>
+              <w:t>3 Map × 2인/3인/4인, Development/Shipping, Crash/Blocker 0</w:t>
             </w:r>
           </w:p>
         </w:tc>
@@ -33262,25 +33480,11 @@
               <w:rPr>
                 <w:rFonts w:ascii="Consolas" w:eastAsia="Consolas" w:hAnsi="Consolas" w:cs="Consolas"/>
               </w:rPr>
-              <w:t>Contract Definition → Server Seed → Eligible Case Filter</w:t>
-            </w:r>
-            <w:r>
+              <w:t>Contract Definition → Server Seed → Eligible Painting Case Filter</w:t>
               <w:br/>
-            </w:r>
-            <w:r>
-              <w:rPr>
-                <w:rFonts w:ascii="Consolas" w:eastAsia="Consolas" w:hAnsi="Consolas" w:cs="Consolas"/>
-              </w:rPr>
-              <w:t>→ Required Target 선택 → Optional Exhibit 활성화</w:t>
-            </w:r>
-            <w:r>
+              <w:t>→ Required Target 선택 → Optional Painting 활성화</w:t>
               <w:br/>
-            </w:r>
-            <w:r>
-              <w:rPr>
-                <w:rFonts w:ascii="Consolas" w:eastAsia="Consolas" w:hAnsi="Consolas" w:cs="Consolas"/>
-              </w:rPr>
-              <w:t>→ Surface/Object Shuffle Bag → Replicated Assignment Snapshot</w:t>
+              <w:t>→ Surface Shuffle Bag → Replicated Assignment Snapshot</w:t>
             </w:r>
           </w:p>
         </w:tc>
@@ -33473,7 +33677,7 @@
               <w:pStyle w:val="TableText"/>
             </w:pPr>
             <w:r>
-              <w:t>Surface 또는 Object이며 Case Class와 일치</w:t>
+              <w:t>v1은 Drawing이며 Painting Case Class와 일치; Assembly는 Deferred</w:t>
             </w:r>
           </w:p>
         </w:tc>
@@ -33585,7 +33789,7 @@
         </w:numPr>
       </w:pPr>
       <w:r>
-        <w:t>Object Assembly는 별도 Family Pool과 Shuffle Bag을 사용한다.</w:t>
+        <w:t>Object Assembly Family Pool과 Shuffle Bag Schema는 Deferred Expansion 호환용으로 보존하지만 v1 Assignment에서는 호출하지 않는다.</w:t>
       </w:r>
     </w:p>
     <w:p>
@@ -33608,11 +33812,9 @@
           <w:numId w:val="10"/>
         </w:numPr>
       </w:pPr>
-      <w:bookmarkStart w:id="91" w:name="_Toc237735246"/>
       <w:r>
-        <w:t>Forgery / Assembly Timer and Timeout Handling</w:t>
+        <w:t>Surface Forgery Timer and Timeout Handling / Assembly Deferred</w:t>
       </w:r>
-      <w:bookmarkEnd w:id="91"/>
     </w:p>
     <w:tbl>
       <w:tblPr>
@@ -33785,7 +33987,7 @@
           </w:tcPr>
           <w:p>
             <w:r>
-              <w:t>작업 폐기 / Replica 없음 / 근처 Guard 한 명 1회 조사 / Alert unchanged</w:t>
+              <w:t>Stroke 폐기 / Replica 없음 / 근처 Guard 한 명 1회 조사 / Alert unchanged</w:t>
             </w:r>
           </w:p>
         </w:tc>
@@ -33801,12 +34003,8 @@
             <w:vAlign w:val="center"/>
           </w:tcPr>
           <w:p>
-            <w:pPr>
-              <w:pStyle w:val="TableText"/>
-            </w:pPr>
-            <w:r>
-              <w:lastRenderedPageBreak/>
-              <w:t>Object Assembly</w:t>
+            <w:r>
+              <w:t>Object Assembly (Deferred)</w:t>
             </w:r>
           </w:p>
         </w:tc>
@@ -33820,7 +34018,7 @@
               <w:pStyle w:val="TableText"/>
             </w:pPr>
             <w:r>
-              <w:t>30s</w:t>
+              <w:t>Deferred</w:t>
             </w:r>
           </w:p>
         </w:tc>
@@ -33834,7 +34032,7 @@
               <w:pStyle w:val="TableText"/>
             </w:pPr>
             <w:r>
-              <w:t>25~35s</w:t>
+              <w:t>재활성화 시 별도 승인</w:t>
             </w:r>
           </w:p>
         </w:tc>
@@ -33845,7 +34043,7 @@
           </w:tcPr>
           <w:p>
             <w:r>
-              <w:t>작업 폐기 / Replica 없음 / 근처 Guard 한 명 1회 조사 / Alert unchanged</w:t>
+              <w:t>v1 Runtime 진입 없음 / FeatureDisabled</w:t>
             </w:r>
           </w:p>
         </w:tc>
@@ -34169,7 +34367,7 @@
         </w:numPr>
       </w:pPr>
       <w:r>
-        <w:t>Inventory, Map, Forgery, Assembly, Stun, Arrest, Escaped 상태에서 Sprint를 허용하지 않는다.</w:t>
+        <w:t>Inventory, Map, Forgery, Security Hold, Stun, Arrest, Escaped 상태에서 Sprint를 허용하지 않는다. Assembly 차단값은 Deferred 호환용으로만 남는다.</w:t>
       </w:r>
     </w:p>
     <w:p>
@@ -35759,7 +35957,7 @@
           </w:tcPr>
           <w:p>
             <w:r>
-              <w:t>Object Assembly Display Case</w:t>
+              <w:t>Object Assembly Display Case (Deferred)</w:t>
             </w:r>
           </w:p>
         </w:tc>
@@ -35779,7 +35977,7 @@
               <w:jc w:val="center"/>
             </w:pPr>
             <w:r>
-              <w:t>AHeistObjectDisplayCaseActor / BP_ObjectDisplayCase</w:t>
+              <w:t>AHeistObjectDisplayCaseActor / BP_ObjectDisplayCase (retained, v1 inactive)</w:t>
             </w:r>
           </w:p>
         </w:tc>
@@ -35796,7 +35994,7 @@
           </w:tcPr>
           <w:p>
             <w:r>
-              <w:t>CaseId/ArtifactId → Object Template + Part Mesh/Material Data</w:t>
+              <w:t>기존 Data 호환 보존; Release Map/Assignment/Cook 제외</w:t>
             </w:r>
           </w:p>
         </w:tc>
@@ -35914,6 +36112,41 @@
             <w:r>
               <w:lastRenderedPageBreak/>
               <w:t>Spawn Category/Zone/Transform</w:t>
+            </w:r>
+          </w:p>
+        </w:tc>
+      </w:tr>
+      <w:tr>
+        <w:tc>
+          <w:tcPr>
+            <w:tcW w:type="dxa" w:w="2200"/>
+            <w:vAlign w:val="center"/>
+          </w:tcPr>
+          <w:p>
+            <w:r>
+              <w:t>Museum Security</w:t>
+            </w:r>
+          </w:p>
+        </w:tc>
+        <w:tc>
+          <w:tcPr>
+            <w:tcW w:type="dxa" w:w="3200"/>
+            <w:vAlign w:val="center"/>
+          </w:tcPr>
+          <w:p>
+            <w:r>
+              <w:t>AHeistSecurityCameraActor / AHeistLaserBarrierActor / AHeistSecurityHoldButtonActor</w:t>
+            </w:r>
+          </w:p>
+        </w:tc>
+        <w:tc>
+          <w:tcPr>
+            <w:tcW w:type="dxa" w:w="4466"/>
+            <w:vAlign w:val="center"/>
+          </w:tcPr>
+          <w:p>
+            <w:r>
+              <w:t>Map-authored Transform/Links + C++ Authority + BP Presentation</w:t>
             </w:r>
           </w:p>
         </w:tc>
@@ -36105,14 +36338,8 @@
             <w:vAlign w:val="center"/>
           </w:tcPr>
           <w:p>
-            <w:pPr>
-              <w:pStyle w:val="TableText"/>
-            </w:pPr>
-            <w:r>
-              <w:rPr>
-                <w:sz w:val="16"/>
-              </w:rPr>
-              <w:t>Quota&gt;0, PlayerCount 1~4, Count 범위</w:t>
+            <w:r>
+              <w:t>Quota&gt;0, Release PlayerCount 2~4, internal 1P fallback Row 허용, Count 범위</w:t>
             </w:r>
           </w:p>
         </w:tc>
@@ -36294,7 +36521,7 @@
               <w:rPr>
                 <w:sz w:val="16"/>
               </w:rPr>
-              <w:t>FHeistObjectAssemblyTemplateRow</w:t>
+              <w:t>FHeistObjectAssemblyTemplateRow (Deferred)</w:t>
             </w:r>
           </w:p>
         </w:tc>
@@ -36328,7 +36555,7 @@
               <w:rPr>
                 <w:sz w:val="16"/>
               </w:rPr>
-              <w:t>Parts 3~5, Timer 25~35, 호환/중복 검증</w:t>
+              <w:t>기존 Asset 무결성 검증만 유지; v1 Assignment 금지</w:t>
             </w:r>
           </w:p>
         </w:tc>
@@ -36343,7 +36570,7 @@
           </w:tcPr>
           <w:p>
             <w:r>
-              <w:t>FHeistObjectAssemblyPartRow</w:t>
+              <w:t>FHeistObjectAssemblyPartRow (Deferred)</w:t>
             </w:r>
           </w:p>
         </w:tc>
@@ -36363,7 +36590,7 @@
           </w:tcPr>
           <w:p>
             <w:r>
-              <w:t>Mesh/Socket/Orientation/MaterialId가 Family 안에서 해석 가능</w:t>
+              <w:t>기존 Family Data 무결성만 유지; 신규 Content 금지</w:t>
             </w:r>
           </w:p>
         </w:tc>
@@ -36701,7 +36928,7 @@
               <w:rPr>
                 <w:sz w:val="16"/>
               </w:rPr>
-              <w:t>Solo 기준. Required Target 하나만으로는 Quota를 충족하지 않음</w:t>
+              <w:t>내부 계산 기준. Release 최소 2P Quota는 6,400</w:t>
             </w:r>
           </w:p>
         </w:tc>
@@ -36741,7 +36968,7 @@
               <w:rPr>
                 <w:sz w:val="16"/>
               </w:rPr>
-              <w:t>1.0 / 1.6 / 2.2 / 2.8</w:t>
+              <w:t>1.0 fallback / 1.6 / 2.2 / 2.8</w:t>
             </w:r>
           </w:p>
         </w:tc>
@@ -36751,14 +36978,8 @@
             <w:vAlign w:val="center"/>
           </w:tcPr>
           <w:p>
-            <w:pPr>
-              <w:pStyle w:val="TableText"/>
-            </w:pPr>
-            <w:r>
-              <w:rPr>
-                <w:sz w:val="16"/>
-              </w:rPr>
-              <w:t>1~4인</w:t>
+            <w:r>
+              <w:t>1P internal fallback / Release 2~4P</w:t>
             </w:r>
           </w:p>
         </w:tc>
@@ -36791,14 +37012,8 @@
             <w:vAlign w:val="center"/>
           </w:tcPr>
           <w:p>
-            <w:pPr>
-              <w:pStyle w:val="TableText"/>
-            </w:pPr>
-            <w:r>
-              <w:rPr>
-                <w:sz w:val="16"/>
-              </w:rPr>
-              <w:t>2</w:t>
+            <w:r>
+              <w:t>3 / 4 / 5</w:t>
             </w:r>
           </w:p>
         </w:tc>
@@ -36815,7 +37030,7 @@
               <w:rPr>
                 <w:sz w:val="16"/>
               </w:rPr>
-              <w:t>Required 외</w:t>
+              <w:t>Release 2P / 3P / 4P Required 외</w:t>
             </w:r>
           </w:p>
         </w:tc>
@@ -36848,14 +37063,8 @@
             <w:vAlign w:val="center"/>
           </w:tcPr>
           <w:p>
-            <w:pPr>
-              <w:pStyle w:val="TableText"/>
-            </w:pPr>
-            <w:r>
-              <w:rPr>
-                <w:sz w:val="16"/>
-              </w:rPr>
-              <w:t>5</w:t>
+            <w:r>
+              <w:t>5 / 6 / 8</w:t>
             </w:r>
           </w:p>
         </w:tc>
@@ -36872,7 +37081,7 @@
               <w:rPr>
                 <w:sz w:val="16"/>
               </w:rPr>
-              <w:t>4인 기준</w:t>
+              <w:t>Release 2P / 3P / 4P</w:t>
             </w:r>
           </w:p>
         </w:tc>
@@ -37321,7 +37530,7 @@
               <w:pStyle w:val="TableText"/>
             </w:pPr>
             <w:r>
-              <w:t>Part/Socket/Orientation/Material/Revision</w:t>
+              <w:t>Deferred Serialization 호환; v1 Runtime 미사용</w:t>
             </w:r>
           </w:p>
         </w:tc>
@@ -37384,6 +37593,41 @@
             </w:pPr>
             <w:r>
               <w:t>GameState</w:t>
+            </w:r>
+          </w:p>
+        </w:tc>
+      </w:tr>
+      <w:tr>
+        <w:tc>
+          <w:tcPr>
+            <w:tcW w:type="dxa" w:w="2137"/>
+            <w:vAlign w:val="center"/>
+          </w:tcPr>
+          <w:p>
+            <w:r>
+              <w:t>Security State</w:t>
+            </w:r>
+          </w:p>
+        </w:tc>
+        <w:tc>
+          <w:tcPr>
+            <w:tcW w:type="dxa" w:w="3617"/>
+            <w:vAlign w:val="center"/>
+          </w:tcPr>
+          <w:p>
+            <w:r>
+              <w:t>Camera Sweep/Detection Revision, Laser Active/Holder/Revision</w:t>
+            </w:r>
+          </w:p>
+        </w:tc>
+        <w:tc>
+          <w:tcPr>
+            <w:tcW w:type="dxa" w:w="4110"/>
+            <w:vAlign w:val="center"/>
+          </w:tcPr>
+          <w:p>
+            <w:r>
+              <w:t>각 Security Actor + PlayerState reference</w:t>
             </w:r>
           </w:p>
         </w:tc>
@@ -37536,7 +37780,7 @@
         </w:numPr>
       </w:pPr>
       <w:r>
-        <w:t>Gameplay: 1~4인이 반복 Surface/Object Forgery, Original 회수, Drop/Recovery, Deposit과 Outcome까지 완주한다.</w:t>
+        <w:t>Gameplay: 2인·3인·4인이 반복 Surface Forgery, Patrol/CCTV/Laser 협동, Original 회수, Drop/Recovery, Deposit과 Outcome까지 완주한다.</w:t>
       </w:r>
     </w:p>
     <w:p>
@@ -37584,7 +37828,7 @@
         </w:numPr>
       </w:pPr>
       <w:r>
-        <w:t>Release: Development/Shipping Package, Steam Session/Travel, 3 Map × Solo/4인 Regression, Critical 0을 확인한다.</w:t>
+        <w:t>Release: Development/Shipping Package, Steam Session/Travel, 3 Map × 2인/3인/4인 Regression, Critical 0을 확인한다. 1인 직접 PIE는 내부 fallback 검증으로 분리한다.</w:t>
       </w:r>
     </w:p>
     <w:sectPr>

</xml_diff>

<commit_message>
Implement match-start loose loot release flow
</commit_message>
<xml_diff>
--- a/Museum_Heist_TDD.docx
+++ b/Museum_Heist_TDD.docx
@@ -30955,7 +30955,7 @@
     </w:p>
     <w:p>
       <w:r>
-        <w:t>필드: ItemId, LootGrade, ScoreValue, SpawnCategory, SpawnWeight, WorldMesh, WorldMaterials, WorldVisualRelativeTransform. Spawn Actor Class는 Row가 소유하지 않고 공용 BP_Loot 하나를 시스템 설정이 소유한다. Piñata/경쟁 Reveal 필드는 Deprecated이며 신규 Row에서는 사용하지 않는다.</w:t>
+        <w:t>필드: ItemId, LootGrade, ScoreValue, SpawnCategory, SpawnWeight, WorldMesh, WorldMaterials, WorldVisualRelativeTransform. Spawn Actor Class는 Row가 소유하지 않고 공용 BP_Loot 하나를 시스템 설정이 소유한다. Piñata/경쟁 Reveal 필드는 Deprecated이며 신규 Row에서는 사용하지 않는다. v1 MatchStart는 DA_GameBalance의 Vault 1개와 Exhibition 4개를 공급하고, 카테고리별 서버 Seed와 SpawnWeight로 Item을 선택한다.</w:t>
       </w:r>
     </w:p>
     <w:p>
@@ -32468,7 +32468,7 @@
               <w:rPr>
                 <w:sz w:val="16"/>
               </w:rPr>
-              <w:t>Zone/Room Candidate, Min/Max, Weight</w:t>
+              <w:t>확장용 Spawn Profile(미사용). v1: DA_GameBalance Vault 1 / Exhibition 4, DT_LootData SpawnWeight 기반 Seed 선택</w:t>
             </w:r>
           </w:p>
         </w:tc>

</xml_diff>

<commit_message>
Add vent feedback and inventory contract presentation
Show the server-scheduled vent countdown and refresh local interaction targets when vent activation replicates. Deliver owner settlement feedback and expose team quota, carried value, and secured value in the inventory summary.

Extend the existing two-player loot lifecycle regression and document the presentation contract. Static diff and DOCX structure checks passed; Unreal Build, Automation, and user PIE remain pending.
</commit_message>
<xml_diff>
--- a/Museum_Heist_TDD.docx
+++ b/Museum_Heist_TDD.docx
@@ -21384,7 +21384,7 @@
         </w:numPr>
       </w:pPr>
       <w:r>
-        <w:t>180초 이후 Server Request Entry가 현재 Inventory를 판정한다. Loose Loot가 있으면 LooseLootOnly Payload로 Mid-run Settlement를 수행하고, 없으면 FullEscape Payload로 기존 Final Escape를 수행한다. Client는 정산 모드를 선택하거나 확정하지 않는다.</w:t>
+        <w:t>AHeistGameState는 기존 EscapePhase 상태와 함께 EscapePhaseUnlockServerTime(float, 미설정 -1)을 복제한다. 서버 InitializeEscapePhase는 InGame이고 ContractSnapshot.Outcome이 None일 때만 현재 서버 시각에 개방 지연을 더해 저장한다. 종료 Outcome 또는 비 InGame 초기화에서는 -1로 되돌리고, SetMatchPhase의 비 InGame 전환에서도 -1로 정리한다. 0초도 유효한 시각이며, UI는 읽기 전용 Getter와 서버 시각의 차이로 남은 시간을 표시한다. 이 표시는 서버의 개방 판정과 요청 검증을 변경하지 않는다.</w:t>
       </w:r>
     </w:p>
     <w:p>
@@ -21396,7 +21396,43 @@
         </w:numPr>
       </w:pPr>
       <w:r>
+        <w:t>180초 이후 Server Request Entry가 현재 Inventory를 판정한다. Loose Loot가 있으면 LooseLootOnly Payload로 Mid-run Settlement를 수행하고, 없으면 FullEscape Payload로 기존 Final Escape를 수행한다. Client는 정산 모드를 선택하거나 확정하지 않는다.</w:t>
+      </w:r>
+    </w:p>
+    <w:p>
+      <w:pPr>
+        <w:pStyle w:val="a0"/>
+        <w:numPr>
+          <w:ilvl w:val="0"/>
+          <w:numId w:val="11"/>
+        </w:numPr>
+      </w:pPr>
+      <w:r>
         <w:t>Mid-run Settlement는 Loot Item만 제거하고 Secured Value/Player Contribution을 한 번 갱신하며 MarkEscaped, Original Weight, Source Case Carrier, Required Target 상태를 변경하지 않는다. FullEscape만 남은 Loot와 모든 Original을 일괄 Deposit하고 MarkEscaped를 확정한다.</w:t>
+      </w:r>
+    </w:p>
+    <w:p>
+      <w:pPr>
+        <w:pStyle w:val="a0"/>
+        <w:numPr>
+          <w:ilvl w:val="0"/>
+          <w:numId w:val="11"/>
+        </w:numPr>
+      </w:pPr>
+      <w:r>
+        <w:t>Mid-run Settlement Commit 이후 기존 Owner Client_ReceivePopupFeedback RPC에 optional bool bVentSettlement=false를 전달해 확정 팝업과 정산음을 함께 요청한다. 기존 2개 매개변수 Popup Delegate는 유지하고, PlayerController의 로컬 FHeistVentFeedbackRequested(bool bSettlement)가 정산 수신과 HandleEscapePhasePresentationChanged의 Local Controller 개방 이벤트를 HUD에 전달한다. 새 RPC는 추가하지 않는다.</w:t>
+      </w:r>
+    </w:p>
+    <w:p>
+      <w:pPr>
+        <w:pStyle w:val="a0"/>
+        <w:numPr>
+          <w:ilvl w:val="0"/>
+          <w:numId w:val="11"/>
+        </w:numPr>
+      </w:pPr>
+      <w:r>
+        <w:t>HUD는 Setup/Destruct에서 Vent Feedback Delegate를 구독·해제한다. 개방은 기존 임시 EventText와 Class Defaults의 VentOpenedSound, 정산은 기존 Popup과 VentSettlementSound로 표시한다. 두 사운드는 단일 VentFeedbackAudioComponent를 공유하고 HUD 정리 시 재생과 Component를 정리한다.</w:t>
       </w:r>
     </w:p>
     <w:p>
@@ -26659,7 +26695,7 @@
               <w:rPr>
                 <w:sz w:val="16"/>
               </w:rPr>
-              <w:t>Confirmed Snapshot, Grid Size, Item Payload</w:t>
+              <w:t>Confirmed Snapshot, Grid Size, Item Payload. 기존 SummaryText는 배낭 상태와 서버 Contract Snapshot의 팀 목표(Quota)·운반(Carried)·확보(Secured)를 함께 표시한다. Main HUD에 가치 숫자를 추가하지 않는다.</w:t>
             </w:r>
           </w:p>
         </w:tc>
@@ -26925,6 +26961,18 @@
         <w:t>피드백</w:t>
       </w:r>
       <w:bookmarkEnd w:id="70"/>
+    </w:p>
+    <w:p>
+      <w:pPr>
+        <w:pStyle w:val="a0"/>
+        <w:numPr>
+          <w:ilvl w:val="0"/>
+          <w:numId w:val="11"/>
+        </w:numPr>
+      </w:pPr>
+      <w:r>
+        <w:t>Interaction Target은 현재 Overlap 중이고 CanInteract를 만족하는 가장 가까운 Actor를 계속 사용한다. 유효 Target이 없을 때만 기존 Overlap 집합의 잠긴 Vent를 안내 전용으로 표시하며, 이 Vent를 요청 가능한 Target으로 승격하지 않는다. Vent의 서버 활성 변경과 OnRep_VentActive는 Local PlayerController의 기존 InteractionComponent.RefreshInteractionTarget을 호출해 실제 활성 상태 도착 시 정지 중인 Player의 Prompt도 갱신한다.</w:t>
+      </w:r>
     </w:p>
     <w:tbl>
       <w:tblPr>

</xml_diff>